<commit_message>
Latest and greatest model version
</commit_message>
<xml_diff>
--- a/markdown/RFsportmort_Report.docx
+++ b/markdown/RFsportmort_Report.docx
@@ -26,7 +26,7 @@
           <w:sz w:val="24"/>
           <w:szCs w:val="24"/>
         </w:rPr>
-        <w:id w:val="1218863546"/>
+        <w:id w:val="-359506600"/>
         <w:docPartObj>
           <w:docPartGallery w:val="Table of Contents"/>
           <w:docPartUnique/>
@@ -63,7 +63,7 @@
           <w:r>
             <w:fldChar w:fldCharType="separate"/>
           </w:r>
-          <w:hyperlink w:anchor="_Toc222293926" w:history="1">
+          <w:hyperlink w:anchor="_Toc224741378" w:history="1">
             <w:r>
               <w:rPr>
                 <w:rStyle w:val="Hyperlink"/>
@@ -90,7 +90,7 @@
                 <w:noProof/>
                 <w:webHidden/>
               </w:rPr>
-              <w:instrText xml:space="preserve"> PAGEREF _Toc222293926 \h </w:instrText>
+              <w:instrText xml:space="preserve"> PAGEREF _Toc224741378 \h </w:instrText>
             </w:r>
             <w:r>
               <w:rPr>
@@ -134,7 +134,7 @@
               <w14:ligatures w14:val="standardContextual"/>
             </w:rPr>
           </w:pPr>
-          <w:hyperlink w:anchor="_Toc222293927" w:history="1">
+          <w:hyperlink w:anchor="_Toc224741379" w:history="1">
             <w:r>
               <w:rPr>
                 <w:rStyle w:val="Hyperlink"/>
@@ -161,7 +161,7 @@
                 <w:noProof/>
                 <w:webHidden/>
               </w:rPr>
-              <w:instrText xml:space="preserve"> PAGEREF _Toc222293927 \h </w:instrText>
+              <w:instrText xml:space="preserve"> PAGEREF _Toc224741379 \h </w:instrText>
             </w:r>
             <w:r>
               <w:rPr>
@@ -205,7 +205,7 @@
               <w14:ligatures w14:val="standardContextual"/>
             </w:rPr>
           </w:pPr>
-          <w:hyperlink w:anchor="_Toc222293928" w:history="1">
+          <w:hyperlink w:anchor="_Toc224741380" w:history="1">
             <w:r>
               <w:rPr>
                 <w:rStyle w:val="Hyperlink"/>
@@ -232,7 +232,7 @@
                 <w:noProof/>
                 <w:webHidden/>
               </w:rPr>
-              <w:instrText xml:space="preserve"> PAGEREF _Toc222293928 \h </w:instrText>
+              <w:instrText xml:space="preserve"> PAGEREF _Toc224741380 \h </w:instrText>
             </w:r>
             <w:r>
               <w:rPr>
@@ -276,7 +276,7 @@
               <w14:ligatures w14:val="standardContextual"/>
             </w:rPr>
           </w:pPr>
-          <w:hyperlink w:anchor="_Toc222293929" w:history="1">
+          <w:hyperlink w:anchor="_Toc224741381" w:history="1">
             <w:r>
               <w:rPr>
                 <w:rStyle w:val="Hyperlink"/>
@@ -303,7 +303,7 @@
                 <w:noProof/>
                 <w:webHidden/>
               </w:rPr>
-              <w:instrText xml:space="preserve"> PAGEREF _Toc222293929 \h </w:instrText>
+              <w:instrText xml:space="preserve"> PAGEREF _Toc224741381 \h </w:instrText>
             </w:r>
             <w:r>
               <w:rPr>
@@ -347,7 +347,7 @@
               <w14:ligatures w14:val="standardContextual"/>
             </w:rPr>
           </w:pPr>
-          <w:hyperlink w:anchor="_Toc222293930" w:history="1">
+          <w:hyperlink w:anchor="_Toc224741382" w:history="1">
             <w:r>
               <w:rPr>
                 <w:rStyle w:val="Hyperlink"/>
@@ -374,7 +374,7 @@
                 <w:noProof/>
                 <w:webHidden/>
               </w:rPr>
-              <w:instrText xml:space="preserve"> PAGEREF _Toc222293930 \h </w:instrText>
+              <w:instrText xml:space="preserve"> PAGEREF _Toc224741382 \h </w:instrText>
             </w:r>
             <w:r>
               <w:rPr>
@@ -417,7 +417,7 @@
               <w14:ligatures w14:val="standardContextual"/>
             </w:rPr>
           </w:pPr>
-          <w:hyperlink w:anchor="_Toc222293931" w:history="1">
+          <w:hyperlink w:anchor="_Toc224741383" w:history="1">
             <w:r>
               <w:rPr>
                 <w:rStyle w:val="Hyperlink"/>
@@ -444,7 +444,7 @@
                 <w:noProof/>
                 <w:webHidden/>
               </w:rPr>
-              <w:instrText xml:space="preserve"> PAGEREF _Toc222293931 \h </w:instrText>
+              <w:instrText xml:space="preserve"> PAGEREF _Toc224741383 \h </w:instrText>
             </w:r>
             <w:r>
               <w:rPr>
@@ -487,7 +487,7 @@
               <w14:ligatures w14:val="standardContextual"/>
             </w:rPr>
           </w:pPr>
-          <w:hyperlink w:anchor="_Toc222293932" w:history="1">
+          <w:hyperlink w:anchor="_Toc224741384" w:history="1">
             <w:r>
               <w:rPr>
                 <w:rStyle w:val="Hyperlink"/>
@@ -514,7 +514,7 @@
                 <w:noProof/>
                 <w:webHidden/>
               </w:rPr>
-              <w:instrText xml:space="preserve"> PAGEREF _Toc222293932 \h </w:instrText>
+              <w:instrText xml:space="preserve"> PAGEREF _Toc224741384 \h </w:instrText>
             </w:r>
             <w:r>
               <w:rPr>
@@ -557,7 +557,7 @@
               <w14:ligatures w14:val="standardContextual"/>
             </w:rPr>
           </w:pPr>
-          <w:hyperlink w:anchor="_Toc222293933" w:history="1">
+          <w:hyperlink w:anchor="_Toc224741385" w:history="1">
             <w:r>
               <w:rPr>
                 <w:rStyle w:val="Hyperlink"/>
@@ -584,7 +584,7 @@
                 <w:noProof/>
                 <w:webHidden/>
               </w:rPr>
-              <w:instrText xml:space="preserve"> PAGEREF _Toc222293933 \h </w:instrText>
+              <w:instrText xml:space="preserve"> PAGEREF _Toc224741385 \h </w:instrText>
             </w:r>
             <w:r>
               <w:rPr>
@@ -627,7 +627,7 @@
               <w14:ligatures w14:val="standardContextual"/>
             </w:rPr>
           </w:pPr>
-          <w:hyperlink w:anchor="_Toc222293934" w:history="1">
+          <w:hyperlink w:anchor="_Toc224741386" w:history="1">
             <w:r>
               <w:rPr>
                 <w:rStyle w:val="Hyperlink"/>
@@ -654,7 +654,7 @@
                 <w:noProof/>
                 <w:webHidden/>
               </w:rPr>
-              <w:instrText xml:space="preserve"> PAGEREF _Toc222293934 \h </w:instrText>
+              <w:instrText xml:space="preserve"> PAGEREF _Toc224741386 \h </w:instrText>
             </w:r>
             <w:r>
               <w:rPr>
@@ -698,7 +698,7 @@
               <w14:ligatures w14:val="standardContextual"/>
             </w:rPr>
           </w:pPr>
-          <w:hyperlink w:anchor="_Toc222293935" w:history="1">
+          <w:hyperlink w:anchor="_Toc224741387" w:history="1">
             <w:r>
               <w:rPr>
                 <w:rStyle w:val="Hyperlink"/>
@@ -725,7 +725,7 @@
                 <w:noProof/>
                 <w:webHidden/>
               </w:rPr>
-              <w:instrText xml:space="preserve"> PAGEREF _Toc222293935 \h </w:instrText>
+              <w:instrText xml:space="preserve"> PAGEREF _Toc224741387 \h </w:instrText>
             </w:r>
             <w:r>
               <w:rPr>
@@ -768,7 +768,7 @@
               <w14:ligatures w14:val="standardContextual"/>
             </w:rPr>
           </w:pPr>
-          <w:hyperlink w:anchor="_Toc222293936" w:history="1">
+          <w:hyperlink w:anchor="_Toc224741388" w:history="1">
             <w:r>
               <w:rPr>
                 <w:rStyle w:val="Hyperlink"/>
@@ -795,7 +795,7 @@
                 <w:noProof/>
                 <w:webHidden/>
               </w:rPr>
-              <w:instrText xml:space="preserve"> PAGEREF _Toc222293936 \h </w:instrText>
+              <w:instrText xml:space="preserve"> PAGEREF _Toc224741388 \h </w:instrText>
             </w:r>
             <w:r>
               <w:rPr>
@@ -838,7 +838,7 @@
               <w14:ligatures w14:val="standardContextual"/>
             </w:rPr>
           </w:pPr>
-          <w:hyperlink w:anchor="_Toc222293937" w:history="1">
+          <w:hyperlink w:anchor="_Toc224741389" w:history="1">
             <w:r>
               <w:rPr>
                 <w:rStyle w:val="Hyperlink"/>
@@ -865,7 +865,7 @@
                 <w:noProof/>
                 <w:webHidden/>
               </w:rPr>
-              <w:instrText xml:space="preserve"> PAGEREF _Toc222293937 \h </w:instrText>
+              <w:instrText xml:space="preserve"> PAGEREF _Toc224741389 \h </w:instrText>
             </w:r>
             <w:r>
               <w:rPr>
@@ -908,7 +908,7 @@
               <w14:ligatures w14:val="standardContextual"/>
             </w:rPr>
           </w:pPr>
-          <w:hyperlink w:anchor="_Toc222293938" w:history="1">
+          <w:hyperlink w:anchor="_Toc224741390" w:history="1">
             <w:r>
               <w:rPr>
                 <w:rStyle w:val="Hyperlink"/>
@@ -935,7 +935,7 @@
                 <w:noProof/>
                 <w:webHidden/>
               </w:rPr>
-              <w:instrText xml:space="preserve"> PAGEREF _Toc222293938 \h </w:instrText>
+              <w:instrText xml:space="preserve"> PAGEREF _Toc224741390 \h </w:instrText>
             </w:r>
             <w:r>
               <w:rPr>
@@ -978,7 +978,7 @@
               <w14:ligatures w14:val="standardContextual"/>
             </w:rPr>
           </w:pPr>
-          <w:hyperlink w:anchor="_Toc222293939" w:history="1">
+          <w:hyperlink w:anchor="_Toc224741391" w:history="1">
             <w:r>
               <w:rPr>
                 <w:rStyle w:val="Hyperlink"/>
@@ -1005,7 +1005,7 @@
                 <w:noProof/>
                 <w:webHidden/>
               </w:rPr>
-              <w:instrText xml:space="preserve"> PAGEREF _Toc222293939 \h </w:instrText>
+              <w:instrText xml:space="preserve"> PAGEREF _Toc224741391 \h </w:instrText>
             </w:r>
             <w:r>
               <w:rPr>
@@ -1048,7 +1048,7 @@
               <w14:ligatures w14:val="standardContextual"/>
             </w:rPr>
           </w:pPr>
-          <w:hyperlink w:anchor="_Toc222293940" w:history="1">
+          <w:hyperlink w:anchor="_Toc224741392" w:history="1">
             <w:r>
               <w:rPr>
                 <w:rStyle w:val="Hyperlink"/>
@@ -1075,7 +1075,7 @@
                 <w:noProof/>
                 <w:webHidden/>
               </w:rPr>
-              <w:instrText xml:space="preserve"> PAGEREF _Toc222293940 \h </w:instrText>
+              <w:instrText xml:space="preserve"> PAGEREF _Toc224741392 \h </w:instrText>
             </w:r>
             <w:r>
               <w:rPr>
@@ -1118,7 +1118,7 @@
               <w14:ligatures w14:val="standardContextual"/>
             </w:rPr>
           </w:pPr>
-          <w:hyperlink w:anchor="_Toc222293941" w:history="1">
+          <w:hyperlink w:anchor="_Toc224741393" w:history="1">
             <w:r>
               <w:rPr>
                 <w:rStyle w:val="Hyperlink"/>
@@ -1145,7 +1145,7 @@
                 <w:noProof/>
                 <w:webHidden/>
               </w:rPr>
-              <w:instrText xml:space="preserve"> PAGEREF _Toc222293941 \h </w:instrText>
+              <w:instrText xml:space="preserve"> PAGEREF _Toc224741393 \h </w:instrText>
             </w:r>
             <w:r>
               <w:rPr>
@@ -1188,7 +1188,7 @@
               <w14:ligatures w14:val="standardContextual"/>
             </w:rPr>
           </w:pPr>
-          <w:hyperlink w:anchor="_Toc222293942" w:history="1">
+          <w:hyperlink w:anchor="_Toc224741394" w:history="1">
             <w:r>
               <w:rPr>
                 <w:rStyle w:val="Hyperlink"/>
@@ -1215,7 +1215,7 @@
                 <w:noProof/>
                 <w:webHidden/>
               </w:rPr>
-              <w:instrText xml:space="preserve"> PAGEREF _Toc222293942 \h </w:instrText>
+              <w:instrText xml:space="preserve"> PAGEREF _Toc224741394 \h </w:instrText>
             </w:r>
             <w:r>
               <w:rPr>
@@ -1259,7 +1259,7 @@
               <w14:ligatures w14:val="standardContextual"/>
             </w:rPr>
           </w:pPr>
-          <w:hyperlink w:anchor="_Toc222293943" w:history="1">
+          <w:hyperlink w:anchor="_Toc224741395" w:history="1">
             <w:r>
               <w:rPr>
                 <w:rStyle w:val="Hyperlink"/>
@@ -1286,7 +1286,7 @@
                 <w:noProof/>
                 <w:webHidden/>
               </w:rPr>
-              <w:instrText xml:space="preserve"> PAGEREF _Toc222293943 \h </w:instrText>
+              <w:instrText xml:space="preserve"> PAGEREF _Toc224741395 \h </w:instrText>
             </w:r>
             <w:r>
               <w:rPr>
@@ -1306,7 +1306,7 @@
                 <w:noProof/>
                 <w:webHidden/>
               </w:rPr>
-              <w:t>26</w:t>
+              <w:t>27</w:t>
             </w:r>
             <w:r>
               <w:rPr>
@@ -1329,7 +1329,7 @@
               <w14:ligatures w14:val="standardContextual"/>
             </w:rPr>
           </w:pPr>
-          <w:hyperlink w:anchor="_Toc222293944" w:history="1">
+          <w:hyperlink w:anchor="_Toc224741396" w:history="1">
             <w:r>
               <w:rPr>
                 <w:rStyle w:val="Hyperlink"/>
@@ -1356,7 +1356,7 @@
                 <w:noProof/>
                 <w:webHidden/>
               </w:rPr>
-              <w:instrText xml:space="preserve"> PAGEREF _Toc222293944 \h </w:instrText>
+              <w:instrText xml:space="preserve"> PAGEREF _Toc224741396 \h </w:instrText>
             </w:r>
             <w:r>
               <w:rPr>
@@ -1400,7 +1400,7 @@
               <w14:ligatures w14:val="standardContextual"/>
             </w:rPr>
           </w:pPr>
-          <w:hyperlink w:anchor="_Toc222293945" w:history="1">
+          <w:hyperlink w:anchor="_Toc224741397" w:history="1">
             <w:r>
               <w:rPr>
                 <w:rStyle w:val="Hyperlink"/>
@@ -1427,7 +1427,7 @@
                 <w:noProof/>
                 <w:webHidden/>
               </w:rPr>
-              <w:instrText xml:space="preserve"> PAGEREF _Toc222293945 \h </w:instrText>
+              <w:instrText xml:space="preserve"> PAGEREF _Toc224741397 \h </w:instrText>
             </w:r>
             <w:r>
               <w:rPr>
@@ -1447,7 +1447,7 @@
                 <w:noProof/>
                 <w:webHidden/>
               </w:rPr>
-              <w:t>29</w:t>
+              <w:t>30</w:t>
             </w:r>
             <w:r>
               <w:rPr>
@@ -1471,7 +1471,7 @@
               <w14:ligatures w14:val="standardContextual"/>
             </w:rPr>
           </w:pPr>
-          <w:hyperlink w:anchor="_Toc222293946" w:history="1">
+          <w:hyperlink w:anchor="_Toc224741398" w:history="1">
             <w:r>
               <w:rPr>
                 <w:rStyle w:val="Hyperlink"/>
@@ -1498,7 +1498,7 @@
                 <w:noProof/>
                 <w:webHidden/>
               </w:rPr>
-              <w:instrText xml:space="preserve"> PAGEREF _Toc222293946 \h </w:instrText>
+              <w:instrText xml:space="preserve"> PAGEREF _Toc224741398 \h </w:instrText>
             </w:r>
             <w:r>
               <w:rPr>
@@ -1546,7 +1546,7 @@
         <w:pStyle w:val="Heading1"/>
       </w:pPr>
       <w:bookmarkStart w:id="0" w:name="abstract"/>
-      <w:bookmarkStart w:id="1" w:name="_Toc222293926"/>
+      <w:bookmarkStart w:id="1" w:name="_Toc224741378"/>
       <w:r>
         <w:lastRenderedPageBreak/>
         <w:t>Abstract</w:t>
@@ -1624,7 +1624,7 @@
         <w:pStyle w:val="Heading1"/>
       </w:pPr>
       <w:bookmarkStart w:id="2" w:name="introduction"/>
-      <w:bookmarkStart w:id="3" w:name="_Toc222293927"/>
+      <w:bookmarkStart w:id="3" w:name="_Toc224741379"/>
       <w:bookmarkEnd w:id="0"/>
       <w:r>
         <w:t>Introduction</w:t>
@@ -1740,7 +1740,7 @@
         <w:pStyle w:val="Heading1"/>
       </w:pPr>
       <w:bookmarkStart w:id="4" w:name="objective"/>
-      <w:bookmarkStart w:id="5" w:name="_Toc222293928"/>
+      <w:bookmarkStart w:id="5" w:name="_Toc224741380"/>
       <w:bookmarkEnd w:id="2"/>
       <w:r>
         <w:t>Objective</w:t>
@@ -1983,7 +1983,7 @@
         <w:pStyle w:val="Heading1"/>
       </w:pPr>
       <w:bookmarkStart w:id="6" w:name="study-area"/>
-      <w:bookmarkStart w:id="7" w:name="_Toc222293929"/>
+      <w:bookmarkStart w:id="7" w:name="_Toc224741381"/>
       <w:bookmarkEnd w:id="4"/>
       <w:r>
         <w:lastRenderedPageBreak/>
@@ -2012,7 +2012,7 @@
         <w:pStyle w:val="Heading1"/>
       </w:pPr>
       <w:bookmarkStart w:id="8" w:name="methods"/>
-      <w:bookmarkStart w:id="9" w:name="_Toc222293930"/>
+      <w:bookmarkStart w:id="9" w:name="_Toc224741382"/>
       <w:bookmarkEnd w:id="6"/>
       <w:r>
         <w:t>Methods</w:t>
@@ -2024,7 +2024,7 @@
         <w:pStyle w:val="Heading2"/>
       </w:pPr>
       <w:bookmarkStart w:id="10" w:name="data"/>
-      <w:bookmarkStart w:id="11" w:name="_Toc222293931"/>
+      <w:bookmarkStart w:id="11" w:name="_Toc224741383"/>
       <w:r>
         <w:t>Data</w:t>
       </w:r>
@@ -2544,7 +2544,7 @@
         <w:pStyle w:val="Heading2"/>
       </w:pPr>
       <w:bookmarkStart w:id="19" w:name="process-equations"/>
-      <w:bookmarkStart w:id="20" w:name="_Toc222293932"/>
+      <w:bookmarkStart w:id="20" w:name="_Toc224741384"/>
       <w:bookmarkEnd w:id="10"/>
       <w:bookmarkEnd w:id="18"/>
       <w:r>
@@ -16311,6 +16311,24 @@
     </w:p>
     <w:p>
       <w:pPr>
+        <w:pStyle w:val="BodyText"/>
+      </w:pPr>
+      <w:r>
+        <w:t xml:space="preserve">These priors were weakly informative given the large variances associated with SWHS release estimates and the propogation of that uncertainty through the derivation of the priors. Given the other sources of data informing </w:t>
+      </w:r>
+      <w:r>
+        <w:rPr>
+          <w:i/>
+          <w:iCs/>
+        </w:rPr>
+        <w:t>pH</w:t>
+      </w:r>
+      <w:r>
+        <w:t xml:space="preserve"> estimates it was not clear that these vague priors would be necessary. However, sensitivity testing during model development demonstrated that the priors significantly aided model convergence and provided stability during the early years in the time series when other data sources about unguided angler harvest probabilities were not available.</w:t>
+      </w:r>
+    </w:p>
+    <w:p>
+      <w:pPr>
         <w:pStyle w:val="Heading3"/>
       </w:pPr>
       <w:bookmarkStart w:id="24" w:name="total-mortality"/>
@@ -16324,7 +16342,11 @@
         <w:pStyle w:val="FirstParagraph"/>
       </w:pPr>
       <w:r>
-        <w:t>Release mortality (i.e., the number of released rockfish expected to die) was calculated assuming fixed mortality rates developed in each of the regions (FIGURE 8 REL_MORT). Deep-water release mechanism (DRM) devices were mandated for charter fleets in 2013 and release mortality rates were reduced since then to match research results (Jarvis and Lowe 2008; Hochhalter and Reed 2011; Blain and Sutton 2016; Blain-Roth and Sutton 2019). Southeast applies basic rates estimated in these studies while Southcentral and Kodiak rates were derived by using historical depth-of-release data to adjust the rates based on area and user group.</w:t>
+        <w:t xml:space="preserve">Release mortality (i.e., the number of released rockfish expected to die) was calculated assuming fixed mortality rates developed in each of the regions (FIGURE 8 REL_MORT). Deep-water </w:t>
+      </w:r>
+      <w:r>
+        <w:lastRenderedPageBreak/>
+        <w:t>release mechanism (DRM) devices were mandated for charter fleets in 2013 and release mortality rates were reduced since then to match research results (Jarvis and Lowe 2008; Hochhalter and Reed 2011; Blain and Sutton 2016; Blain-Roth and Sutton 2019). Southeast applies basic rates estimated in these studies while Southcentral and Kodiak rates were derived by using historical depth-of-release data to adjust the rates based on area and user group.</w:t>
       </w:r>
     </w:p>
     <w:p>
@@ -16332,7 +16354,6 @@
         <w:pStyle w:val="BodyText"/>
       </w:pPr>
       <w:r>
-        <w:lastRenderedPageBreak/>
         <w:t>The total number of mortalities by year, area, user and species/species assemblage in numbers was calculated by summing harvests and release mortality such that</w:t>
       </w:r>
     </w:p>
@@ -16904,7 +16925,7 @@
         <w:pStyle w:val="Heading2"/>
       </w:pPr>
       <w:bookmarkStart w:id="26" w:name="observation-equations"/>
-      <w:bookmarkStart w:id="27" w:name="_Toc222293933"/>
+      <w:bookmarkStart w:id="27" w:name="_Toc224741385"/>
       <w:bookmarkEnd w:id="19"/>
       <w:bookmarkEnd w:id="25"/>
       <w:r>
@@ -18614,11 +18635,7 @@
         </m:sSub>
       </m:oMath>
       <w:r>
-        <w:t xml:space="preserve"> is also equal to the sum of the non-yelloweye DSR and slope harvests. Although yelloweye rockfish are </w:t>
-      </w:r>
-      <w:r>
-        <w:lastRenderedPageBreak/>
-        <w:t>technically part of the DSR complex, the DSR estimates in this report do not include yelloweye rockfish.</w:t>
+        <w:t xml:space="preserve"> is also equal to the sum of the non-yelloweye DSR and slope harvests. Although yelloweye rockfish are technically part of the DSR complex, the DSR estimates in this report do not include yelloweye rockfish.</w:t>
       </w:r>
     </w:p>
     <w:p>
@@ -23209,11 +23226,7 @@
         </m:sSub>
       </m:oMath>
       <w:r>
-        <w:t xml:space="preserve">, 3) species-specific retention probabilities of </w:t>
-      </w:r>
-      <w:r>
-        <w:lastRenderedPageBreak/>
-        <w:t xml:space="preserve">guided anglers as estimated from logbook data, </w:t>
+        <w:t xml:space="preserve">, 3) species-specific retention probabilities of guided anglers as estimated from logbook data, </w:t>
       </w:r>
       <m:oMath>
         <m:r>
@@ -25142,7 +25155,11 @@
         <w:pStyle w:val="FirstParagraph"/>
       </w:pPr>
       <w:r>
-        <w:t>Kodiak has limited port sampling beyond the main harbors but has a robust hydroacoustic survey that is used to quantify black rockfish abundance across the management area and uses stereocameras to define the species compositions of the hydroacoustic based fish counts (Tscherisch et al. 2023). This data was used as supplementary data to further inform the model on the proportion of pelagic rockfish that are black in Kodiak areas. Where angler landing data is available, they demonstrate a higher proportion of black rockfish relative to the hydroacoustic survey and thus the predicted proportion of black rockfish in the hydroacoustic sample related to the true proportion such that</w:t>
+        <w:t xml:space="preserve">Kodiak has limited port sampling beyond the main harbors but has a robust hydroacoustic survey that is used to quantify black rockfish abundance across the management area and uses stereocameras to define the species compositions of the hydroacoustic based fish counts (Tscherisch et al. 2023). This data was used as supplementary data to further inform the model on </w:t>
+      </w:r>
+      <w:r>
+        <w:lastRenderedPageBreak/>
+        <w:t>the proportion of pelagic rockfish that are black in Kodiak areas. Where angler landing data is available, they demonstrate a higher proportion of black rockfish relative to the hydroacoustic survey and thus the predicted proportion of black rockfish in the hydroacoustic sample related to the true proportion such that</w:t>
       </w:r>
     </w:p>
     <w:p>
@@ -27470,7 +27487,7 @@
         <w:pStyle w:val="Heading2"/>
       </w:pPr>
       <w:bookmarkStart w:id="33" w:name="model-platform-and-diagnostics"/>
-      <w:bookmarkStart w:id="34" w:name="_Toc222293934"/>
+      <w:bookmarkStart w:id="34" w:name="_Toc224741386"/>
       <w:bookmarkEnd w:id="26"/>
       <w:bookmarkEnd w:id="32"/>
       <w:r>
@@ -27576,7 +27593,8 @@
         <w:pStyle w:val="BodyText"/>
       </w:pPr>
       <w:r>
-        <w:t xml:space="preserve">The model was run with 3 MCMC chains for 3,000,000 iterations with a burn-in of 300,000 iterations and a thinning rate of 2,700 iterations. Model convergence was judged by examining traceplots and ensuring that </w:t>
+        <w:lastRenderedPageBreak/>
+        <w:t xml:space="preserve">The model was run with 3 MCMC chains for 1,500,000 iterations with a burn-in of 150,000 iterations and a thinning rate of 1,350 iterations. Model convergence was judged by examining traceplots and ensuring that </w:t>
       </w:r>
       <m:oMath>
         <m:acc>
@@ -27606,11 +27624,10 @@
         <w:pStyle w:val="Heading1"/>
       </w:pPr>
       <w:bookmarkStart w:id="35" w:name="results"/>
-      <w:bookmarkStart w:id="36" w:name="_Toc222293935"/>
+      <w:bookmarkStart w:id="36" w:name="_Toc224741387"/>
       <w:bookmarkEnd w:id="8"/>
       <w:bookmarkEnd w:id="33"/>
       <w:r>
-        <w:lastRenderedPageBreak/>
         <w:t>Results</w:t>
       </w:r>
       <w:bookmarkEnd w:id="36"/>
@@ -27628,7 +27645,7 @@
         <w:pStyle w:val="BodyText"/>
       </w:pPr>
       <w:r>
-        <w:t xml:space="preserve">The model was 99.83% converged based on </w:t>
+        <w:t xml:space="preserve">The model was 99.76% converged based on </w:t>
       </w:r>
       <m:oMath>
         <m:acc>
@@ -27650,7 +27667,7 @@
         </m:acc>
       </m:oMath>
       <w:r>
-        <w:t xml:space="preserve"> values below 1.1 and 95.49% converged based on </w:t>
+        <w:t xml:space="preserve"> values below 1.1 and 95.21% converged based on </w:t>
       </w:r>
       <m:oMath>
         <m:acc>
@@ -27694,7 +27711,7 @@
         </m:acc>
       </m:oMath>
       <w:r>
-        <w:t xml:space="preserve"> was 1.28.</w:t>
+        <w:t xml:space="preserve"> was 1.29.</w:t>
       </w:r>
     </w:p>
     <w:p>
@@ -27702,7 +27719,7 @@
         <w:pStyle w:val="BodyText"/>
       </w:pPr>
       <w:r>
-        <w:t xml:space="preserve">Of the true parameters in the model, 83 failed to converge to an </w:t>
+        <w:t xml:space="preserve">Of the true parameters in the model, 87 failed to converge to an </w:t>
       </w:r>
       <m:oMath>
         <m:acc>
@@ -27724,7 +27741,7 @@
         </m:acc>
       </m:oMath>
       <w:r>
-        <w:t xml:space="preserve"> of 1.01 but only 4 of those had </w:t>
+        <w:t xml:space="preserve"> of 1.01 but only 3 of those had </w:t>
       </w:r>
       <m:oMath>
         <m:acc>
@@ -27746,7 +27763,18 @@
         </m:acc>
       </m:oMath>
       <w:r>
-        <w:t xml:space="preserve"> values above 1.1 (Table XXX). The beta parameters used in the logistic curve were generally slow to converge given the combination of values that could describe plausible curves fit to the data. However, parameters with </w:t>
+        <w:t xml:space="preserve"> values above 1.1 (Table XXX). The </w:t>
+      </w:r>
+      <m:oMath>
+        <m:r>
+          <w:rPr>
+            <w:rFonts w:ascii="Cambria Math" w:hAnsi="Cambria Math"/>
+          </w:rPr>
+          <m:t>β</m:t>
+        </m:r>
+      </m:oMath>
+      <w:r>
+        <w:t xml:space="preserve"> parameters used in the logistic curve were generally slow to converge given the combination of values that could describe plausible curves fit to the data. However, parameters with </w:t>
       </w:r>
       <m:oMath>
         <m:acc>
@@ -27768,7 +27796,249 @@
         </m:acc>
       </m:oMath>
       <w:r>
-        <w:t xml:space="preserve"> values between 1.01 and 1.1 demonstrated trace plots with occasional extreme values that would likely converge with longer runs. One of the unconverged true parameters was a </w:t>
+        <w:t xml:space="preserve"> values between 1.01 and 1.1 demonstrated trace plots with occasional extreme values that would likely converge with longer runs. </w:t>
+      </w:r>
+      <w:r>
+        <w:rPr>
+          <w:b/>
+          <w:bCs/>
+        </w:rPr>
+        <w:t>Describe unconverged beta parameters:</w:t>
+      </w:r>
+      <w:r>
+        <w:t xml:space="preserve"> Two of the unconverged parameters were </w:t>
+      </w:r>
+      <m:oMath>
+        <m:sSub>
+          <m:sSubPr>
+            <m:ctrlPr>
+              <w:rPr>
+                <w:rFonts w:ascii="Cambria Math" w:hAnsi="Cambria Math"/>
+              </w:rPr>
+            </m:ctrlPr>
+          </m:sSubPr>
+          <m:e>
+            <m:r>
+              <w:rPr>
+                <w:rFonts w:ascii="Cambria Math" w:hAnsi="Cambria Math"/>
+              </w:rPr>
+              <m:t>β</m:t>
+            </m:r>
+          </m:e>
+          <m:sub>
+            <m:r>
+              <w:rPr>
+                <w:rFonts w:ascii="Cambria Math" w:hAnsi="Cambria Math"/>
+              </w:rPr>
+              <m:t>pH</m:t>
+            </m:r>
+          </m:sub>
+        </m:sSub>
+      </m:oMath>
+      <w:r>
+        <w:t xml:space="preserve"> parameters. One was the </w:t>
+      </w:r>
+      <m:oMath>
+        <m:sSubSup>
+          <m:sSubSupPr>
+            <m:ctrlPr>
+              <w:rPr>
+                <w:rFonts w:ascii="Cambria Math" w:hAnsi="Cambria Math"/>
+              </w:rPr>
+            </m:ctrlPr>
+          </m:sSubSupPr>
+          <m:e>
+            <m:r>
+              <w:rPr>
+                <w:rFonts w:ascii="Cambria Math" w:hAnsi="Cambria Math"/>
+              </w:rPr>
+              <m:t>σ</m:t>
+            </m:r>
+          </m:e>
+          <m:sub>
+            <m:d>
+              <m:dPr>
+                <m:ctrlPr>
+                  <w:rPr>
+                    <w:rFonts w:ascii="Cambria Math" w:hAnsi="Cambria Math"/>
+                  </w:rPr>
+                </m:ctrlPr>
+              </m:dPr>
+              <m:e>
+                <m:r>
+                  <w:rPr>
+                    <w:rFonts w:ascii="Cambria Math" w:hAnsi="Cambria Math"/>
+                  </w:rPr>
+                  <m:t>pH</m:t>
+                </m:r>
+              </m:e>
+            </m:d>
+            <m:d>
+              <m:dPr>
+                <m:ctrlPr>
+                  <w:rPr>
+                    <w:rFonts w:ascii="Cambria Math" w:hAnsi="Cambria Math"/>
+                  </w:rPr>
+                </m:ctrlPr>
+              </m:dPr>
+              <m:e>
+                <m:r>
+                  <w:rPr>
+                    <w:rFonts w:ascii="Cambria Math" w:hAnsi="Cambria Math"/>
+                  </w:rPr>
+                  <m:t>other</m:t>
+                </m:r>
+              </m:e>
+            </m:d>
+            <m:r>
+              <w:rPr>
+                <w:rFonts w:ascii="Cambria Math" w:hAnsi="Cambria Math"/>
+              </w:rPr>
+              <m:t>Kodiak</m:t>
+            </m:r>
+          </m:sub>
+          <m:sup>
+            <m:r>
+              <w:rPr>
+                <w:rFonts w:ascii="Cambria Math" w:hAnsi="Cambria Math"/>
+              </w:rPr>
+              <m:t>β0</m:t>
+            </m:r>
+          </m:sup>
+        </m:sSubSup>
+      </m:oMath>
+      <w:r>
+        <w:t xml:space="preserve"> parameter that had a spike in an otherwise uniform trace plot while the other unconverged </w:t>
+      </w:r>
+      <m:oMath>
+        <m:sSub>
+          <m:sSubPr>
+            <m:ctrlPr>
+              <w:rPr>
+                <w:rFonts w:ascii="Cambria Math" w:hAnsi="Cambria Math"/>
+              </w:rPr>
+            </m:ctrlPr>
+          </m:sSubPr>
+          <m:e>
+            <m:r>
+              <w:rPr>
+                <w:rFonts w:ascii="Cambria Math" w:hAnsi="Cambria Math"/>
+              </w:rPr>
+              <m:t>β</m:t>
+            </m:r>
+          </m:e>
+          <m:sub>
+            <m:r>
+              <w:rPr>
+                <w:rFonts w:ascii="Cambria Math" w:hAnsi="Cambria Math"/>
+              </w:rPr>
+              <m:t>pH</m:t>
+            </m:r>
+          </m:sub>
+        </m:sSub>
+      </m:oMath>
+      <w:r>
+        <w:t xml:space="preserve"> parameter was </w:t>
+      </w:r>
+      <m:oMath>
+        <m:r>
+          <w:rPr>
+            <w:rFonts w:ascii="Cambria Math" w:hAnsi="Cambria Math"/>
+          </w:rPr>
+          <m:t>β</m:t>
+        </m:r>
+        <m:sSub>
+          <m:sSubPr>
+            <m:ctrlPr>
+              <w:rPr>
+                <w:rFonts w:ascii="Cambria Math" w:hAnsi="Cambria Math"/>
+              </w:rPr>
+            </m:ctrlPr>
+          </m:sSubPr>
+          <m:e>
+            <m:r>
+              <w:rPr>
+                <w:rFonts w:ascii="Cambria Math" w:hAnsi="Cambria Math"/>
+              </w:rPr>
+              <m:t>1</m:t>
+            </m:r>
+          </m:e>
+          <m:sub>
+            <m:d>
+              <m:dPr>
+                <m:ctrlPr>
+                  <w:rPr>
+                    <w:rFonts w:ascii="Cambria Math" w:hAnsi="Cambria Math"/>
+                  </w:rPr>
+                </m:ctrlPr>
+              </m:dPr>
+              <m:e>
+                <m:r>
+                  <w:rPr>
+                    <w:rFonts w:ascii="Cambria Math" w:hAnsi="Cambria Math"/>
+                  </w:rPr>
+                  <m:t>pH</m:t>
+                </m:r>
+              </m:e>
+            </m:d>
+            <m:d>
+              <m:dPr>
+                <m:ctrlPr>
+                  <w:rPr>
+                    <w:rFonts w:ascii="Cambria Math" w:hAnsi="Cambria Math"/>
+                  </w:rPr>
+                </m:ctrlPr>
+              </m:dPr>
+              <m:e>
+                <m:r>
+                  <w:rPr>
+                    <w:rFonts w:ascii="Cambria Math" w:hAnsi="Cambria Math"/>
+                  </w:rPr>
+                  <m:t>pelagic</m:t>
+                </m:r>
+              </m:e>
+            </m:d>
+            <m:r>
+              <w:rPr>
+                <w:rFonts w:ascii="Cambria Math" w:hAnsi="Cambria Math"/>
+              </w:rPr>
+              <m:t>PWSO</m:t>
+            </m:r>
+          </m:sub>
+        </m:sSub>
+      </m:oMath>
+      <w:r>
+        <w:t xml:space="preserve"> which had an </w:t>
+      </w:r>
+      <m:oMath>
+        <m:acc>
+          <m:accPr>
+            <m:ctrlPr>
+              <w:rPr>
+                <w:rFonts w:ascii="Cambria Math" w:hAnsi="Cambria Math"/>
+              </w:rPr>
+            </m:ctrlPr>
+          </m:accPr>
+          <m:e>
+            <m:r>
+              <w:rPr>
+                <w:rFonts w:ascii="Cambria Math" w:hAnsi="Cambria Math"/>
+              </w:rPr>
+              <m:t>R</m:t>
+            </m:r>
+          </m:e>
+        </m:acc>
+      </m:oMath>
+      <w:r>
+        <w:t xml:space="preserve"> of 1.117.</w:t>
+      </w:r>
+    </w:p>
+    <w:p>
+      <w:pPr>
+        <w:pStyle w:val="BodyText"/>
+      </w:pPr>
+      <w:r>
+        <w:t xml:space="preserve">The other unconverged true parameters was a </w:t>
       </w:r>
       <m:oMath>
         <m:sSub>
@@ -27798,7 +28068,7 @@
         </m:sSub>
       </m:oMath>
       <w:r>
-        <w:t xml:space="preserve"> from the spline fit to the harvest trend (Appendix A) that demonstrated a very narrow posterior distribution with occasional spikes in the value, but that otherwise demonstrated satisfactory exploration of the posterior parameter space. The 4 parameters with </w:t>
+        <w:t xml:space="preserve"> from the spline fit to the harvest trend (Appendix A) that demonstrated a very narrow posterior distribution with occasional spikes in the value, but otherwise demonstrated satisfactory exploration of the posterior parameter space with an </w:t>
       </w:r>
       <m:oMath>
         <m:acc>
@@ -27820,29 +28090,7 @@
         </m:acc>
       </m:oMath>
       <w:r>
-        <w:t xml:space="preserve"> values in excess of 1.1 produced </w:t>
-      </w:r>
-      <m:oMath>
-        <m:acc>
-          <m:accPr>
-            <m:ctrlPr>
-              <w:rPr>
-                <w:rFonts w:ascii="Cambria Math" w:hAnsi="Cambria Math"/>
-              </w:rPr>
-            </m:ctrlPr>
-          </m:accPr>
-          <m:e>
-            <m:r>
-              <w:rPr>
-                <w:rFonts w:ascii="Cambria Math" w:hAnsi="Cambria Math"/>
-              </w:rPr>
-              <m:t>R</m:t>
-            </m:r>
-          </m:e>
-        </m:acc>
-      </m:oMath>
-      <w:r>
-        <w:t xml:space="preserve"> values of 1.104 and 1.173 and trace plots did not reveal any pathological patterns other than skewed distributions and the need to run longer chains.</w:t>
+        <w:t xml:space="preserve"> of 1.109.</w:t>
       </w:r>
     </w:p>
     <w:p>
@@ -28112,7 +28360,7 @@
         </m:sSub>
       </m:oMath>
       <w:r>
-        <w:t xml:space="preserve"> estimates were generally well converged with 435 demonstrating </w:t>
+        <w:t xml:space="preserve"> estimates were generally well converged with 504 demonstrating </w:t>
       </w:r>
       <m:oMath>
         <m:acc>
@@ -28134,7 +28382,7 @@
         </m:acc>
       </m:oMath>
       <w:r>
-        <w:t xml:space="preserve"> values (3.28%) above 1.01 and 14 (0.11%) demonstrating values above 1.1. Unconverged estimates all demonstrated highly skewed posteriors where the bulk of the posterior distributions were near the lower bound. Of the 14 estimates with </w:t>
+        <w:t xml:space="preserve"> values (3.8%) above 1.01 and 31 (0.23%) demonstrating values above 1.1. Unconverged estimates all demonstrated highly skewed posteriors where the bulk of the posterior distributions were near the lower bound. Of the 31 estimates with </w:t>
       </w:r>
       <m:oMath>
         <m:acc>
@@ -28156,7 +28404,58 @@
         </m:acc>
       </m:oMath>
       <w:r>
-        <w:t xml:space="preserve"> in excess of 1.1, 12 estimates (86%) had medians less than 1 and 13 (93%) had medians less than 10. The other 1 estimates (7%) were associated with highly skewed distributions.</w:t>
+        <w:t xml:space="preserve"> in excess of 1.1, 28 estimates (90%) had medians less </w:t>
+      </w:r>
+      <w:r>
+        <w:lastRenderedPageBreak/>
+        <w:t xml:space="preserve">than 1 and 29 (94%) had medians less than 10. Of the 2 unconverged </w:t>
+      </w:r>
+      <m:oMath>
+        <m:sSub>
+          <m:sSubPr>
+            <m:ctrlPr>
+              <w:rPr>
+                <w:rFonts w:ascii="Cambria Math" w:hAnsi="Cambria Math"/>
+              </w:rPr>
+            </m:ctrlPr>
+          </m:sSubPr>
+          <m:e>
+            <m:r>
+              <w:rPr>
+                <w:rFonts w:ascii="Cambria Math" w:hAnsi="Cambria Math"/>
+              </w:rPr>
+              <m:t>H</m:t>
+            </m:r>
+          </m:e>
+          <m:sub>
+            <m:d>
+              <m:dPr>
+                <m:ctrlPr>
+                  <w:rPr>
+                    <w:rFonts w:ascii="Cambria Math" w:hAnsi="Cambria Math"/>
+                  </w:rPr>
+                </m:ctrlPr>
+              </m:dPr>
+              <m:e>
+                <m:r>
+                  <w:rPr>
+                    <w:rFonts w:ascii="Cambria Math" w:hAnsi="Cambria Math"/>
+                  </w:rPr>
+                  <m:t>comp</m:t>
+                </m:r>
+              </m:e>
+            </m:d>
+            <m:r>
+              <w:rPr>
+                <w:rFonts w:ascii="Cambria Math" w:hAnsi="Cambria Math"/>
+              </w:rPr>
+              <m:t>ayu</m:t>
+            </m:r>
+          </m:sub>
+        </m:sSub>
+      </m:oMath>
+      <w:r>
+        <w:t xml:space="preserve"> estimates with medians greater than 10, both were from pre-1999 years when logbook data became available. The highest unconverged harvest estimate had a median and mean value of 12.302 and 16.093, respectively, indicating that these questionable estimates represent negligible harvests from a management perspective.</w:t>
       </w:r>
     </w:p>
     <w:p>
@@ -28208,7 +28507,54 @@
         </m:sSub>
       </m:oMath>
       <w:r>
-        <w:t xml:space="preserve"> estimates were less well converged with 1,495 demonstrating </w:t>
+        <w:t xml:space="preserve"> estimates were less well converged relative to </w:t>
+      </w:r>
+      <m:oMath>
+        <m:sSub>
+          <m:sSubPr>
+            <m:ctrlPr>
+              <w:rPr>
+                <w:rFonts w:ascii="Cambria Math" w:hAnsi="Cambria Math"/>
+              </w:rPr>
+            </m:ctrlPr>
+          </m:sSubPr>
+          <m:e>
+            <m:r>
+              <w:rPr>
+                <w:rFonts w:ascii="Cambria Math" w:hAnsi="Cambria Math"/>
+              </w:rPr>
+              <m:t>H</m:t>
+            </m:r>
+          </m:e>
+          <m:sub>
+            <m:d>
+              <m:dPr>
+                <m:ctrlPr>
+                  <w:rPr>
+                    <w:rFonts w:ascii="Cambria Math" w:hAnsi="Cambria Math"/>
+                  </w:rPr>
+                </m:ctrlPr>
+              </m:dPr>
+              <m:e>
+                <m:r>
+                  <w:rPr>
+                    <w:rFonts w:ascii="Cambria Math" w:hAnsi="Cambria Math"/>
+                  </w:rPr>
+                  <m:t>comp</m:t>
+                </m:r>
+              </m:e>
+            </m:d>
+            <m:r>
+              <w:rPr>
+                <w:rFonts w:ascii="Cambria Math" w:hAnsi="Cambria Math"/>
+              </w:rPr>
+              <m:t>ayu</m:t>
+            </m:r>
+          </m:sub>
+        </m:sSub>
+      </m:oMath>
+      <w:r>
+        <w:t xml:space="preserve"> estimates with 1,484 demonstrating </w:t>
       </w:r>
       <m:oMath>
         <m:acc>
@@ -28230,7 +28576,7 @@
         </m:acc>
       </m:oMath>
       <w:r>
-        <w:t xml:space="preserve"> values (6.83%) above 1.01 and 111 (0.51%) demonstrating values above 1.1. Unconverged estimates all demonstrated highly skewed posteriors where the bulk of the posterior distributions were near the lower bound. Of the 111 estimates with </w:t>
+        <w:t xml:space="preserve"> values (6.78%) above 1.01 and 161 (0.74%) demonstrating values above 1.1. Unconverged estimates demonstrated highly skewed posteriors where the bulk of the posterior distributions were near the lower bound. Of the 161 estimates with </w:t>
       </w:r>
       <m:oMath>
         <m:acc>
@@ -28252,11 +28598,54 @@
         </m:acc>
       </m:oMath>
       <w:r>
-        <w:t xml:space="preserve"> in excess of 1.1, 66 estimates (59%) had medians less than 1 and 93 </w:t>
-      </w:r>
-      <w:r>
-        <w:lastRenderedPageBreak/>
-        <w:t>(84%) had medians less than 10. The other 18 estimates (16%) were associated with highly skewed distributions.</w:t>
+        <w:t xml:space="preserve"> in excess of 1.1, 131 estimates (81%) had medians less than 1 and 150 (93%) had medians less than 10. Of the 11 unconverged </w:t>
+      </w:r>
+      <m:oMath>
+        <m:sSub>
+          <m:sSubPr>
+            <m:ctrlPr>
+              <w:rPr>
+                <w:rFonts w:ascii="Cambria Math" w:hAnsi="Cambria Math"/>
+              </w:rPr>
+            </m:ctrlPr>
+          </m:sSubPr>
+          <m:e>
+            <m:r>
+              <w:rPr>
+                <w:rFonts w:ascii="Cambria Math" w:hAnsi="Cambria Math"/>
+              </w:rPr>
+              <m:t>R</m:t>
+            </m:r>
+          </m:e>
+          <m:sub>
+            <m:d>
+              <m:dPr>
+                <m:ctrlPr>
+                  <w:rPr>
+                    <w:rFonts w:ascii="Cambria Math" w:hAnsi="Cambria Math"/>
+                  </w:rPr>
+                </m:ctrlPr>
+              </m:dPr>
+              <m:e>
+                <m:r>
+                  <w:rPr>
+                    <w:rFonts w:ascii="Cambria Math" w:hAnsi="Cambria Math"/>
+                  </w:rPr>
+                  <m:t>comp</m:t>
+                </m:r>
+              </m:e>
+            </m:d>
+            <m:r>
+              <w:rPr>
+                <w:rFonts w:ascii="Cambria Math" w:hAnsi="Cambria Math"/>
+              </w:rPr>
+              <m:t>ayu</m:t>
+            </m:r>
+          </m:sub>
+        </m:sSub>
+      </m:oMath>
+      <w:r>
+        <w:t xml:space="preserve"> estimates with medians greater than 10, 8 were from pre-1999 years when logbook data became available and all 11 were from before 2011 when the SWHS began tracking private and charter harvests separately. The highest unconverged release estimate had a median and mean value of 137.931 and 229.537, respectively, indicating that these questionable estimates concern relatively low numbers of released fish.</w:t>
       </w:r>
     </w:p>
     <w:p>
@@ -28264,7 +28653,7 @@
         <w:pStyle w:val="Heading2"/>
       </w:pPr>
       <w:bookmarkStart w:id="37" w:name="residual-patterns"/>
-      <w:bookmarkStart w:id="38" w:name="_Toc222293936"/>
+      <w:bookmarkStart w:id="38" w:name="_Toc224741388"/>
       <w:r>
         <w:t>Residual Patterns</w:t>
       </w:r>
@@ -28299,7 +28688,7 @@
         <w:pStyle w:val="Heading2"/>
       </w:pPr>
       <w:bookmarkStart w:id="39" w:name="bias-estimation"/>
-      <w:bookmarkStart w:id="40" w:name="_Toc222293937"/>
+      <w:bookmarkStart w:id="40" w:name="_Toc224741389"/>
       <w:bookmarkEnd w:id="37"/>
       <w:r>
         <w:t>Bias Estimation</w:t>
@@ -28311,7 +28700,11 @@
         <w:pStyle w:val="FirstParagraph"/>
       </w:pPr>
       <w:r>
-        <w:t>Model predicted bias in SWHS harvest and release data tracked the observed bias well across years and CFMUs (Figure 12 and 13 YEARAREA_BIAS) and demonstrated that SWHS estimates were generally biased low while release estimates were biased high (Figure 14 MEAN_BIAS). Observed and estimated harvest bias were very consistent with the exception of the very data poor BSAI CFMU (Figure 12 YEARAREA_BIAS).</w:t>
+        <w:t xml:space="preserve">Model predicted bias in SWHS harvest and release data tracked the observed bias well across years and CFMUs (Figure 12 and 13 YEARAREA_BIAS) and demonstrated that SWHS estimates were generally biased low while release estimates were biased high (Figure 14 MEAN_BIAS). </w:t>
+      </w:r>
+      <w:r>
+        <w:lastRenderedPageBreak/>
+        <w:t>Observed and estimated harvest bias were very consistent with the exception of the very data poor BSAI CFMU (Figure 12 YEARAREA_BIAS).</w:t>
       </w:r>
     </w:p>
     <w:p>
@@ -28327,11 +28720,7 @@
         <w:pStyle w:val="BodyText"/>
       </w:pPr>
       <w:r>
-        <w:t xml:space="preserve">Release bias for the Southcentral areas was much lower in the model relative to that observed when comparing logbook and SWHS data and was the result of incorporating the port side interview data into the model. When the portside interview data is omitted, the model estimated bias matches the observed similarly to that of the other regions. The reduced bias estimated with the inclusion of the interview data would suggest that private anglers are providing less biased responses to the </w:t>
-      </w:r>
-      <w:r>
-        <w:lastRenderedPageBreak/>
-        <w:t>SWHS than are guided anglers and/or logbook records of releases in this region are perhaps less accurate than would be assumed.</w:t>
+        <w:t>Release bias for the Southcentral areas was much lower in the model relative to that observed when comparing logbook and SWHS data and was the result of incorporating the port side interview data into the model. When the portside interview data is omitted, the model estimated bias matches the observed similarly to that of the other regions. The reduced bias estimated with the inclusion of the interview data would suggest that private anglers are providing less biased responses to the SWHS than are guided anglers and/or logbook records of releases in this region are perhaps less accurate than would be assumed.</w:t>
       </w:r>
     </w:p>
     <w:p>
@@ -28339,7 +28728,7 @@
         <w:pStyle w:val="Heading2"/>
       </w:pPr>
       <w:bookmarkStart w:id="41" w:name="proportion-harvested"/>
-      <w:bookmarkStart w:id="42" w:name="_Toc222293938"/>
+      <w:bookmarkStart w:id="42" w:name="_Toc224741390"/>
       <w:bookmarkEnd w:id="39"/>
       <w:r>
         <w:t>Proportion Harvested</w:t>
@@ -28490,7 +28879,11 @@
         </m:sSub>
       </m:oMath>
       <w:r>
-        <w:t>) the proportion harvested demonstrated variable patterns across regions (Figure 17 pH_OTHER). Central regions demonstrated a static pattern with the exception of Cook Inlet where retention probabilities increased over the course of observed time periods. Kodiak demonstrated increasing retention probabilities with the exception of the WKMA CFMUs which were static. For these two regions, the portside interview data tracked logbook records to various degrees, but demonstrated greater differences relative to the other species assemblages.</w:t>
+        <w:t xml:space="preserve">) the proportion harvested demonstrated variable patterns across regions (Figure 17 pH_OTHER). Central regions demonstrated a static pattern with the exception of Cook Inlet where retention probabilities increased over the course of observed time periods. Kodiak demonstrated increasing retention probabilities with the exception </w:t>
+      </w:r>
+      <w:r>
+        <w:lastRenderedPageBreak/>
+        <w:t>of the WKMA CFMUs which were static. For these two regions, the portside interview data tracked logbook records to various degrees, but demonstrated greater differences relative to the other species assemblages.</w:t>
       </w:r>
     </w:p>
     <w:p>
@@ -28498,11 +28891,7 @@
         <w:pStyle w:val="BodyText"/>
       </w:pPr>
       <w:r>
-        <w:t xml:space="preserve">Southeast CFMU’s show a pattern similar to that of yelloweye rockfish with high retention prior to management restrictions enacted in recent years, but with greater discrepancies between the logbook and portside interview data. The model tracked the logbook data for guided anglers and estimates of unguided releases showed considerably uncertainty even in recent years as a result of high overdispersion in the interview data that is evident from the disparity between logbook and interview data (Figure 17 pH_OTHER). The “other” rockfish in Southeast Alaska are comprised of slope rockfish and non-yelloweye DSR rockfish, which further informs the model but introduces more tension as the likelihoods compete over the contradictory data. The retention probability of non-yelloweye DSR (Figure XX pH_DSR) and slope rockfish (Figure XX pH_SLOPE) are fit using the portside interview data while the sum of those releases must be equal to the release of the “other” rockfish that are fit to the portside and logbook data. The resolution of these sometimes </w:t>
-      </w:r>
-      <w:r>
-        <w:lastRenderedPageBreak/>
-        <w:t>contradictory signals results in pH estimates for DSR that follow the data (Figure XX pH_DSR), but pH estimates for slope rockfish in the SSEO that are substantially less than that reported in portside interviews (Figure XX pH_SLOPE). Sample sizes for slope rockfish are generally smaller than for DSR, particularly in the SSEO and thus the model tracks the DSR data better than the slope rockfish data.</w:t>
+        <w:t>Southeast CFMU’s show a pattern similar to that of yelloweye rockfish with high retention prior to management restrictions enacted in recent years, but with greater discrepancies between the logbook and portside interview data. The model tracked the logbook data for guided anglers and estimates of unguided releases showed considerably uncertainty even in recent years as a result of high overdispersion in the interview data that is evident from the disparity between logbook and interview data (Figure 17 pH_OTHER). The “other” rockfish in Southeast Alaska are comprised of slope rockfish and non-yelloweye DSR rockfish, which further informs the model but introduces more tension as the likelihoods compete over the contradictory data. The retention probability of non-yelloweye DSR (Figure XX pH_DSR) and slope rockfish (Figure XX pH_SLOPE) are fit using the portside interview data while the sum of those releases must be equal to the release of the “other” rockfish that are fit to the portside and logbook data. The resolution of these sometimes contradictory signals results in pH estimates for DSR that follow the data (Figure XX pH_DSR), but pH estimates for slope rockfish in the SSEO that are substantially less than that reported in portside interviews (Figure XX pH_SLOPE). Sample sizes for slope rockfish are generally smaller than for DSR, particularly in the SSEO and thus the model tracks the DSR data better than the slope rockfish data.</w:t>
       </w:r>
     </w:p>
     <w:p>
@@ -28510,7 +28899,7 @@
         <w:pStyle w:val="Heading2"/>
       </w:pPr>
       <w:bookmarkStart w:id="43" w:name="species-composition"/>
-      <w:bookmarkStart w:id="44" w:name="_Toc222293939"/>
+      <w:bookmarkStart w:id="44" w:name="_Toc224741391"/>
       <w:bookmarkEnd w:id="41"/>
       <w:r>
         <w:t>Species Composition</w:t>
@@ -28751,7 +29140,11 @@
         </m:sSub>
       </m:oMath>
       <w:r>
-        <w:t xml:space="preserve"> proved to be both informative and useful in estimating those values. Without that data the estimates tended toward the hyperprior values as informed by the Northeast data and resulted in credibility intervals that stretched from 0 to 1. The hydroacoustic data demonstrates higher black rockfish proportions in these other areas and the model was able to generate more precise and realistic estimates of these parameters.</w:t>
+        <w:t xml:space="preserve"> proved to be both informative and useful in estimating those values. Without that data the estimates tended toward the hyperprior values as informed by the Northeast data and resulted in credibility intervals </w:t>
+      </w:r>
+      <w:r>
+        <w:lastRenderedPageBreak/>
+        <w:t>that stretched from 0 to 1. The hydroacoustic data demonstrates higher black rockfish proportions in these other areas and the model was able to generate more precise and realistic estimates of these parameters.</w:t>
       </w:r>
     </w:p>
     <w:p>
@@ -28767,11 +29160,7 @@
         <w:pStyle w:val="BodyText"/>
       </w:pPr>
       <w:r>
-        <w:t xml:space="preserve">The proportion of the Southeast harvest that were DSR and slope rockfish also appeared to track the data well and provide reasonable predictions for hindcasting (Figure P_DSR 21, P_SLOPE 22, </w:t>
-      </w:r>
-      <w:r>
-        <w:lastRenderedPageBreak/>
-        <w:t>P_SLOPE_REL 23). The trends in these two assemblages indicate that prior to restrictions being placed on yelloweye and DSR, the vast bulk of the non-pelagic harvests in Southeast were DSR species with slope species comprising only a minor proportion. However, with the closure of yelloweye and restrictions on DSR the proportion of the harvest that were slope rose steeply in recent years.</w:t>
+        <w:t>The proportion of the Southeast harvest that were DSR and slope rockfish also appeared to track the data well and provide reasonable predictions for hindcasting (Figure P_DSR 21, P_SLOPE 22, P_SLOPE_REL 23). The trends in these two assemblages indicate that prior to restrictions being placed on yelloweye and DSR, the vast bulk of the non-pelagic harvests in Southeast were DSR species with slope species comprising only a minor proportion. However, with the closure of yelloweye and restrictions on DSR the proportion of the harvest that were slope rose steeply in recent years.</w:t>
       </w:r>
     </w:p>
     <w:p>
@@ -28779,7 +29168,7 @@
         <w:pStyle w:val="Heading2"/>
       </w:pPr>
       <w:bookmarkStart w:id="45" w:name="proportion-guided"/>
-      <w:bookmarkStart w:id="46" w:name="_Toc222293940"/>
+      <w:bookmarkStart w:id="46" w:name="_Toc224741392"/>
       <w:bookmarkEnd w:id="43"/>
       <w:r>
         <w:t>Proportion Guided</w:t>
@@ -28799,7 +29188,7 @@
         <w:pStyle w:val="Heading2"/>
       </w:pPr>
       <w:bookmarkStart w:id="47" w:name="weight"/>
-      <w:bookmarkStart w:id="48" w:name="_Toc222293941"/>
+      <w:bookmarkStart w:id="48" w:name="_Toc224741393"/>
       <w:bookmarkEnd w:id="45"/>
       <w:r>
         <w:t>Weight</w:t>
@@ -28819,7 +29208,7 @@
         <w:pStyle w:val="Heading2"/>
       </w:pPr>
       <w:bookmarkStart w:id="49" w:name="X9d99479f46dec730a7a401f5db2083d62218015"/>
-      <w:bookmarkStart w:id="50" w:name="_Toc222293942"/>
+      <w:bookmarkStart w:id="50" w:name="_Toc224741394"/>
       <w:bookmarkEnd w:id="47"/>
       <w:r>
         <w:t>Harvest, Release and Total Removal Estimates</w:t>
@@ -28840,7 +29229,11 @@
         <w:pStyle w:val="FirstParagraph"/>
       </w:pPr>
       <w:r>
-        <w:t>Total rockfish harvests demonstrate a generally increasing trend across the time series with some plateauing in recent years as a result of management restrictions (Figure 25 H_ALL; Appendix C1). Prior to 1998 when the logbook program went into effect, there is greater uncertainty in estimates and harvests were generally low. Some areas such as Cook Inlet (CI), North Gulf (NG), Northeast Kodiak and many of the Southeast CFMUs demonstrate consistent harvests during that time period. Harvest estimates from the Bayesian model are very consistent with Howard method estimates with some exceptions. There are some differences in the 1998-2001 period when the Howard methods made assumptions to deal with data limitations that were more appropriately handled with the hierarchical approach in the Bayesian model. There are also differences in some of the Kodiak areas where the Howard methods borrowed values from the most data rich Kodiak CFMUs whereas the Bayes model applies a hierarchical approach to leverage all of the data.</w:t>
+        <w:t xml:space="preserve">Total rockfish harvests demonstrate a generally increasing trend across the time series with some plateauing in recent years as a result of management restrictions (Figure 25 H_ALL; Appendix C1). Prior to 1998 when the logbook program went into effect, there is greater uncertainty in estimates and harvests were generally low. Some areas such as Cook Inlet (CI), North Gulf (NG), Northeast Kodiak and many of the Southeast CFMUs demonstrate consistent harvests during that time period. Harvest estimates from the Bayesian model are very consistent with Howard method estimates with some exceptions. There are some differences in the 1998-2001 period when the Howard methods made assumptions to deal with data limitations that were more appropriately handled with the hierarchical approach in the Bayesian model. There are also differences in some </w:t>
+      </w:r>
+      <w:r>
+        <w:lastRenderedPageBreak/>
+        <w:t>of the Kodiak areas where the Howard methods borrowed values from the most data rich Kodiak CFMUs whereas the Bayes model applies a hierarchical approach to leverage all of the data.</w:t>
       </w:r>
     </w:p>
     <w:p>
@@ -28856,7 +29249,6 @@
         <w:pStyle w:val="BodyText"/>
       </w:pPr>
       <w:r>
-        <w:lastRenderedPageBreak/>
         <w:t>Yelloweye rockfish harvests also demonstrate increasing trends but with reductions in recent years that reflect management actions taken by the department (Figure 27 H_YE, Appendix C3). The Bayesian model demonstrates consistent and steady harvests in many CFMU’s prior to 1998 with the Southeast SSEI and CSEO demonstrating appreciable harvests. As with black rockfish, yelloweye rockfish guided harvests estimates agree with Howard estimates. Unguided yelloweye harvests were also similar to Howard estimates with the exception of the PWSI CFMU. This is the only area where private harvests are significantly greater than guided harvests and thus the effect of bias correction in the model is more pronounced.</w:t>
       </w:r>
     </w:p>
@@ -28901,7 +29293,11 @@
         <w:pStyle w:val="FirstParagraph"/>
       </w:pPr>
       <w:r>
-        <w:t>The release estimates for all rockfish are substantially less than harvests and demonstrate variable trends over the course of the time series with substantial uncertainty in the estimates (Figure 30 R_ALL and Appendix C1). Estimates from the pre-1998 period were sometimes similar to the low end of the post-1998 period or demonstrate an increase as the fishery in that CFMU developed. The trends in the Bayesian model diverge from the Howard estimates more than the harvest estimates due to changes in methodology, including the integration of the portside interview data. Portside interview data in Southcentral and the Northeast Kodiak CFMU showed much lower retention probabilities for private anglers which greatly increased the release estimates in this region relative to the Howard estimates. In the Southeast region the release estimates are generally in line with the Howard estimates, but are significantly lower in the early 2000s when the Howard methods relied on assumptions and long term averages to compensate for the lack of logbook data on yelloweye releases (Figure DATA).</w:t>
+        <w:t xml:space="preserve">The release estimates for all rockfish are substantially less than harvests and demonstrate variable trends over the course of the time series with substantial uncertainty in the estimates (Figure 30 R_ALL and Appendix C1). Estimates from the pre-1998 period were sometimes similar to the low </w:t>
+      </w:r>
+      <w:r>
+        <w:lastRenderedPageBreak/>
+        <w:t>end of the post-1998 period or demonstrate an increase as the fishery in that CFMU developed. The trends in the Bayesian model diverge from the Howard estimates more than the harvest estimates due to changes in methodology, including the integration of the portside interview data. Portside interview data in Southcentral and the Northeast Kodiak CFMU showed much lower retention probabilities for private anglers which greatly increased the release estimates in this region relative to the Howard estimates. In the Southeast region the release estimates are generally in line with the Howard estimates, but are significantly lower in the early 2000s when the Howard methods relied on assumptions and long term averages to compensate for the lack of logbook data on yelloweye releases (Figure DATA).</w:t>
       </w:r>
     </w:p>
     <w:p>
@@ -28909,11 +29305,7 @@
         <w:pStyle w:val="BodyText"/>
       </w:pPr>
       <w:r>
-        <w:t xml:space="preserve">Releases of black rockfish demonstrate a relatively steady trend with an increase for guided anglers in the early 2000s as anglers began to target the species and then a decline as guided angler retention increased (Figure 31 R_BLACK, Figure 15 PEL_pH, Appendix C2). Unguided anglers show a gradual increase in releases that mirrors the overall increase in the fishery. Estimates of guided releases are very precise since 1998 owing to logbook records and adequate sampling in the port sampling program. Prior to 1998, guided release estimates demonstrate significant </w:t>
-      </w:r>
-      <w:r>
-        <w:lastRenderedPageBreak/>
-        <w:t xml:space="preserve">uncertainty. Estimates of unguided releases have substantial uncertainty as a result of data specific to unguided release numbers and the reliance on the </w:t>
+        <w:t xml:space="preserve">Releases of black rockfish demonstrate a relatively steady trend with an increase for guided anglers in the early 2000s as anglers began to target the species and then a decline as guided angler retention increased (Figure 31 R_BLACK, Figure 15 PEL_pH, Appendix C2). Unguided anglers show a gradual increase in releases that mirrors the overall increase in the fishery. Estimates of guided releases are very precise since 1998 owing to logbook records and adequate sampling in the port sampling program. Prior to 1998, guided release estimates demonstrate significant uncertainty. Estimates of unguided releases have substantial uncertainty as a result of data specific to unguided release numbers and the reliance on the </w:t>
       </w:r>
       <w:r>
         <w:rPr>
@@ -28965,11 +29357,12 @@
         <w:pStyle w:val="Heading1"/>
       </w:pPr>
       <w:bookmarkStart w:id="54" w:name="discussion"/>
-      <w:bookmarkStart w:id="55" w:name="_Toc222293943"/>
+      <w:bookmarkStart w:id="55" w:name="_Toc224741395"/>
       <w:bookmarkEnd w:id="35"/>
       <w:bookmarkEnd w:id="49"/>
       <w:bookmarkEnd w:id="53"/>
       <w:r>
+        <w:lastRenderedPageBreak/>
         <w:t>Discussion</w:t>
       </w:r>
       <w:bookmarkEnd w:id="55"/>
@@ -28987,11 +29380,7 @@
         <w:pStyle w:val="BodyText"/>
       </w:pPr>
       <w:r>
-        <w:t xml:space="preserve">Harvest estimates produced with these methods are generally consistent with the Howard estimates and differ only where the Bayesian methods offer improvements on a key, but flawed, assumption </w:t>
-      </w:r>
-      <w:r>
-        <w:lastRenderedPageBreak/>
-        <w:t>about the use of SWHS data. The Howard methods rely on the SWHS ratio of guided:unguided harvests to expand guided logbook harvests to generate unguided estimates thus making the assumption that the guided:unguided ratio applies equally to all species and species complexes. Most CFMUs have considerably higher harvests by guided users and thus this flaw is less significant as the Bayesian estimates of unguided harvests align well with Howard estimates. However, where guided anglers are in the minority (i.e., PWSI) we see larger differences in the unguided harvests that demonstrate the limitations of that approach.</w:t>
+        <w:t>Harvest estimates produced with these methods are generally consistent with the Howard estimates and differ only where the Bayesian methods offer improvements on a key, but flawed, assumption about the use of SWHS data. The Howard methods rely on the SWHS ratio of guided:unguided harvests to expand guided logbook harvests to generate unguided estimates thus making the assumption that the guided:unguided ratio applies equally to all species and species complexes. Most CFMUs have considerably higher harvests by guided users and thus this flaw is less significant as the Bayesian estimates of unguided harvests align well with Howard estimates. However, where guided anglers are in the minority (i.e., PWSI) we see larger differences in the unguided harvests that demonstrate the limitations of that approach.</w:t>
       </w:r>
     </w:p>
     <w:p>
@@ -29007,7 +29396,11 @@
         <w:pStyle w:val="BodyText"/>
       </w:pPr>
       <w:r>
-        <w:t>The flaw in the Howard methods is apparent when examining release estimates of rockfish in Southeast CFMU’s since 2020 when yelloweye retention was prohibited and DSR retention restricted. During these years the logbook data demonstrates almost 100% retention of black rockfish while regulations reduce yelloweye retention to zero and limited DSR retention to 1 per day. In most of Southeast guided harvests are significantly higher than unguided harvests but the SWHS unguided:guided release ratio suggests more releases by unguided anglers. Thus, the Howard methods expand the guided release estimates to derive unguided estimates, resulting in estimates of unguided black rockfish releases far above the guided estimates while the harvest estimates display the opposite pattern. The CSEO is particularly indicative of this inconsistency where guided harvests of black rockfish are over 4 times that of the unguided anglers while the Howard methods generate unguided release estimates 2 to 3 times that of guided anglers. Because the SWHS data is for all rockfish combined it does not address the different retention probabilities by species complexes which are particularly divergent in Southeast since 2000 due to management action.</w:t>
+        <w:t xml:space="preserve">The flaw in the Howard methods is apparent when examining release estimates of rockfish in Southeast CFMU’s since 2020 when yelloweye retention was prohibited and DSR retention restricted. During these years the logbook data demonstrates almost 100% retention of black rockfish while regulations reduce yelloweye retention to zero and limited DSR retention to 1 per day. In most of Southeast guided harvests are significantly higher than unguided harvests but the SWHS unguided:guided release ratio suggests more releases by unguided anglers. Thus, the Howard methods expand the guided release estimates to derive unguided estimates, resulting in estimates of unguided black rockfish releases far above the guided estimates while the harvest estimates display the opposite pattern. The CSEO is particularly indicative of this inconsistency </w:t>
+      </w:r>
+      <w:r>
+        <w:lastRenderedPageBreak/>
+        <w:t>where guided harvests of black rockfish are over 4 times that of the unguided anglers while the Howard methods generate unguided release estimates 2 to 3 times that of guided anglers. Because the SWHS data is for all rockfish combined it does not address the different retention probabilities by species complexes which are particularly divergent in Southeast since 2000 due to management action.</w:t>
       </w:r>
     </w:p>
     <w:p>
@@ -29053,11 +29446,7 @@
         <w:pStyle w:val="BodyText"/>
       </w:pPr>
       <w:r>
-        <w:t xml:space="preserve">Estimating unguided releases thus required an assumption that retention probabilities for unguided anglers followed similar trends to that of unguided anglers but was informed by the integration of </w:t>
-      </w:r>
-      <w:r>
-        <w:lastRenderedPageBreak/>
-        <w:t>the portside interview data. All release estimates are based on the assumption that charter captains accurately report the number of fish they release and under-reported releases in logbook data would have the effect of inflating the model estimates of release bias in the SWHS. While law enforcement provides incentives for the accurate recording of harvests, enforcement of release reporting is near impossible. Apparent bias of SWHS release estimates is very high, suggesting that anglers overestimate the number of fish released by a factor of 2 or more while underestimating the number of fish harvested. Recall bias, which may be worse with released fish relative to harvests, may partially explain these results but it cannot be ruled out that release estimates from the logbook data are not entirely accurate. Models were explored to loosen the assumption that logbook releases act as a census, but thus far no viable model has been developed that produces reasonable release estimates. The SWHS is currently undergoing a modernization project that may shed more light on how to resolve some of these issues in the future.</w:t>
+        <w:t>Estimating unguided releases thus required an assumption that retention probabilities for unguided anglers followed similar trends to that of unguided anglers but was informed by the integration of the portside interview data. All release estimates are based on the assumption that charter captains accurately report the number of fish they release and under-reported releases in logbook data would have the effect of inflating the model estimates of release bias in the SWHS. While law enforcement provides incentives for the accurate recording of harvests, enforcement of release reporting is near impossible. Apparent bias of SWHS release estimates is very high, suggesting that anglers overestimate the number of fish released by a factor of 2 or more while underestimating the number of fish harvested. Recall bias, which may be worse with released fish relative to harvests, may partially explain these results but it cannot be ruled out that release estimates from the logbook data are not entirely accurate. Models were explored to loosen the assumption that logbook releases act as a census, but thus far no viable model has been developed that produces reasonable release estimates. The SWHS is currently undergoing a modernization project that may shed more light on how to resolve some of these issues in the future.</w:t>
       </w:r>
     </w:p>
     <w:p>
@@ -29182,6 +29571,7 @@
         <w:pStyle w:val="BodyText"/>
       </w:pPr>
       <w:r>
+        <w:lastRenderedPageBreak/>
         <w:t>The discrepancy in the release of non-yelloweye DSR and slope rockfish in the SSEO portside sampling and logbook data also bears attention. In particular, logbooks record low retention of “other” rockfish while portside interviews indicate high retention. Area biologists should investigate this data discrepancy to determine if species identification or systematic under- or overreporting in logbooks is contributing to the contradictory data.</w:t>
       </w:r>
     </w:p>
@@ -29198,9 +29588,8 @@
         <w:pStyle w:val="Heading2"/>
       </w:pPr>
       <w:bookmarkStart w:id="56" w:name="conclusions-and-recommendations"/>
-      <w:bookmarkStart w:id="57" w:name="_Toc222293944"/>
-      <w:r>
-        <w:lastRenderedPageBreak/>
+      <w:bookmarkStart w:id="57" w:name="_Toc224741396"/>
+      <w:r>
         <w:t>Conclusions and Recommendations</w:t>
       </w:r>
       <w:bookmarkEnd w:id="57"/>
@@ -29274,7 +29663,11 @@
         <w:pStyle w:val="BodyText"/>
       </w:pPr>
       <w:r>
-        <w:t>In conclusion, these new estimates of rockfish harvest, release and removals offer an improved and more reproducible approach to catch accounting for this highly targeted and vulnerable group of fish. These methods build on the location accounting system built by Howard et al. (2020) as well as the validation of the port sampling representativeness. In addition to extending the time series, the new methods are more reflective of the angling process, better capture the uncertainty in the data, more appropriately share information within regions, and provide a unified and centralized approach to calculating, reporting and archiving rockfish harvests, releases and removals in Alaska waters.</w:t>
+        <w:t xml:space="preserve">In conclusion, these new estimates of rockfish harvest, release and removals offer an improved and more reproducible approach to catch accounting for this highly targeted and vulnerable group of fish. These methods build on the location accounting system built by Howard et al. (2020) as well as the validation of the port sampling representativeness. In addition to extending the time series, the new methods are more reflective of the angling process, better capture the uncertainty </w:t>
+      </w:r>
+      <w:r>
+        <w:lastRenderedPageBreak/>
+        <w:t>in the data, more appropriately share information within regions, and provide a unified and centralized approach to calculating, reporting and archiving rockfish harvests, releases and removals in Alaska waters.</w:t>
       </w:r>
     </w:p>
     <w:p>
@@ -29282,7 +29675,7 @@
         <w:pStyle w:val="Heading1"/>
       </w:pPr>
       <w:bookmarkStart w:id="58" w:name="acknowledgments"/>
-      <w:bookmarkStart w:id="59" w:name="_Toc222293945"/>
+      <w:bookmarkStart w:id="59" w:name="_Toc224741397"/>
       <w:bookmarkEnd w:id="54"/>
       <w:bookmarkEnd w:id="56"/>
       <w:r>
@@ -29295,11 +29688,7 @@
         <w:pStyle w:val="FirstParagraph"/>
       </w:pPr>
       <w:r>
-        <w:t xml:space="preserve">Sport harvest reconstructions provided in this document were made possible by the devoted time and effort of many people administering the data collection projects used in these analyses. First and foremost, it needs to be acknowledged that although this report may seem critical of the Howard methods, this effort does not exist without the foundational work undertaken by Katie Howard and her coauthors in developing these methods, establishing and validating the relevancy of the data, and developing a system of accurately assigning data to appropriate CFMUs that are now available annually from the SWHS and logbook programs. Similarly, those overseeing and </w:t>
-      </w:r>
-      <w:r>
-        <w:lastRenderedPageBreak/>
-        <w:t xml:space="preserve">running those programs deserve special thanks for the high quality work and products produced including Nick Smith and Jacob Bozzini from the SWHS program and Ben Jevons and Kyla Buster from the Saltwater Guide Logbook program. This project also highlights the high value of the port sampling programs with particular thanks going to </w:t>
+        <w:t xml:space="preserve">Sport harvest reconstructions provided in this document were made possible by the devoted time and effort of many people administering the data collection projects used in these analyses. First and foremost, it needs to be acknowledged that although this report may seem critical of the Howard methods, this effort does not exist without the foundational work undertaken by Katie Howard and her coauthors in developing these methods, establishing and validating the relevancy of the data, and developing a system of accurately assigning data to appropriate CFMUs that are now available annually from the SWHS and logbook programs. Similarly, those overseeing and running those programs deserve special thanks for the high quality work and products produced including Nick Smith and Jacob Bozzini from the SWHS program and Ben Jevons and Kyla Buster from the Saltwater Guide Logbook program. This project also highlights the high value of the port sampling programs with particular thanks going to </w:t>
       </w:r>
       <w:r>
         <w:rPr>
@@ -29317,7 +29706,7 @@
         <w:pStyle w:val="Heading1"/>
       </w:pPr>
       <w:bookmarkStart w:id="60" w:name="literature-cited"/>
-      <w:bookmarkStart w:id="61" w:name="_Toc222293946"/>
+      <w:bookmarkStart w:id="61" w:name="_Toc224741398"/>
       <w:bookmarkEnd w:id="58"/>
       <w:r>
         <w:t>Literature Cited</w:t>
@@ -29401,6 +29790,7 @@
         <w:pStyle w:val="BodyText"/>
       </w:pPr>
       <w:r>
+        <w:lastRenderedPageBreak/>
         <w:t>Hannah, R. W., P. S. Rankin, and M. T. O. Blume. 2012. Use of a novel cage system to measure postrecompression survival of northeast Pacific rockfish. Marine and Coastal Fisheries: Dynamics, Management, and Ecosystem Science, 4:1, 46-56.</w:t>
       </w:r>
     </w:p>
@@ -29425,7 +29815,6 @@
         <w:pStyle w:val="BodyText"/>
       </w:pPr>
       <w:r>
-        <w:lastRenderedPageBreak/>
         <w:t>Hochhalter, S. J., and D. J. Reed. 2011. The effectiveness of deepwater release at improving the survival of discarded yelloweye rockfish. North American Journal of Fisheries Management 31: 852-860.</w:t>
       </w:r>
     </w:p>
@@ -29561,6 +29950,7 @@
         <w:pStyle w:val="BodyText"/>
       </w:pPr>
       <w:r>
+        <w:lastRenderedPageBreak/>
         <w:t>Plummer M, Best N, Cowles K, Vines K 2006. CODA: Convergence Diagnosis and Output Analysis for MCMC, R News, 6:7-11.</w:t>
       </w:r>
     </w:p>
@@ -29585,7 +29975,6 @@
         <w:pStyle w:val="BodyText"/>
       </w:pPr>
       <w:r>
-        <w:lastRenderedPageBreak/>
         <w:t xml:space="preserve">R Core Team (2021). R: A language and environment for statistical computing. R Foundation for Statistical Computing, Vienna, Austria. URL </w:t>
       </w:r>
       <w:hyperlink r:id="rId10">
@@ -31054,7 +31443,7 @@
   <w:abstractNum w:abstractNumId="0" w15:restartNumberingAfterBreak="0">
     <w:nsid w:val="0000A990"/>
     <w:multiLevelType w:val="multilevel"/>
-    <w:tmpl w:val="78F4CEBC"/>
+    <w:tmpl w:val="800E0E80"/>
     <w:lvl w:ilvl="0">
       <w:numFmt w:val="bullet"/>
       <w:lvlText w:val=" "/>
@@ -31131,7 +31520,7 @@
   <w:abstractNum w:abstractNumId="1" w15:restartNumberingAfterBreak="0">
     <w:nsid w:val="00A99421"/>
     <w:multiLevelType w:val="multilevel"/>
-    <w:tmpl w:val="99E427B2"/>
+    <w:tmpl w:val="A9F6F15A"/>
     <w:lvl w:ilvl="0">
       <w:start w:val="1"/>
       <w:numFmt w:val="decimal"/>
@@ -31217,7 +31606,7 @@
   <w:abstractNum w:abstractNumId="2" w15:restartNumberingAfterBreak="0">
     <w:nsid w:val="00A99721"/>
     <w:multiLevelType w:val="multilevel"/>
-    <w:tmpl w:val="05E205B6"/>
+    <w:tmpl w:val="5CF6A146"/>
     <w:lvl w:ilvl="0">
       <w:start w:val="1"/>
       <w:numFmt w:val="lowerLetter"/>
@@ -34089,10 +34478,10 @@
   <w:num w:numId="26" w16cid:durableId="1979919492">
     <w:abstractNumId w:val="10"/>
   </w:num>
-  <w:num w:numId="27" w16cid:durableId="1885680304">
+  <w:num w:numId="27" w16cid:durableId="299847603">
     <w:abstractNumId w:val="0"/>
   </w:num>
-  <w:num w:numId="28" w16cid:durableId="504441860">
+  <w:num w:numId="28" w16cid:durableId="1138378703">
     <w:abstractNumId w:val="1"/>
     <w:lvlOverride w:ilvl="0">
       <w:startOverride w:val="1"/>
@@ -34122,7 +34511,7 @@
       <w:startOverride w:val="1"/>
     </w:lvlOverride>
   </w:num>
-  <w:num w:numId="29" w16cid:durableId="1031371303">
+  <w:num w:numId="29" w16cid:durableId="1148211249">
     <w:abstractNumId w:val="2"/>
     <w:lvlOverride w:ilvl="0">
       <w:startOverride w:val="1"/>

</xml_diff>

<commit_message>
model tuning ... looking good!
</commit_message>
<xml_diff>
--- a/markdown/RFsportmort_Report.docx
+++ b/markdown/RFsportmort_Report.docx
@@ -26,7 +26,7 @@
           <w:sz w:val="24"/>
           <w:szCs w:val="24"/>
         </w:rPr>
-        <w:id w:val="-359506600"/>
+        <w:id w:val="-919640667"/>
         <w:docPartObj>
           <w:docPartGallery w:val="Table of Contents"/>
           <w:docPartUnique/>
@@ -63,7 +63,7 @@
           <w:r>
             <w:fldChar w:fldCharType="separate"/>
           </w:r>
-          <w:hyperlink w:anchor="_Toc224741378" w:history="1">
+          <w:hyperlink w:anchor="_Toc226529639" w:history="1">
             <w:r>
               <w:rPr>
                 <w:rStyle w:val="Hyperlink"/>
@@ -90,7 +90,7 @@
                 <w:noProof/>
                 <w:webHidden/>
               </w:rPr>
-              <w:instrText xml:space="preserve"> PAGEREF _Toc224741378 \h </w:instrText>
+              <w:instrText xml:space="preserve"> PAGEREF _Toc226529639 \h </w:instrText>
             </w:r>
             <w:r>
               <w:rPr>
@@ -134,7 +134,7 @@
               <w14:ligatures w14:val="standardContextual"/>
             </w:rPr>
           </w:pPr>
-          <w:hyperlink w:anchor="_Toc224741379" w:history="1">
+          <w:hyperlink w:anchor="_Toc226529640" w:history="1">
             <w:r>
               <w:rPr>
                 <w:rStyle w:val="Hyperlink"/>
@@ -161,7 +161,7 @@
                 <w:noProof/>
                 <w:webHidden/>
               </w:rPr>
-              <w:instrText xml:space="preserve"> PAGEREF _Toc224741379 \h </w:instrText>
+              <w:instrText xml:space="preserve"> PAGEREF _Toc226529640 \h </w:instrText>
             </w:r>
             <w:r>
               <w:rPr>
@@ -205,7 +205,7 @@
               <w14:ligatures w14:val="standardContextual"/>
             </w:rPr>
           </w:pPr>
-          <w:hyperlink w:anchor="_Toc224741380" w:history="1">
+          <w:hyperlink w:anchor="_Toc226529641" w:history="1">
             <w:r>
               <w:rPr>
                 <w:rStyle w:val="Hyperlink"/>
@@ -232,7 +232,7 @@
                 <w:noProof/>
                 <w:webHidden/>
               </w:rPr>
-              <w:instrText xml:space="preserve"> PAGEREF _Toc224741380 \h </w:instrText>
+              <w:instrText xml:space="preserve"> PAGEREF _Toc226529641 \h </w:instrText>
             </w:r>
             <w:r>
               <w:rPr>
@@ -276,7 +276,7 @@
               <w14:ligatures w14:val="standardContextual"/>
             </w:rPr>
           </w:pPr>
-          <w:hyperlink w:anchor="_Toc224741381" w:history="1">
+          <w:hyperlink w:anchor="_Toc226529642" w:history="1">
             <w:r>
               <w:rPr>
                 <w:rStyle w:val="Hyperlink"/>
@@ -303,7 +303,7 @@
                 <w:noProof/>
                 <w:webHidden/>
               </w:rPr>
-              <w:instrText xml:space="preserve"> PAGEREF _Toc224741381 \h </w:instrText>
+              <w:instrText xml:space="preserve"> PAGEREF _Toc226529642 \h </w:instrText>
             </w:r>
             <w:r>
               <w:rPr>
@@ -347,7 +347,7 @@
               <w14:ligatures w14:val="standardContextual"/>
             </w:rPr>
           </w:pPr>
-          <w:hyperlink w:anchor="_Toc224741382" w:history="1">
+          <w:hyperlink w:anchor="_Toc226529643" w:history="1">
             <w:r>
               <w:rPr>
                 <w:rStyle w:val="Hyperlink"/>
@@ -374,7 +374,7 @@
                 <w:noProof/>
                 <w:webHidden/>
               </w:rPr>
-              <w:instrText xml:space="preserve"> PAGEREF _Toc224741382 \h </w:instrText>
+              <w:instrText xml:space="preserve"> PAGEREF _Toc226529643 \h </w:instrText>
             </w:r>
             <w:r>
               <w:rPr>
@@ -417,7 +417,7 @@
               <w14:ligatures w14:val="standardContextual"/>
             </w:rPr>
           </w:pPr>
-          <w:hyperlink w:anchor="_Toc224741383" w:history="1">
+          <w:hyperlink w:anchor="_Toc226529644" w:history="1">
             <w:r>
               <w:rPr>
                 <w:rStyle w:val="Hyperlink"/>
@@ -444,7 +444,7 @@
                 <w:noProof/>
                 <w:webHidden/>
               </w:rPr>
-              <w:instrText xml:space="preserve"> PAGEREF _Toc224741383 \h </w:instrText>
+              <w:instrText xml:space="preserve"> PAGEREF _Toc226529644 \h </w:instrText>
             </w:r>
             <w:r>
               <w:rPr>
@@ -487,7 +487,7 @@
               <w14:ligatures w14:val="standardContextual"/>
             </w:rPr>
           </w:pPr>
-          <w:hyperlink w:anchor="_Toc224741384" w:history="1">
+          <w:hyperlink w:anchor="_Toc226529645" w:history="1">
             <w:r>
               <w:rPr>
                 <w:rStyle w:val="Hyperlink"/>
@@ -514,7 +514,7 @@
                 <w:noProof/>
                 <w:webHidden/>
               </w:rPr>
-              <w:instrText xml:space="preserve"> PAGEREF _Toc224741384 \h </w:instrText>
+              <w:instrText xml:space="preserve"> PAGEREF _Toc226529645 \h </w:instrText>
             </w:r>
             <w:r>
               <w:rPr>
@@ -557,7 +557,7 @@
               <w14:ligatures w14:val="standardContextual"/>
             </w:rPr>
           </w:pPr>
-          <w:hyperlink w:anchor="_Toc224741385" w:history="1">
+          <w:hyperlink w:anchor="_Toc226529646" w:history="1">
             <w:r>
               <w:rPr>
                 <w:rStyle w:val="Hyperlink"/>
@@ -584,7 +584,7 @@
                 <w:noProof/>
                 <w:webHidden/>
               </w:rPr>
-              <w:instrText xml:space="preserve"> PAGEREF _Toc224741385 \h </w:instrText>
+              <w:instrText xml:space="preserve"> PAGEREF _Toc226529646 \h </w:instrText>
             </w:r>
             <w:r>
               <w:rPr>
@@ -627,7 +627,7 @@
               <w14:ligatures w14:val="standardContextual"/>
             </w:rPr>
           </w:pPr>
-          <w:hyperlink w:anchor="_Toc224741386" w:history="1">
+          <w:hyperlink w:anchor="_Toc226529647" w:history="1">
             <w:r>
               <w:rPr>
                 <w:rStyle w:val="Hyperlink"/>
@@ -654,7 +654,7 @@
                 <w:noProof/>
                 <w:webHidden/>
               </w:rPr>
-              <w:instrText xml:space="preserve"> PAGEREF _Toc224741386 \h </w:instrText>
+              <w:instrText xml:space="preserve"> PAGEREF _Toc226529647 \h </w:instrText>
             </w:r>
             <w:r>
               <w:rPr>
@@ -698,7 +698,7 @@
               <w14:ligatures w14:val="standardContextual"/>
             </w:rPr>
           </w:pPr>
-          <w:hyperlink w:anchor="_Toc224741387" w:history="1">
+          <w:hyperlink w:anchor="_Toc226529648" w:history="1">
             <w:r>
               <w:rPr>
                 <w:rStyle w:val="Hyperlink"/>
@@ -725,7 +725,7 @@
                 <w:noProof/>
                 <w:webHidden/>
               </w:rPr>
-              <w:instrText xml:space="preserve"> PAGEREF _Toc224741387 \h </w:instrText>
+              <w:instrText xml:space="preserve"> PAGEREF _Toc226529648 \h </w:instrText>
             </w:r>
             <w:r>
               <w:rPr>
@@ -768,7 +768,7 @@
               <w14:ligatures w14:val="standardContextual"/>
             </w:rPr>
           </w:pPr>
-          <w:hyperlink w:anchor="_Toc224741388" w:history="1">
+          <w:hyperlink w:anchor="_Toc226529649" w:history="1">
             <w:r>
               <w:rPr>
                 <w:rStyle w:val="Hyperlink"/>
@@ -795,7 +795,7 @@
                 <w:noProof/>
                 <w:webHidden/>
               </w:rPr>
-              <w:instrText xml:space="preserve"> PAGEREF _Toc224741388 \h </w:instrText>
+              <w:instrText xml:space="preserve"> PAGEREF _Toc226529649 \h </w:instrText>
             </w:r>
             <w:r>
               <w:rPr>
@@ -838,7 +838,7 @@
               <w14:ligatures w14:val="standardContextual"/>
             </w:rPr>
           </w:pPr>
-          <w:hyperlink w:anchor="_Toc224741389" w:history="1">
+          <w:hyperlink w:anchor="_Toc226529650" w:history="1">
             <w:r>
               <w:rPr>
                 <w:rStyle w:val="Hyperlink"/>
@@ -865,7 +865,7 @@
                 <w:noProof/>
                 <w:webHidden/>
               </w:rPr>
-              <w:instrText xml:space="preserve"> PAGEREF _Toc224741389 \h </w:instrText>
+              <w:instrText xml:space="preserve"> PAGEREF _Toc226529650 \h </w:instrText>
             </w:r>
             <w:r>
               <w:rPr>
@@ -885,7 +885,7 @@
                 <w:noProof/>
                 <w:webHidden/>
               </w:rPr>
-              <w:t>21</w:t>
+              <w:t>22</w:t>
             </w:r>
             <w:r>
               <w:rPr>
@@ -908,7 +908,7 @@
               <w14:ligatures w14:val="standardContextual"/>
             </w:rPr>
           </w:pPr>
-          <w:hyperlink w:anchor="_Toc224741390" w:history="1">
+          <w:hyperlink w:anchor="_Toc226529651" w:history="1">
             <w:r>
               <w:rPr>
                 <w:rStyle w:val="Hyperlink"/>
@@ -935,7 +935,7 @@
                 <w:noProof/>
                 <w:webHidden/>
               </w:rPr>
-              <w:instrText xml:space="preserve"> PAGEREF _Toc224741390 \h </w:instrText>
+              <w:instrText xml:space="preserve"> PAGEREF _Toc226529651 \h </w:instrText>
             </w:r>
             <w:r>
               <w:rPr>
@@ -978,7 +978,7 @@
               <w14:ligatures w14:val="standardContextual"/>
             </w:rPr>
           </w:pPr>
-          <w:hyperlink w:anchor="_Toc224741391" w:history="1">
+          <w:hyperlink w:anchor="_Toc226529652" w:history="1">
             <w:r>
               <w:rPr>
                 <w:rStyle w:val="Hyperlink"/>
@@ -1005,7 +1005,7 @@
                 <w:noProof/>
                 <w:webHidden/>
               </w:rPr>
-              <w:instrText xml:space="preserve"> PAGEREF _Toc224741391 \h </w:instrText>
+              <w:instrText xml:space="preserve"> PAGEREF _Toc226529652 \h </w:instrText>
             </w:r>
             <w:r>
               <w:rPr>
@@ -1048,7 +1048,7 @@
               <w14:ligatures w14:val="standardContextual"/>
             </w:rPr>
           </w:pPr>
-          <w:hyperlink w:anchor="_Toc224741392" w:history="1">
+          <w:hyperlink w:anchor="_Toc226529653" w:history="1">
             <w:r>
               <w:rPr>
                 <w:rStyle w:val="Hyperlink"/>
@@ -1075,7 +1075,7 @@
                 <w:noProof/>
                 <w:webHidden/>
               </w:rPr>
-              <w:instrText xml:space="preserve"> PAGEREF _Toc224741392 \h </w:instrText>
+              <w:instrText xml:space="preserve"> PAGEREF _Toc226529653 \h </w:instrText>
             </w:r>
             <w:r>
               <w:rPr>
@@ -1118,7 +1118,7 @@
               <w14:ligatures w14:val="standardContextual"/>
             </w:rPr>
           </w:pPr>
-          <w:hyperlink w:anchor="_Toc224741393" w:history="1">
+          <w:hyperlink w:anchor="_Toc226529654" w:history="1">
             <w:r>
               <w:rPr>
                 <w:rStyle w:val="Hyperlink"/>
@@ -1145,7 +1145,7 @@
                 <w:noProof/>
                 <w:webHidden/>
               </w:rPr>
-              <w:instrText xml:space="preserve"> PAGEREF _Toc224741393 \h </w:instrText>
+              <w:instrText xml:space="preserve"> PAGEREF _Toc226529654 \h </w:instrText>
             </w:r>
             <w:r>
               <w:rPr>
@@ -1188,7 +1188,7 @@
               <w14:ligatures w14:val="standardContextual"/>
             </w:rPr>
           </w:pPr>
-          <w:hyperlink w:anchor="_Toc224741394" w:history="1">
+          <w:hyperlink w:anchor="_Toc226529655" w:history="1">
             <w:r>
               <w:rPr>
                 <w:rStyle w:val="Hyperlink"/>
@@ -1215,7 +1215,7 @@
                 <w:noProof/>
                 <w:webHidden/>
               </w:rPr>
-              <w:instrText xml:space="preserve"> PAGEREF _Toc224741394 \h </w:instrText>
+              <w:instrText xml:space="preserve"> PAGEREF _Toc226529655 \h </w:instrText>
             </w:r>
             <w:r>
               <w:rPr>
@@ -1235,7 +1235,7 @@
                 <w:noProof/>
                 <w:webHidden/>
               </w:rPr>
-              <w:t>24</w:t>
+              <w:t>25</w:t>
             </w:r>
             <w:r>
               <w:rPr>
@@ -1259,7 +1259,7 @@
               <w14:ligatures w14:val="standardContextual"/>
             </w:rPr>
           </w:pPr>
-          <w:hyperlink w:anchor="_Toc224741395" w:history="1">
+          <w:hyperlink w:anchor="_Toc226529656" w:history="1">
             <w:r>
               <w:rPr>
                 <w:rStyle w:val="Hyperlink"/>
@@ -1286,7 +1286,7 @@
                 <w:noProof/>
                 <w:webHidden/>
               </w:rPr>
-              <w:instrText xml:space="preserve"> PAGEREF _Toc224741395 \h </w:instrText>
+              <w:instrText xml:space="preserve"> PAGEREF _Toc226529656 \h </w:instrText>
             </w:r>
             <w:r>
               <w:rPr>
@@ -1329,7 +1329,7 @@
               <w14:ligatures w14:val="standardContextual"/>
             </w:rPr>
           </w:pPr>
-          <w:hyperlink w:anchor="_Toc224741396" w:history="1">
+          <w:hyperlink w:anchor="_Toc226529657" w:history="1">
             <w:r>
               <w:rPr>
                 <w:rStyle w:val="Hyperlink"/>
@@ -1356,7 +1356,7 @@
                 <w:noProof/>
                 <w:webHidden/>
               </w:rPr>
-              <w:instrText xml:space="preserve"> PAGEREF _Toc224741396 \h </w:instrText>
+              <w:instrText xml:space="preserve"> PAGEREF _Toc226529657 \h </w:instrText>
             </w:r>
             <w:r>
               <w:rPr>
@@ -1400,7 +1400,7 @@
               <w14:ligatures w14:val="standardContextual"/>
             </w:rPr>
           </w:pPr>
-          <w:hyperlink w:anchor="_Toc224741397" w:history="1">
+          <w:hyperlink w:anchor="_Toc226529658" w:history="1">
             <w:r>
               <w:rPr>
                 <w:rStyle w:val="Hyperlink"/>
@@ -1427,7 +1427,7 @@
                 <w:noProof/>
                 <w:webHidden/>
               </w:rPr>
-              <w:instrText xml:space="preserve"> PAGEREF _Toc224741397 \h </w:instrText>
+              <w:instrText xml:space="preserve"> PAGEREF _Toc226529658 \h </w:instrText>
             </w:r>
             <w:r>
               <w:rPr>
@@ -1471,7 +1471,7 @@
               <w14:ligatures w14:val="standardContextual"/>
             </w:rPr>
           </w:pPr>
-          <w:hyperlink w:anchor="_Toc224741398" w:history="1">
+          <w:hyperlink w:anchor="_Toc226529659" w:history="1">
             <w:r>
               <w:rPr>
                 <w:rStyle w:val="Hyperlink"/>
@@ -1498,7 +1498,7 @@
                 <w:noProof/>
                 <w:webHidden/>
               </w:rPr>
-              <w:instrText xml:space="preserve"> PAGEREF _Toc224741398 \h </w:instrText>
+              <w:instrText xml:space="preserve"> PAGEREF _Toc226529659 \h </w:instrText>
             </w:r>
             <w:r>
               <w:rPr>
@@ -1546,7 +1546,7 @@
         <w:pStyle w:val="Heading1"/>
       </w:pPr>
       <w:bookmarkStart w:id="0" w:name="abstract"/>
-      <w:bookmarkStart w:id="1" w:name="_Toc224741378"/>
+      <w:bookmarkStart w:id="1" w:name="_Toc226529639"/>
       <w:r>
         <w:lastRenderedPageBreak/>
         <w:t>Abstract</w:t>
@@ -1624,7 +1624,7 @@
         <w:pStyle w:val="Heading1"/>
       </w:pPr>
       <w:bookmarkStart w:id="2" w:name="introduction"/>
-      <w:bookmarkStart w:id="3" w:name="_Toc224741379"/>
+      <w:bookmarkStart w:id="3" w:name="_Toc226529640"/>
       <w:bookmarkEnd w:id="0"/>
       <w:r>
         <w:t>Introduction</w:t>
@@ -1740,7 +1740,7 @@
         <w:pStyle w:val="Heading1"/>
       </w:pPr>
       <w:bookmarkStart w:id="4" w:name="objective"/>
-      <w:bookmarkStart w:id="5" w:name="_Toc224741380"/>
+      <w:bookmarkStart w:id="5" w:name="_Toc226529641"/>
       <w:bookmarkEnd w:id="2"/>
       <w:r>
         <w:t>Objective</w:t>
@@ -1983,7 +1983,7 @@
         <w:pStyle w:val="Heading1"/>
       </w:pPr>
       <w:bookmarkStart w:id="6" w:name="study-area"/>
-      <w:bookmarkStart w:id="7" w:name="_Toc224741381"/>
+      <w:bookmarkStart w:id="7" w:name="_Toc226529642"/>
       <w:bookmarkEnd w:id="4"/>
       <w:r>
         <w:lastRenderedPageBreak/>
@@ -2012,7 +2012,7 @@
         <w:pStyle w:val="Heading1"/>
       </w:pPr>
       <w:bookmarkStart w:id="8" w:name="methods"/>
-      <w:bookmarkStart w:id="9" w:name="_Toc224741382"/>
+      <w:bookmarkStart w:id="9" w:name="_Toc226529643"/>
       <w:bookmarkEnd w:id="6"/>
       <w:r>
         <w:t>Methods</w:t>
@@ -2024,7 +2024,7 @@
         <w:pStyle w:val="Heading2"/>
       </w:pPr>
       <w:bookmarkStart w:id="10" w:name="data"/>
-      <w:bookmarkStart w:id="11" w:name="_Toc224741383"/>
+      <w:bookmarkStart w:id="11" w:name="_Toc226529644"/>
       <w:r>
         <w:t>Data</w:t>
       </w:r>
@@ -2544,7 +2544,7 @@
         <w:pStyle w:val="Heading2"/>
       </w:pPr>
       <w:bookmarkStart w:id="19" w:name="process-equations"/>
-      <w:bookmarkStart w:id="20" w:name="_Toc224741384"/>
+      <w:bookmarkStart w:id="20" w:name="_Toc226529645"/>
       <w:bookmarkEnd w:id="10"/>
       <w:bookmarkEnd w:id="18"/>
       <w:r>
@@ -16925,7 +16925,7 @@
         <w:pStyle w:val="Heading2"/>
       </w:pPr>
       <w:bookmarkStart w:id="26" w:name="observation-equations"/>
-      <w:bookmarkStart w:id="27" w:name="_Toc224741385"/>
+      <w:bookmarkStart w:id="27" w:name="_Toc226529646"/>
       <w:bookmarkEnd w:id="19"/>
       <w:bookmarkEnd w:id="25"/>
       <w:r>
@@ -27487,7 +27487,7 @@
         <w:pStyle w:val="Heading2"/>
       </w:pPr>
       <w:bookmarkStart w:id="33" w:name="model-platform-and-diagnostics"/>
-      <w:bookmarkStart w:id="34" w:name="_Toc224741386"/>
+      <w:bookmarkStart w:id="34" w:name="_Toc226529647"/>
       <w:bookmarkEnd w:id="26"/>
       <w:bookmarkEnd w:id="32"/>
       <w:r>
@@ -27624,7 +27624,7 @@
         <w:pStyle w:val="Heading1"/>
       </w:pPr>
       <w:bookmarkStart w:id="35" w:name="results"/>
-      <w:bookmarkStart w:id="36" w:name="_Toc224741387"/>
+      <w:bookmarkStart w:id="36" w:name="_Toc226529648"/>
       <w:bookmarkEnd w:id="8"/>
       <w:bookmarkEnd w:id="33"/>
       <w:r>
@@ -27645,7 +27645,7 @@
         <w:pStyle w:val="BodyText"/>
       </w:pPr>
       <w:r>
-        <w:t xml:space="preserve">The model was 99.76% converged based on </w:t>
+        <w:t xml:space="preserve">The model was 99.82% converged based on </w:t>
       </w:r>
       <m:oMath>
         <m:acc>
@@ -27667,7 +27667,7 @@
         </m:acc>
       </m:oMath>
       <w:r>
-        <w:t xml:space="preserve"> values below 1.1 and 95.21% converged based on </w:t>
+        <w:t xml:space="preserve"> values below 1.1 and 95.44% converged based on </w:t>
       </w:r>
       <m:oMath>
         <m:acc>
@@ -27711,7 +27711,7 @@
         </m:acc>
       </m:oMath>
       <w:r>
-        <w:t xml:space="preserve"> was 1.29.</w:t>
+        <w:t xml:space="preserve"> was 1.27.</w:t>
       </w:r>
     </w:p>
     <w:p>
@@ -27719,7 +27719,7 @@
         <w:pStyle w:val="BodyText"/>
       </w:pPr>
       <w:r>
-        <w:t xml:space="preserve">Of the true parameters in the model, 87 failed to converge to an </w:t>
+        <w:t xml:space="preserve">Of the true parameters in the model, 94 failed to converge to an </w:t>
       </w:r>
       <m:oMath>
         <m:acc>
@@ -27741,7 +27741,7 @@
         </m:acc>
       </m:oMath>
       <w:r>
-        <w:t xml:space="preserve"> of 1.01 but only 3 of those had </w:t>
+        <w:t xml:space="preserve"> of 1.01 but only 4 of those had </w:t>
       </w:r>
       <m:oMath>
         <m:acc>
@@ -27806,7 +27806,15 @@
         <w:t>Describe unconverged beta parameters:</w:t>
       </w:r>
       <w:r>
-        <w:t xml:space="preserve"> Two of the unconverged parameters were </w:t>
+        <w:t xml:space="preserve"> </w:t>
+      </w:r>
+    </w:p>
+    <w:p>
+      <w:pPr>
+        <w:pStyle w:val="BodyText"/>
+      </w:pPr>
+      <w:r>
+        <w:t xml:space="preserve">The other unconverged true parameters was a </w:t>
       </w:r>
       <m:oMath>
         <m:sSub>
@@ -27822,7 +27830,7 @@
               <w:rPr>
                 <w:rFonts w:ascii="Cambria Math" w:hAnsi="Cambria Math"/>
               </w:rPr>
-              <m:t>β</m:t>
+              <m:t>λ</m:t>
             </m:r>
           </m:e>
           <m:sub>
@@ -27830,185 +27838,13 @@
               <w:rPr>
                 <w:rFonts w:ascii="Cambria Math" w:hAnsi="Cambria Math"/>
               </w:rPr>
-              <m:t>pH</m:t>
+              <m:t>a</m:t>
             </m:r>
           </m:sub>
         </m:sSub>
       </m:oMath>
       <w:r>
-        <w:t xml:space="preserve"> parameters. One was the </w:t>
-      </w:r>
-      <m:oMath>
-        <m:sSubSup>
-          <m:sSubSupPr>
-            <m:ctrlPr>
-              <w:rPr>
-                <w:rFonts w:ascii="Cambria Math" w:hAnsi="Cambria Math"/>
-              </w:rPr>
-            </m:ctrlPr>
-          </m:sSubSupPr>
-          <m:e>
-            <m:r>
-              <w:rPr>
-                <w:rFonts w:ascii="Cambria Math" w:hAnsi="Cambria Math"/>
-              </w:rPr>
-              <m:t>σ</m:t>
-            </m:r>
-          </m:e>
-          <m:sub>
-            <m:d>
-              <m:dPr>
-                <m:ctrlPr>
-                  <w:rPr>
-                    <w:rFonts w:ascii="Cambria Math" w:hAnsi="Cambria Math"/>
-                  </w:rPr>
-                </m:ctrlPr>
-              </m:dPr>
-              <m:e>
-                <m:r>
-                  <w:rPr>
-                    <w:rFonts w:ascii="Cambria Math" w:hAnsi="Cambria Math"/>
-                  </w:rPr>
-                  <m:t>pH</m:t>
-                </m:r>
-              </m:e>
-            </m:d>
-            <m:d>
-              <m:dPr>
-                <m:ctrlPr>
-                  <w:rPr>
-                    <w:rFonts w:ascii="Cambria Math" w:hAnsi="Cambria Math"/>
-                  </w:rPr>
-                </m:ctrlPr>
-              </m:dPr>
-              <m:e>
-                <m:r>
-                  <w:rPr>
-                    <w:rFonts w:ascii="Cambria Math" w:hAnsi="Cambria Math"/>
-                  </w:rPr>
-                  <m:t>other</m:t>
-                </m:r>
-              </m:e>
-            </m:d>
-            <m:r>
-              <w:rPr>
-                <w:rFonts w:ascii="Cambria Math" w:hAnsi="Cambria Math"/>
-              </w:rPr>
-              <m:t>Kodiak</m:t>
-            </m:r>
-          </m:sub>
-          <m:sup>
-            <m:r>
-              <w:rPr>
-                <w:rFonts w:ascii="Cambria Math" w:hAnsi="Cambria Math"/>
-              </w:rPr>
-              <m:t>β0</m:t>
-            </m:r>
-          </m:sup>
-        </m:sSubSup>
-      </m:oMath>
-      <w:r>
-        <w:t xml:space="preserve"> parameter that had a spike in an otherwise uniform trace plot while the other unconverged </w:t>
-      </w:r>
-      <m:oMath>
-        <m:sSub>
-          <m:sSubPr>
-            <m:ctrlPr>
-              <w:rPr>
-                <w:rFonts w:ascii="Cambria Math" w:hAnsi="Cambria Math"/>
-              </w:rPr>
-            </m:ctrlPr>
-          </m:sSubPr>
-          <m:e>
-            <m:r>
-              <w:rPr>
-                <w:rFonts w:ascii="Cambria Math" w:hAnsi="Cambria Math"/>
-              </w:rPr>
-              <m:t>β</m:t>
-            </m:r>
-          </m:e>
-          <m:sub>
-            <m:r>
-              <w:rPr>
-                <w:rFonts w:ascii="Cambria Math" w:hAnsi="Cambria Math"/>
-              </w:rPr>
-              <m:t>pH</m:t>
-            </m:r>
-          </m:sub>
-        </m:sSub>
-      </m:oMath>
-      <w:r>
-        <w:t xml:space="preserve"> parameter was </w:t>
-      </w:r>
-      <m:oMath>
-        <m:r>
-          <w:rPr>
-            <w:rFonts w:ascii="Cambria Math" w:hAnsi="Cambria Math"/>
-          </w:rPr>
-          <m:t>β</m:t>
-        </m:r>
-        <m:sSub>
-          <m:sSubPr>
-            <m:ctrlPr>
-              <w:rPr>
-                <w:rFonts w:ascii="Cambria Math" w:hAnsi="Cambria Math"/>
-              </w:rPr>
-            </m:ctrlPr>
-          </m:sSubPr>
-          <m:e>
-            <m:r>
-              <w:rPr>
-                <w:rFonts w:ascii="Cambria Math" w:hAnsi="Cambria Math"/>
-              </w:rPr>
-              <m:t>1</m:t>
-            </m:r>
-          </m:e>
-          <m:sub>
-            <m:d>
-              <m:dPr>
-                <m:ctrlPr>
-                  <w:rPr>
-                    <w:rFonts w:ascii="Cambria Math" w:hAnsi="Cambria Math"/>
-                  </w:rPr>
-                </m:ctrlPr>
-              </m:dPr>
-              <m:e>
-                <m:r>
-                  <w:rPr>
-                    <w:rFonts w:ascii="Cambria Math" w:hAnsi="Cambria Math"/>
-                  </w:rPr>
-                  <m:t>pH</m:t>
-                </m:r>
-              </m:e>
-            </m:d>
-            <m:d>
-              <m:dPr>
-                <m:ctrlPr>
-                  <w:rPr>
-                    <w:rFonts w:ascii="Cambria Math" w:hAnsi="Cambria Math"/>
-                  </w:rPr>
-                </m:ctrlPr>
-              </m:dPr>
-              <m:e>
-                <m:r>
-                  <w:rPr>
-                    <w:rFonts w:ascii="Cambria Math" w:hAnsi="Cambria Math"/>
-                  </w:rPr>
-                  <m:t>pelagic</m:t>
-                </m:r>
-              </m:e>
-            </m:d>
-            <m:r>
-              <w:rPr>
-                <w:rFonts w:ascii="Cambria Math" w:hAnsi="Cambria Math"/>
-              </w:rPr>
-              <m:t>PWSO</m:t>
-            </m:r>
-          </m:sub>
-        </m:sSub>
-      </m:oMath>
-      <w:r>
-        <w:t xml:space="preserve"> which had an </w:t>
+        <w:t xml:space="preserve"> from the spline fit to the harvest trend (Appendix A) that demonstrated a very narrow posterior distribution with occasional spikes in the value, but otherwise demonstrated satisfactory exploration of the posterior parameter space with an </w:t>
       </w:r>
       <m:oMath>
         <m:acc>
@@ -28030,67 +27866,7 @@
         </m:acc>
       </m:oMath>
       <w:r>
-        <w:t xml:space="preserve"> of 1.117.</w:t>
-      </w:r>
-    </w:p>
-    <w:p>
-      <w:pPr>
-        <w:pStyle w:val="BodyText"/>
-      </w:pPr>
-      <w:r>
-        <w:t xml:space="preserve">The other unconverged true parameters was a </w:t>
-      </w:r>
-      <m:oMath>
-        <m:sSub>
-          <m:sSubPr>
-            <m:ctrlPr>
-              <w:rPr>
-                <w:rFonts w:ascii="Cambria Math" w:hAnsi="Cambria Math"/>
-              </w:rPr>
-            </m:ctrlPr>
-          </m:sSubPr>
-          <m:e>
-            <m:r>
-              <w:rPr>
-                <w:rFonts w:ascii="Cambria Math" w:hAnsi="Cambria Math"/>
-              </w:rPr>
-              <m:t>λ</m:t>
-            </m:r>
-          </m:e>
-          <m:sub>
-            <m:r>
-              <w:rPr>
-                <w:rFonts w:ascii="Cambria Math" w:hAnsi="Cambria Math"/>
-              </w:rPr>
-              <m:t>a</m:t>
-            </m:r>
-          </m:sub>
-        </m:sSub>
-      </m:oMath>
-      <w:r>
-        <w:t xml:space="preserve"> from the spline fit to the harvest trend (Appendix A) that demonstrated a very narrow posterior distribution with occasional spikes in the value, but otherwise demonstrated satisfactory exploration of the posterior parameter space with an </w:t>
-      </w:r>
-      <m:oMath>
-        <m:acc>
-          <m:accPr>
-            <m:ctrlPr>
-              <w:rPr>
-                <w:rFonts w:ascii="Cambria Math" w:hAnsi="Cambria Math"/>
-              </w:rPr>
-            </m:ctrlPr>
-          </m:accPr>
-          <m:e>
-            <m:r>
-              <w:rPr>
-                <w:rFonts w:ascii="Cambria Math" w:hAnsi="Cambria Math"/>
-              </w:rPr>
-              <m:t>R</m:t>
-            </m:r>
-          </m:e>
-        </m:acc>
-      </m:oMath>
-      <w:r>
-        <w:t xml:space="preserve"> of 1.109.</w:t>
+        <w:t xml:space="preserve"> of 1.103.</w:t>
       </w:r>
     </w:p>
     <w:p>
@@ -28360,7 +28136,7 @@
         </m:sSub>
       </m:oMath>
       <w:r>
-        <w:t xml:space="preserve"> estimates were generally well converged with 504 demonstrating </w:t>
+        <w:t xml:space="preserve"> estimates were generally well converged with 429 demonstrating </w:t>
       </w:r>
       <m:oMath>
         <m:acc>
@@ -28382,7 +28158,7 @@
         </m:acc>
       </m:oMath>
       <w:r>
-        <w:t xml:space="preserve"> values (3.8%) above 1.01 and 31 (0.23%) demonstrating values above 1.1. Unconverged estimates all demonstrated highly skewed posteriors where the bulk of the posterior distributions were near the lower bound. Of the 31 estimates with </w:t>
+        <w:t xml:space="preserve"> values (3.24%) above 1.01 and 14 (0.11%) demonstrating values above 1.1. Unconverged estimates all demonstrated highly skewed posteriors where the bulk of the posterior distributions were near the lower bound. Of the 14 estimates with </w:t>
       </w:r>
       <m:oMath>
         <m:acc>
@@ -28404,11 +28180,59 @@
         </m:acc>
       </m:oMath>
       <w:r>
-        <w:t xml:space="preserve"> in excess of 1.1, 28 estimates (90%) had medians less </w:t>
-      </w:r>
-      <w:r>
-        <w:lastRenderedPageBreak/>
-        <w:t xml:space="preserve">than 1 and 29 (94%) had medians less than 10. Of the 2 unconverged </w:t>
+        <w:t xml:space="preserve"> in excess of 1.1, 13 estimates (93%) had medians less than 1 and 14 (100%) had medians less than 10.  </w:t>
+      </w:r>
+    </w:p>
+    <w:p>
+      <w:pPr>
+        <w:pStyle w:val="BodyText"/>
+      </w:pPr>
+      <m:oMath>
+        <m:sSub>
+          <m:sSubPr>
+            <m:ctrlPr>
+              <w:rPr>
+                <w:rFonts w:ascii="Cambria Math" w:hAnsi="Cambria Math"/>
+              </w:rPr>
+            </m:ctrlPr>
+          </m:sSubPr>
+          <m:e>
+            <m:r>
+              <w:rPr>
+                <w:rFonts w:ascii="Cambria Math" w:hAnsi="Cambria Math"/>
+              </w:rPr>
+              <m:t>R</m:t>
+            </m:r>
+          </m:e>
+          <m:sub>
+            <m:d>
+              <m:dPr>
+                <m:ctrlPr>
+                  <w:rPr>
+                    <w:rFonts w:ascii="Cambria Math" w:hAnsi="Cambria Math"/>
+                  </w:rPr>
+                </m:ctrlPr>
+              </m:dPr>
+              <m:e>
+                <m:r>
+                  <w:rPr>
+                    <w:rFonts w:ascii="Cambria Math" w:hAnsi="Cambria Math"/>
+                  </w:rPr>
+                  <m:t>comp</m:t>
+                </m:r>
+              </m:e>
+            </m:d>
+            <m:r>
+              <w:rPr>
+                <w:rFonts w:ascii="Cambria Math" w:hAnsi="Cambria Math"/>
+              </w:rPr>
+              <m:t>ayu</m:t>
+            </m:r>
+          </m:sub>
+        </m:sSub>
+      </m:oMath>
+      <w:r>
+        <w:t xml:space="preserve"> estimates were less well converged relative to </w:t>
       </w:r>
       <m:oMath>
         <m:sSub>
@@ -28455,13 +28279,52 @@
         </m:sSub>
       </m:oMath>
       <w:r>
-        <w:t xml:space="preserve"> estimates with medians greater than 10, both were from pre-1999 years when logbook data became available. The highest unconverged harvest estimate had a median and mean value of 12.302 and 16.093, respectively, indicating that these questionable estimates represent negligible harvests from a management perspective.</w:t>
-      </w:r>
-    </w:p>
-    <w:p>
-      <w:pPr>
-        <w:pStyle w:val="BodyText"/>
-      </w:pPr>
+        <w:t xml:space="preserve"> estimates with 1,510 demonstrating </w:t>
+      </w:r>
+      <m:oMath>
+        <m:acc>
+          <m:accPr>
+            <m:ctrlPr>
+              <w:rPr>
+                <w:rFonts w:ascii="Cambria Math" w:hAnsi="Cambria Math"/>
+              </w:rPr>
+            </m:ctrlPr>
+          </m:accPr>
+          <m:e>
+            <m:r>
+              <w:rPr>
+                <w:rFonts w:ascii="Cambria Math" w:hAnsi="Cambria Math"/>
+              </w:rPr>
+              <m:t>R</m:t>
+            </m:r>
+          </m:e>
+        </m:acc>
+      </m:oMath>
+      <w:r>
+        <w:t xml:space="preserve"> values (6.9%) above 1.01 and 121 (0.55%) demonstrating values above 1.1. Unconverged estimates demonstrated highly skewed posteriors where the bulk of the posterior distributions were near the lower bound. Of the 121 estimates with </w:t>
+      </w:r>
+      <m:oMath>
+        <m:acc>
+          <m:accPr>
+            <m:ctrlPr>
+              <w:rPr>
+                <w:rFonts w:ascii="Cambria Math" w:hAnsi="Cambria Math"/>
+              </w:rPr>
+            </m:ctrlPr>
+          </m:accPr>
+          <m:e>
+            <m:r>
+              <w:rPr>
+                <w:rFonts w:ascii="Cambria Math" w:hAnsi="Cambria Math"/>
+              </w:rPr>
+              <m:t>R</m:t>
+            </m:r>
+          </m:e>
+        </m:acc>
+      </m:oMath>
+      <w:r>
+        <w:t xml:space="preserve"> in excess of 1.1, 84 estimates (69%) had medians less than 1, 99 (82%) had medians less than 10, 106 (88%) had medians less than 50, and 115 (95%) had medians less than 100. Of the 6 unconverged </w:t>
+      </w:r>
       <m:oMath>
         <m:sSub>
           <m:sSubPr>
@@ -28507,54 +28370,16 @@
         </m:sSub>
       </m:oMath>
       <w:r>
-        <w:t xml:space="preserve"> estimates were less well converged relative to </w:t>
-      </w:r>
-      <m:oMath>
-        <m:sSub>
-          <m:sSubPr>
-            <m:ctrlPr>
-              <w:rPr>
-                <w:rFonts w:ascii="Cambria Math" w:hAnsi="Cambria Math"/>
-              </w:rPr>
-            </m:ctrlPr>
-          </m:sSubPr>
-          <m:e>
-            <m:r>
-              <w:rPr>
-                <w:rFonts w:ascii="Cambria Math" w:hAnsi="Cambria Math"/>
-              </w:rPr>
-              <m:t>H</m:t>
-            </m:r>
-          </m:e>
-          <m:sub>
-            <m:d>
-              <m:dPr>
-                <m:ctrlPr>
-                  <w:rPr>
-                    <w:rFonts w:ascii="Cambria Math" w:hAnsi="Cambria Math"/>
-                  </w:rPr>
-                </m:ctrlPr>
-              </m:dPr>
-              <m:e>
-                <m:r>
-                  <w:rPr>
-                    <w:rFonts w:ascii="Cambria Math" w:hAnsi="Cambria Math"/>
-                  </w:rPr>
-                  <m:t>comp</m:t>
-                </m:r>
-              </m:e>
-            </m:d>
-            <m:r>
-              <w:rPr>
-                <w:rFonts w:ascii="Cambria Math" w:hAnsi="Cambria Math"/>
-              </w:rPr>
-              <m:t>ayu</m:t>
-            </m:r>
-          </m:sub>
-        </m:sSub>
-      </m:oMath>
-      <w:r>
-        <w:t xml:space="preserve"> estimates with 1,484 demonstrating </w:t>
+        <w:t xml:space="preserve"> estimates with medians greater than 100, 6 were from pre-1999 years when logbook data became available and </w:t>
+      </w:r>
+      <w:r>
+        <w:rPr>
+          <w:color w:val="EE0000"/>
+        </w:rPr>
+        <w:t>all 6 were from before 2011 when the SWHS began tracking private and charter harvests separately</w:t>
+      </w:r>
+      <w:r>
+        <w:t xml:space="preserve">. The </w:t>
       </w:r>
       <m:oMath>
         <m:acc>
@@ -28576,84 +28401,2926 @@
         </m:acc>
       </m:oMath>
       <w:r>
-        <w:t xml:space="preserve"> values (6.78%) above 1.01 and 161 (0.74%) demonstrating values above 1.1. Unconverged estimates demonstrated highly skewed posteriors where the bulk of the posterior distributions were near the lower bound. Of the 161 estimates with </w:t>
-      </w:r>
-      <m:oMath>
-        <m:acc>
-          <m:accPr>
-            <m:ctrlPr>
-              <w:rPr>
-                <w:rFonts w:ascii="Cambria Math" w:hAnsi="Cambria Math"/>
-              </w:rPr>
-            </m:ctrlPr>
-          </m:accPr>
-          <m:e>
-            <m:r>
-              <w:rPr>
-                <w:rFonts w:ascii="Cambria Math" w:hAnsi="Cambria Math"/>
-              </w:rPr>
-              <m:t>R</m:t>
-            </m:r>
-          </m:e>
-        </m:acc>
-      </m:oMath>
-      <w:r>
-        <w:t xml:space="preserve"> in excess of 1.1, 131 estimates (81%) had medians less than 1 and 150 (93%) had medians less than 10. Of the 11 unconverged </w:t>
-      </w:r>
-      <m:oMath>
-        <m:sSub>
-          <m:sSubPr>
-            <m:ctrlPr>
-              <w:rPr>
-                <w:rFonts w:ascii="Cambria Math" w:hAnsi="Cambria Math"/>
-              </w:rPr>
-            </m:ctrlPr>
-          </m:sSubPr>
-          <m:e>
-            <m:r>
-              <w:rPr>
-                <w:rFonts w:ascii="Cambria Math" w:hAnsi="Cambria Math"/>
-              </w:rPr>
-              <m:t>R</m:t>
-            </m:r>
-          </m:e>
-          <m:sub>
-            <m:d>
-              <m:dPr>
-                <m:ctrlPr>
-                  <w:rPr>
-                    <w:rFonts w:ascii="Cambria Math" w:hAnsi="Cambria Math"/>
-                  </w:rPr>
-                </m:ctrlPr>
-              </m:dPr>
-              <m:e>
-                <m:r>
-                  <w:rPr>
-                    <w:rFonts w:ascii="Cambria Math" w:hAnsi="Cambria Math"/>
-                  </w:rPr>
-                  <m:t>comp</m:t>
-                </m:r>
-              </m:e>
-            </m:d>
-            <m:r>
-              <w:rPr>
-                <w:rFonts w:ascii="Cambria Math" w:hAnsi="Cambria Math"/>
-              </w:rPr>
-              <m:t>ayu</m:t>
-            </m:r>
-          </m:sub>
-        </m:sSub>
-      </m:oMath>
-      <w:r>
-        <w:t xml:space="preserve"> estimates with medians greater than 10, 8 were from pre-1999 years when logbook data became available and all 11 were from before 2011 when the SWHS began tracking private and charter harvests separately. The highest unconverged release estimate had a median and mean value of 137.931 and 229.537, respectively, indicating that these questionable estimates concern relatively low numbers of released fish.</w:t>
+        <w:t xml:space="preserve"> values of these 6 release estimates ranged from 1.101 to 1.165 indicating that these estimates would be likely to converge with longer runs (Table UNCONV RELEASE &gt; 100). </w:t>
       </w:r>
     </w:p>
     <w:p>
       <w:pPr>
+        <w:pStyle w:val="BodyText"/>
+      </w:pPr>
+      <w:r>
+        <w:rPr>
+          <w:b/>
+          <w:bCs/>
+        </w:rPr>
+        <w:t>Table Xa.</w:t>
+      </w:r>
+      <w:r>
+        <w:t xml:space="preserve"> Unconverged release estimates with median posteriors that were greater than 100. </w:t>
+      </w:r>
+      <w:r>
+        <w:rPr>
+          <w:b/>
+          <w:bCs/>
+        </w:rPr>
+        <w:t>Remove from document once described!</w:t>
+      </w:r>
+    </w:p>
+    <w:tbl>
+      <w:tblPr>
+        <w:tblW w:w="5000" w:type="pct"/>
+        <w:jc w:val="center"/>
+        <w:tblLook w:val="0420" w:firstRow="1" w:lastRow="0" w:firstColumn="0" w:lastColumn="0" w:noHBand="0" w:noVBand="1"/>
+      </w:tblPr>
+      <w:tblGrid>
+        <w:gridCol w:w="1458"/>
+        <w:gridCol w:w="710"/>
+        <w:gridCol w:w="1416"/>
+        <w:gridCol w:w="778"/>
+        <w:gridCol w:w="969"/>
+        <w:gridCol w:w="1165"/>
+        <w:gridCol w:w="1138"/>
+        <w:gridCol w:w="955"/>
+        <w:gridCol w:w="771"/>
+      </w:tblGrid>
+      <w:tr>
+        <w:trPr>
+          <w:tblHeader/>
+          <w:jc w:val="center"/>
+        </w:trPr>
+        <w:tc>
+          <w:tcPr>
+            <w:tcW w:w="0" w:type="auto"/>
+            <w:tcBorders>
+              <w:top w:val="single" w:sz="12" w:space="0" w:color="666666"/>
+              <w:left w:val="none" w:sz="0" w:space="0" w:color="000000"/>
+              <w:bottom w:val="single" w:sz="12" w:space="0" w:color="666666"/>
+              <w:right w:val="none" w:sz="0" w:space="0" w:color="000000"/>
+            </w:tcBorders>
+            <w:shd w:val="clear" w:color="auto" w:fill="FFFFFF"/>
+            <w:tcMar>
+              <w:top w:w="0" w:type="dxa"/>
+              <w:left w:w="0" w:type="dxa"/>
+              <w:bottom w:w="0" w:type="dxa"/>
+              <w:right w:w="0" w:type="dxa"/>
+            </w:tcMar>
+            <w:vAlign w:val="center"/>
+          </w:tcPr>
+          <w:p>
+            <w:pPr>
+              <w:pBdr>
+                <w:top w:val="none" w:sz="0" w:space="0" w:color="000000"/>
+                <w:left w:val="none" w:sz="0" w:space="0" w:color="000000"/>
+                <w:bottom w:val="none" w:sz="0" w:space="0" w:color="000000"/>
+                <w:right w:val="none" w:sz="0" w:space="0" w:color="000000"/>
+              </w:pBdr>
+              <w:spacing w:before="100" w:after="100"/>
+              <w:ind w:left="100" w:right="100"/>
+              <w:jc w:val="left"/>
+              <w:rPr>
+                <w:color w:val="000000"/>
+                <w:sz w:val="22"/>
+                <w:szCs w:val="22"/>
+              </w:rPr>
+            </w:pPr>
+            <w:r>
+              <w:rPr>
+                <w:color w:val="000000"/>
+                <w:sz w:val="22"/>
+                <w:szCs w:val="22"/>
+              </w:rPr>
+              <w:t>Area</w:t>
+            </w:r>
+          </w:p>
+        </w:tc>
+        <w:tc>
+          <w:tcPr>
+            <w:tcW w:w="0" w:type="auto"/>
+            <w:tcBorders>
+              <w:top w:val="single" w:sz="12" w:space="0" w:color="666666"/>
+              <w:left w:val="none" w:sz="0" w:space="0" w:color="000000"/>
+              <w:bottom w:val="single" w:sz="12" w:space="0" w:color="666666"/>
+              <w:right w:val="none" w:sz="0" w:space="0" w:color="000000"/>
+            </w:tcBorders>
+            <w:shd w:val="clear" w:color="auto" w:fill="FFFFFF"/>
+            <w:tcMar>
+              <w:top w:w="0" w:type="dxa"/>
+              <w:left w:w="0" w:type="dxa"/>
+              <w:bottom w:w="0" w:type="dxa"/>
+              <w:right w:w="0" w:type="dxa"/>
+            </w:tcMar>
+            <w:vAlign w:val="center"/>
+          </w:tcPr>
+          <w:p>
+            <w:pPr>
+              <w:pBdr>
+                <w:top w:val="none" w:sz="0" w:space="0" w:color="000000"/>
+                <w:left w:val="none" w:sz="0" w:space="0" w:color="000000"/>
+                <w:bottom w:val="none" w:sz="0" w:space="0" w:color="000000"/>
+                <w:right w:val="none" w:sz="0" w:space="0" w:color="000000"/>
+              </w:pBdr>
+              <w:spacing w:before="100" w:after="100"/>
+              <w:ind w:left="100" w:right="100"/>
+              <w:jc w:val="left"/>
+              <w:rPr>
+                <w:color w:val="000000"/>
+                <w:sz w:val="22"/>
+                <w:szCs w:val="22"/>
+              </w:rPr>
+            </w:pPr>
+            <w:r>
+              <w:rPr>
+                <w:color w:val="000000"/>
+                <w:sz w:val="22"/>
+                <w:szCs w:val="22"/>
+              </w:rPr>
+              <w:t>Year</w:t>
+            </w:r>
+          </w:p>
+        </w:tc>
+        <w:tc>
+          <w:tcPr>
+            <w:tcW w:w="0" w:type="auto"/>
+            <w:tcBorders>
+              <w:top w:val="single" w:sz="12" w:space="0" w:color="666666"/>
+              <w:left w:val="none" w:sz="0" w:space="0" w:color="000000"/>
+              <w:bottom w:val="single" w:sz="12" w:space="0" w:color="666666"/>
+              <w:right w:val="none" w:sz="0" w:space="0" w:color="000000"/>
+            </w:tcBorders>
+            <w:shd w:val="clear" w:color="auto" w:fill="FFFFFF"/>
+            <w:tcMar>
+              <w:top w:w="0" w:type="dxa"/>
+              <w:left w:w="0" w:type="dxa"/>
+              <w:bottom w:w="0" w:type="dxa"/>
+              <w:right w:w="0" w:type="dxa"/>
+            </w:tcMar>
+            <w:vAlign w:val="center"/>
+          </w:tcPr>
+          <w:p>
+            <w:pPr>
+              <w:pBdr>
+                <w:top w:val="none" w:sz="0" w:space="0" w:color="000000"/>
+                <w:left w:val="none" w:sz="0" w:space="0" w:color="000000"/>
+                <w:bottom w:val="none" w:sz="0" w:space="0" w:color="000000"/>
+                <w:right w:val="none" w:sz="0" w:space="0" w:color="000000"/>
+              </w:pBdr>
+              <w:spacing w:before="100" w:after="100"/>
+              <w:ind w:left="100" w:right="100"/>
+              <w:jc w:val="left"/>
+              <w:rPr>
+                <w:color w:val="000000"/>
+                <w:sz w:val="22"/>
+                <w:szCs w:val="22"/>
+              </w:rPr>
+            </w:pPr>
+            <w:r>
+              <w:rPr>
+                <w:color w:val="000000"/>
+                <w:sz w:val="22"/>
+                <w:szCs w:val="22"/>
+              </w:rPr>
+              <w:t>Release Est.</w:t>
+            </w:r>
+          </w:p>
+        </w:tc>
+        <w:tc>
+          <w:tcPr>
+            <w:tcW w:w="0" w:type="auto"/>
+            <w:tcBorders>
+              <w:top w:val="single" w:sz="12" w:space="0" w:color="666666"/>
+              <w:left w:val="none" w:sz="0" w:space="0" w:color="000000"/>
+              <w:bottom w:val="single" w:sz="12" w:space="0" w:color="666666"/>
+              <w:right w:val="none" w:sz="0" w:space="0" w:color="000000"/>
+            </w:tcBorders>
+            <w:shd w:val="clear" w:color="auto" w:fill="FFFFFF"/>
+            <w:tcMar>
+              <w:top w:w="0" w:type="dxa"/>
+              <w:left w:w="0" w:type="dxa"/>
+              <w:bottom w:w="0" w:type="dxa"/>
+              <w:right w:w="0" w:type="dxa"/>
+            </w:tcMar>
+            <w:vAlign w:val="center"/>
+          </w:tcPr>
+          <w:p>
+            <w:pPr>
+              <w:pBdr>
+                <w:top w:val="none" w:sz="0" w:space="0" w:color="000000"/>
+                <w:left w:val="none" w:sz="0" w:space="0" w:color="000000"/>
+                <w:bottom w:val="none" w:sz="0" w:space="0" w:color="000000"/>
+                <w:right w:val="none" w:sz="0" w:space="0" w:color="000000"/>
+              </w:pBdr>
+              <w:spacing w:before="100" w:after="100"/>
+              <w:ind w:left="100" w:right="100"/>
+              <w:jc w:val="right"/>
+              <w:rPr>
+                <w:color w:val="000000"/>
+                <w:sz w:val="22"/>
+                <w:szCs w:val="22"/>
+              </w:rPr>
+            </w:pPr>
+            <w:r>
+              <w:rPr>
+                <w:color w:val="000000"/>
+                <w:sz w:val="22"/>
+                <w:szCs w:val="22"/>
+              </w:rPr>
+              <w:t>Mean</w:t>
+            </w:r>
+          </w:p>
+        </w:tc>
+        <w:tc>
+          <w:tcPr>
+            <w:tcW w:w="0" w:type="auto"/>
+            <w:tcBorders>
+              <w:top w:val="single" w:sz="12" w:space="0" w:color="666666"/>
+              <w:left w:val="none" w:sz="0" w:space="0" w:color="000000"/>
+              <w:bottom w:val="single" w:sz="12" w:space="0" w:color="666666"/>
+              <w:right w:val="none" w:sz="0" w:space="0" w:color="000000"/>
+            </w:tcBorders>
+            <w:shd w:val="clear" w:color="auto" w:fill="FFFFFF"/>
+            <w:tcMar>
+              <w:top w:w="0" w:type="dxa"/>
+              <w:left w:w="0" w:type="dxa"/>
+              <w:bottom w:w="0" w:type="dxa"/>
+              <w:right w:w="0" w:type="dxa"/>
+            </w:tcMar>
+            <w:vAlign w:val="center"/>
+          </w:tcPr>
+          <w:p>
+            <w:pPr>
+              <w:pBdr>
+                <w:top w:val="none" w:sz="0" w:space="0" w:color="000000"/>
+                <w:left w:val="none" w:sz="0" w:space="0" w:color="000000"/>
+                <w:bottom w:val="none" w:sz="0" w:space="0" w:color="000000"/>
+                <w:right w:val="none" w:sz="0" w:space="0" w:color="000000"/>
+              </w:pBdr>
+              <w:spacing w:before="100" w:after="100"/>
+              <w:ind w:left="100" w:right="100"/>
+              <w:jc w:val="right"/>
+              <w:rPr>
+                <w:color w:val="000000"/>
+                <w:sz w:val="22"/>
+                <w:szCs w:val="22"/>
+              </w:rPr>
+            </w:pPr>
+            <w:r>
+              <w:rPr>
+                <w:color w:val="000000"/>
+                <w:sz w:val="22"/>
+                <w:szCs w:val="22"/>
+              </w:rPr>
+              <w:t>Median</w:t>
+            </w:r>
+          </w:p>
+        </w:tc>
+        <w:tc>
+          <w:tcPr>
+            <w:tcW w:w="0" w:type="auto"/>
+            <w:tcBorders>
+              <w:top w:val="single" w:sz="12" w:space="0" w:color="666666"/>
+              <w:left w:val="none" w:sz="0" w:space="0" w:color="000000"/>
+              <w:bottom w:val="single" w:sz="12" w:space="0" w:color="666666"/>
+              <w:right w:val="none" w:sz="0" w:space="0" w:color="000000"/>
+            </w:tcBorders>
+            <w:shd w:val="clear" w:color="auto" w:fill="FFFFFF"/>
+            <w:tcMar>
+              <w:top w:w="0" w:type="dxa"/>
+              <w:left w:w="0" w:type="dxa"/>
+              <w:bottom w:w="0" w:type="dxa"/>
+              <w:right w:w="0" w:type="dxa"/>
+            </w:tcMar>
+            <w:vAlign w:val="center"/>
+          </w:tcPr>
+          <w:p>
+            <w:pPr>
+              <w:pBdr>
+                <w:top w:val="none" w:sz="0" w:space="0" w:color="000000"/>
+                <w:left w:val="none" w:sz="0" w:space="0" w:color="000000"/>
+                <w:bottom w:val="none" w:sz="0" w:space="0" w:color="000000"/>
+                <w:right w:val="none" w:sz="0" w:space="0" w:color="000000"/>
+              </w:pBdr>
+              <w:spacing w:before="100" w:after="100"/>
+              <w:ind w:left="100" w:right="100"/>
+              <w:jc w:val="right"/>
+              <w:rPr>
+                <w:color w:val="000000"/>
+                <w:sz w:val="22"/>
+                <w:szCs w:val="22"/>
+              </w:rPr>
+            </w:pPr>
+            <w:r>
+              <w:rPr>
+                <w:color w:val="000000"/>
+                <w:sz w:val="22"/>
+                <w:szCs w:val="22"/>
+              </w:rPr>
+              <w:t>Lower CI</w:t>
+            </w:r>
+          </w:p>
+        </w:tc>
+        <w:tc>
+          <w:tcPr>
+            <w:tcW w:w="0" w:type="auto"/>
+            <w:tcBorders>
+              <w:top w:val="single" w:sz="12" w:space="0" w:color="666666"/>
+              <w:left w:val="none" w:sz="0" w:space="0" w:color="000000"/>
+              <w:bottom w:val="single" w:sz="12" w:space="0" w:color="666666"/>
+              <w:right w:val="none" w:sz="0" w:space="0" w:color="000000"/>
+            </w:tcBorders>
+            <w:shd w:val="clear" w:color="auto" w:fill="FFFFFF"/>
+            <w:tcMar>
+              <w:top w:w="0" w:type="dxa"/>
+              <w:left w:w="0" w:type="dxa"/>
+              <w:bottom w:w="0" w:type="dxa"/>
+              <w:right w:w="0" w:type="dxa"/>
+            </w:tcMar>
+            <w:vAlign w:val="center"/>
+          </w:tcPr>
+          <w:p>
+            <w:pPr>
+              <w:pBdr>
+                <w:top w:val="none" w:sz="0" w:space="0" w:color="000000"/>
+                <w:left w:val="none" w:sz="0" w:space="0" w:color="000000"/>
+                <w:bottom w:val="none" w:sz="0" w:space="0" w:color="000000"/>
+                <w:right w:val="none" w:sz="0" w:space="0" w:color="000000"/>
+              </w:pBdr>
+              <w:spacing w:before="100" w:after="100"/>
+              <w:ind w:left="100" w:right="100"/>
+              <w:jc w:val="right"/>
+              <w:rPr>
+                <w:color w:val="000000"/>
+                <w:sz w:val="22"/>
+                <w:szCs w:val="22"/>
+              </w:rPr>
+            </w:pPr>
+            <w:r>
+              <w:rPr>
+                <w:color w:val="000000"/>
+                <w:sz w:val="22"/>
+                <w:szCs w:val="22"/>
+              </w:rPr>
+              <w:t>Upper CI</w:t>
+            </w:r>
+          </w:p>
+        </w:tc>
+        <w:tc>
+          <w:tcPr>
+            <w:tcW w:w="0" w:type="auto"/>
+            <w:tcBorders>
+              <w:top w:val="single" w:sz="12" w:space="0" w:color="666666"/>
+              <w:left w:val="none" w:sz="0" w:space="0" w:color="000000"/>
+              <w:bottom w:val="single" w:sz="12" w:space="0" w:color="666666"/>
+              <w:right w:val="none" w:sz="0" w:space="0" w:color="000000"/>
+            </w:tcBorders>
+            <w:shd w:val="clear" w:color="auto" w:fill="FFFFFF"/>
+            <w:tcMar>
+              <w:top w:w="0" w:type="dxa"/>
+              <w:left w:w="0" w:type="dxa"/>
+              <w:bottom w:w="0" w:type="dxa"/>
+              <w:right w:w="0" w:type="dxa"/>
+            </w:tcMar>
+            <w:vAlign w:val="center"/>
+          </w:tcPr>
+          <w:p>
+            <w:pPr>
+              <w:pBdr>
+                <w:top w:val="none" w:sz="0" w:space="0" w:color="000000"/>
+                <w:left w:val="none" w:sz="0" w:space="0" w:color="000000"/>
+                <w:bottom w:val="none" w:sz="0" w:space="0" w:color="000000"/>
+                <w:right w:val="none" w:sz="0" w:space="0" w:color="000000"/>
+              </w:pBdr>
+              <w:spacing w:before="100" w:after="100"/>
+              <w:ind w:left="100" w:right="100"/>
+              <w:jc w:val="right"/>
+              <w:rPr>
+                <w:color w:val="000000"/>
+                <w:sz w:val="22"/>
+                <w:szCs w:val="22"/>
+              </w:rPr>
+            </w:pPr>
+            <w:r>
+              <w:rPr>
+                <w:color w:val="000000"/>
+                <w:sz w:val="22"/>
+                <w:szCs w:val="22"/>
+              </w:rPr>
+              <w:t>SD</w:t>
+            </w:r>
+          </w:p>
+        </w:tc>
+        <w:tc>
+          <w:tcPr>
+            <w:tcW w:w="0" w:type="auto"/>
+            <w:tcBorders>
+              <w:top w:val="single" w:sz="12" w:space="0" w:color="666666"/>
+              <w:left w:val="none" w:sz="0" w:space="0" w:color="000000"/>
+              <w:bottom w:val="single" w:sz="12" w:space="0" w:color="666666"/>
+              <w:right w:val="none" w:sz="0" w:space="0" w:color="000000"/>
+            </w:tcBorders>
+            <w:shd w:val="clear" w:color="auto" w:fill="FFFFFF"/>
+            <w:tcMar>
+              <w:top w:w="0" w:type="dxa"/>
+              <w:left w:w="0" w:type="dxa"/>
+              <w:bottom w:w="0" w:type="dxa"/>
+              <w:right w:w="0" w:type="dxa"/>
+            </w:tcMar>
+            <w:vAlign w:val="center"/>
+          </w:tcPr>
+          <w:p>
+            <w:pPr>
+              <w:pBdr>
+                <w:top w:val="none" w:sz="0" w:space="0" w:color="000000"/>
+                <w:left w:val="none" w:sz="0" w:space="0" w:color="000000"/>
+                <w:bottom w:val="none" w:sz="0" w:space="0" w:color="000000"/>
+                <w:right w:val="none" w:sz="0" w:space="0" w:color="000000"/>
+              </w:pBdr>
+              <w:spacing w:before="100" w:after="100"/>
+              <w:ind w:left="100" w:right="100"/>
+              <w:jc w:val="right"/>
+              <w:rPr>
+                <w:color w:val="000000"/>
+                <w:sz w:val="22"/>
+                <w:szCs w:val="22"/>
+              </w:rPr>
+            </w:pPr>
+            <w:r>
+              <w:rPr>
+                <w:color w:val="000000"/>
+                <w:sz w:val="22"/>
+                <w:szCs w:val="22"/>
+              </w:rPr>
+              <w:t>Rhat</w:t>
+            </w:r>
+          </w:p>
+        </w:tc>
+      </w:tr>
+      <w:tr>
+        <w:trPr>
+          <w:jc w:val="center"/>
+        </w:trPr>
+        <w:tc>
+          <w:tcPr>
+            <w:tcW w:w="0" w:type="auto"/>
+            <w:tcBorders>
+              <w:top w:val="single" w:sz="12" w:space="0" w:color="666666"/>
+              <w:left w:val="none" w:sz="0" w:space="0" w:color="000000"/>
+              <w:bottom w:val="none" w:sz="0" w:space="0" w:color="000000"/>
+              <w:right w:val="none" w:sz="0" w:space="0" w:color="000000"/>
+            </w:tcBorders>
+            <w:shd w:val="clear" w:color="auto" w:fill="FFFFFF"/>
+            <w:tcMar>
+              <w:top w:w="0" w:type="dxa"/>
+              <w:left w:w="0" w:type="dxa"/>
+              <w:bottom w:w="0" w:type="dxa"/>
+              <w:right w:w="0" w:type="dxa"/>
+            </w:tcMar>
+            <w:vAlign w:val="center"/>
+          </w:tcPr>
+          <w:p>
+            <w:pPr>
+              <w:pBdr>
+                <w:top w:val="none" w:sz="0" w:space="0" w:color="000000"/>
+                <w:left w:val="none" w:sz="0" w:space="0" w:color="000000"/>
+                <w:bottom w:val="none" w:sz="0" w:space="0" w:color="000000"/>
+                <w:right w:val="none" w:sz="0" w:space="0" w:color="000000"/>
+              </w:pBdr>
+              <w:spacing w:before="100" w:after="100"/>
+              <w:ind w:left="100" w:right="100"/>
+              <w:jc w:val="left"/>
+              <w:rPr>
+                <w:color w:val="000000"/>
+                <w:sz w:val="22"/>
+                <w:szCs w:val="22"/>
+              </w:rPr>
+            </w:pPr>
+            <w:r>
+              <w:rPr>
+                <w:color w:val="000000"/>
+                <w:sz w:val="22"/>
+                <w:szCs w:val="22"/>
+              </w:rPr>
+              <w:t>NSEI</w:t>
+            </w:r>
+          </w:p>
+        </w:tc>
+        <w:tc>
+          <w:tcPr>
+            <w:tcW w:w="0" w:type="auto"/>
+            <w:tcBorders>
+              <w:top w:val="single" w:sz="12" w:space="0" w:color="666666"/>
+              <w:left w:val="none" w:sz="0" w:space="0" w:color="000000"/>
+              <w:bottom w:val="none" w:sz="0" w:space="0" w:color="000000"/>
+              <w:right w:val="none" w:sz="0" w:space="0" w:color="000000"/>
+            </w:tcBorders>
+            <w:shd w:val="clear" w:color="auto" w:fill="FFFFFF"/>
+            <w:tcMar>
+              <w:top w:w="0" w:type="dxa"/>
+              <w:left w:w="0" w:type="dxa"/>
+              <w:bottom w:w="0" w:type="dxa"/>
+              <w:right w:w="0" w:type="dxa"/>
+            </w:tcMar>
+            <w:vAlign w:val="center"/>
+          </w:tcPr>
+          <w:p>
+            <w:pPr>
+              <w:pBdr>
+                <w:top w:val="none" w:sz="0" w:space="0" w:color="000000"/>
+                <w:left w:val="none" w:sz="0" w:space="0" w:color="000000"/>
+                <w:bottom w:val="none" w:sz="0" w:space="0" w:color="000000"/>
+                <w:right w:val="none" w:sz="0" w:space="0" w:color="000000"/>
+              </w:pBdr>
+              <w:spacing w:before="100" w:after="100"/>
+              <w:ind w:left="100" w:right="100"/>
+              <w:jc w:val="left"/>
+              <w:rPr>
+                <w:color w:val="000000"/>
+                <w:sz w:val="22"/>
+                <w:szCs w:val="22"/>
+              </w:rPr>
+            </w:pPr>
+            <w:r>
+              <w:rPr>
+                <w:color w:val="000000"/>
+                <w:sz w:val="22"/>
+                <w:szCs w:val="22"/>
+              </w:rPr>
+              <w:t>1988</w:t>
+            </w:r>
+          </w:p>
+        </w:tc>
+        <w:tc>
+          <w:tcPr>
+            <w:tcW w:w="0" w:type="auto"/>
+            <w:tcBorders>
+              <w:top w:val="single" w:sz="12" w:space="0" w:color="666666"/>
+              <w:left w:val="none" w:sz="0" w:space="0" w:color="000000"/>
+              <w:bottom w:val="none" w:sz="0" w:space="0" w:color="000000"/>
+              <w:right w:val="none" w:sz="0" w:space="0" w:color="000000"/>
+            </w:tcBorders>
+            <w:shd w:val="clear" w:color="auto" w:fill="FFFFFF"/>
+            <w:tcMar>
+              <w:top w:w="0" w:type="dxa"/>
+              <w:left w:w="0" w:type="dxa"/>
+              <w:bottom w:w="0" w:type="dxa"/>
+              <w:right w:w="0" w:type="dxa"/>
+            </w:tcMar>
+            <w:vAlign w:val="center"/>
+          </w:tcPr>
+          <w:p>
+            <w:pPr>
+              <w:pBdr>
+                <w:top w:val="none" w:sz="0" w:space="0" w:color="000000"/>
+                <w:left w:val="none" w:sz="0" w:space="0" w:color="000000"/>
+                <w:bottom w:val="none" w:sz="0" w:space="0" w:color="000000"/>
+                <w:right w:val="none" w:sz="0" w:space="0" w:color="000000"/>
+              </w:pBdr>
+              <w:spacing w:before="100" w:after="100"/>
+              <w:ind w:left="100" w:right="100"/>
+              <w:jc w:val="left"/>
+              <w:rPr>
+                <w:color w:val="000000"/>
+                <w:sz w:val="22"/>
+                <w:szCs w:val="22"/>
+              </w:rPr>
+            </w:pPr>
+            <w:r>
+              <w:rPr>
+                <w:color w:val="000000"/>
+                <w:sz w:val="22"/>
+                <w:szCs w:val="22"/>
+              </w:rPr>
+              <w:t>Ry_ayg</w:t>
+            </w:r>
+          </w:p>
+        </w:tc>
+        <w:tc>
+          <w:tcPr>
+            <w:tcW w:w="0" w:type="auto"/>
+            <w:tcBorders>
+              <w:top w:val="single" w:sz="12" w:space="0" w:color="666666"/>
+              <w:left w:val="none" w:sz="0" w:space="0" w:color="000000"/>
+              <w:bottom w:val="none" w:sz="0" w:space="0" w:color="000000"/>
+              <w:right w:val="none" w:sz="0" w:space="0" w:color="000000"/>
+            </w:tcBorders>
+            <w:shd w:val="clear" w:color="auto" w:fill="FFFFFF"/>
+            <w:tcMar>
+              <w:top w:w="0" w:type="dxa"/>
+              <w:left w:w="0" w:type="dxa"/>
+              <w:bottom w:w="0" w:type="dxa"/>
+              <w:right w:w="0" w:type="dxa"/>
+            </w:tcMar>
+            <w:vAlign w:val="center"/>
+          </w:tcPr>
+          <w:p>
+            <w:pPr>
+              <w:pBdr>
+                <w:top w:val="none" w:sz="0" w:space="0" w:color="000000"/>
+                <w:left w:val="none" w:sz="0" w:space="0" w:color="000000"/>
+                <w:bottom w:val="none" w:sz="0" w:space="0" w:color="000000"/>
+                <w:right w:val="none" w:sz="0" w:space="0" w:color="000000"/>
+              </w:pBdr>
+              <w:spacing w:before="100" w:after="100"/>
+              <w:ind w:left="100" w:right="100"/>
+              <w:jc w:val="right"/>
+              <w:rPr>
+                <w:color w:val="000000"/>
+                <w:sz w:val="22"/>
+                <w:szCs w:val="22"/>
+              </w:rPr>
+            </w:pPr>
+            <w:r>
+              <w:rPr>
+                <w:color w:val="000000"/>
+                <w:sz w:val="22"/>
+                <w:szCs w:val="22"/>
+              </w:rPr>
+              <w:t>175</w:t>
+            </w:r>
+          </w:p>
+        </w:tc>
+        <w:tc>
+          <w:tcPr>
+            <w:tcW w:w="0" w:type="auto"/>
+            <w:tcBorders>
+              <w:top w:val="single" w:sz="12" w:space="0" w:color="666666"/>
+              <w:left w:val="none" w:sz="0" w:space="0" w:color="000000"/>
+              <w:bottom w:val="none" w:sz="0" w:space="0" w:color="000000"/>
+              <w:right w:val="none" w:sz="0" w:space="0" w:color="000000"/>
+            </w:tcBorders>
+            <w:shd w:val="clear" w:color="auto" w:fill="FFFFFF"/>
+            <w:tcMar>
+              <w:top w:w="0" w:type="dxa"/>
+              <w:left w:w="0" w:type="dxa"/>
+              <w:bottom w:w="0" w:type="dxa"/>
+              <w:right w:w="0" w:type="dxa"/>
+            </w:tcMar>
+            <w:vAlign w:val="center"/>
+          </w:tcPr>
+          <w:p>
+            <w:pPr>
+              <w:pBdr>
+                <w:top w:val="none" w:sz="0" w:space="0" w:color="000000"/>
+                <w:left w:val="none" w:sz="0" w:space="0" w:color="000000"/>
+                <w:bottom w:val="none" w:sz="0" w:space="0" w:color="000000"/>
+                <w:right w:val="none" w:sz="0" w:space="0" w:color="000000"/>
+              </w:pBdr>
+              <w:spacing w:before="100" w:after="100"/>
+              <w:ind w:left="100" w:right="100"/>
+              <w:jc w:val="right"/>
+              <w:rPr>
+                <w:color w:val="000000"/>
+                <w:sz w:val="22"/>
+                <w:szCs w:val="22"/>
+              </w:rPr>
+            </w:pPr>
+            <w:r>
+              <w:rPr>
+                <w:color w:val="000000"/>
+                <w:sz w:val="22"/>
+                <w:szCs w:val="22"/>
+              </w:rPr>
+              <w:t>107</w:t>
+            </w:r>
+          </w:p>
+        </w:tc>
+        <w:tc>
+          <w:tcPr>
+            <w:tcW w:w="0" w:type="auto"/>
+            <w:tcBorders>
+              <w:top w:val="single" w:sz="12" w:space="0" w:color="666666"/>
+              <w:left w:val="none" w:sz="0" w:space="0" w:color="000000"/>
+              <w:bottom w:val="none" w:sz="0" w:space="0" w:color="000000"/>
+              <w:right w:val="none" w:sz="0" w:space="0" w:color="000000"/>
+            </w:tcBorders>
+            <w:shd w:val="clear" w:color="auto" w:fill="FFFFFF"/>
+            <w:tcMar>
+              <w:top w:w="0" w:type="dxa"/>
+              <w:left w:w="0" w:type="dxa"/>
+              <w:bottom w:w="0" w:type="dxa"/>
+              <w:right w:w="0" w:type="dxa"/>
+            </w:tcMar>
+            <w:vAlign w:val="center"/>
+          </w:tcPr>
+          <w:p>
+            <w:pPr>
+              <w:pBdr>
+                <w:top w:val="none" w:sz="0" w:space="0" w:color="000000"/>
+                <w:left w:val="none" w:sz="0" w:space="0" w:color="000000"/>
+                <w:bottom w:val="none" w:sz="0" w:space="0" w:color="000000"/>
+                <w:right w:val="none" w:sz="0" w:space="0" w:color="000000"/>
+              </w:pBdr>
+              <w:spacing w:before="100" w:after="100"/>
+              <w:ind w:left="100" w:right="100"/>
+              <w:jc w:val="right"/>
+              <w:rPr>
+                <w:color w:val="000000"/>
+                <w:sz w:val="22"/>
+                <w:szCs w:val="22"/>
+              </w:rPr>
+            </w:pPr>
+            <w:r>
+              <w:rPr>
+                <w:color w:val="000000"/>
+                <w:sz w:val="22"/>
+                <w:szCs w:val="22"/>
+              </w:rPr>
+              <w:t>14</w:t>
+            </w:r>
+          </w:p>
+        </w:tc>
+        <w:tc>
+          <w:tcPr>
+            <w:tcW w:w="0" w:type="auto"/>
+            <w:tcBorders>
+              <w:top w:val="single" w:sz="12" w:space="0" w:color="666666"/>
+              <w:left w:val="none" w:sz="0" w:space="0" w:color="000000"/>
+              <w:bottom w:val="none" w:sz="0" w:space="0" w:color="000000"/>
+              <w:right w:val="none" w:sz="0" w:space="0" w:color="000000"/>
+            </w:tcBorders>
+            <w:shd w:val="clear" w:color="auto" w:fill="FFFFFF"/>
+            <w:tcMar>
+              <w:top w:w="0" w:type="dxa"/>
+              <w:left w:w="0" w:type="dxa"/>
+              <w:bottom w:w="0" w:type="dxa"/>
+              <w:right w:w="0" w:type="dxa"/>
+            </w:tcMar>
+            <w:vAlign w:val="center"/>
+          </w:tcPr>
+          <w:p>
+            <w:pPr>
+              <w:pBdr>
+                <w:top w:val="none" w:sz="0" w:space="0" w:color="000000"/>
+                <w:left w:val="none" w:sz="0" w:space="0" w:color="000000"/>
+                <w:bottom w:val="none" w:sz="0" w:space="0" w:color="000000"/>
+                <w:right w:val="none" w:sz="0" w:space="0" w:color="000000"/>
+              </w:pBdr>
+              <w:spacing w:before="100" w:after="100"/>
+              <w:ind w:left="100" w:right="100"/>
+              <w:jc w:val="right"/>
+              <w:rPr>
+                <w:color w:val="000000"/>
+                <w:sz w:val="22"/>
+                <w:szCs w:val="22"/>
+              </w:rPr>
+            </w:pPr>
+            <w:r>
+              <w:rPr>
+                <w:color w:val="000000"/>
+                <w:sz w:val="22"/>
+                <w:szCs w:val="22"/>
+              </w:rPr>
+              <w:t>697</w:t>
+            </w:r>
+          </w:p>
+        </w:tc>
+        <w:tc>
+          <w:tcPr>
+            <w:tcW w:w="0" w:type="auto"/>
+            <w:tcBorders>
+              <w:top w:val="single" w:sz="12" w:space="0" w:color="666666"/>
+              <w:left w:val="none" w:sz="0" w:space="0" w:color="000000"/>
+              <w:bottom w:val="none" w:sz="0" w:space="0" w:color="000000"/>
+              <w:right w:val="none" w:sz="0" w:space="0" w:color="000000"/>
+            </w:tcBorders>
+            <w:shd w:val="clear" w:color="auto" w:fill="FFFFFF"/>
+            <w:tcMar>
+              <w:top w:w="0" w:type="dxa"/>
+              <w:left w:w="0" w:type="dxa"/>
+              <w:bottom w:w="0" w:type="dxa"/>
+              <w:right w:w="0" w:type="dxa"/>
+            </w:tcMar>
+            <w:vAlign w:val="center"/>
+          </w:tcPr>
+          <w:p>
+            <w:pPr>
+              <w:pBdr>
+                <w:top w:val="none" w:sz="0" w:space="0" w:color="000000"/>
+                <w:left w:val="none" w:sz="0" w:space="0" w:color="000000"/>
+                <w:bottom w:val="none" w:sz="0" w:space="0" w:color="000000"/>
+                <w:right w:val="none" w:sz="0" w:space="0" w:color="000000"/>
+              </w:pBdr>
+              <w:spacing w:before="100" w:after="100"/>
+              <w:ind w:left="100" w:right="100"/>
+              <w:jc w:val="right"/>
+              <w:rPr>
+                <w:color w:val="000000"/>
+                <w:sz w:val="22"/>
+                <w:szCs w:val="22"/>
+              </w:rPr>
+            </w:pPr>
+            <w:r>
+              <w:rPr>
+                <w:color w:val="000000"/>
+                <w:sz w:val="22"/>
+                <w:szCs w:val="22"/>
+              </w:rPr>
+              <w:t>278.9</w:t>
+            </w:r>
+          </w:p>
+        </w:tc>
+        <w:tc>
+          <w:tcPr>
+            <w:tcW w:w="0" w:type="auto"/>
+            <w:tcBorders>
+              <w:top w:val="single" w:sz="12" w:space="0" w:color="666666"/>
+              <w:left w:val="none" w:sz="0" w:space="0" w:color="000000"/>
+              <w:bottom w:val="none" w:sz="0" w:space="0" w:color="000000"/>
+              <w:right w:val="none" w:sz="0" w:space="0" w:color="000000"/>
+            </w:tcBorders>
+            <w:shd w:val="clear" w:color="auto" w:fill="FFFFFF"/>
+            <w:tcMar>
+              <w:top w:w="0" w:type="dxa"/>
+              <w:left w:w="0" w:type="dxa"/>
+              <w:bottom w:w="0" w:type="dxa"/>
+              <w:right w:w="0" w:type="dxa"/>
+            </w:tcMar>
+            <w:vAlign w:val="center"/>
+          </w:tcPr>
+          <w:p>
+            <w:pPr>
+              <w:pBdr>
+                <w:top w:val="none" w:sz="0" w:space="0" w:color="000000"/>
+                <w:left w:val="none" w:sz="0" w:space="0" w:color="000000"/>
+                <w:bottom w:val="none" w:sz="0" w:space="0" w:color="000000"/>
+                <w:right w:val="none" w:sz="0" w:space="0" w:color="000000"/>
+              </w:pBdr>
+              <w:spacing w:before="100" w:after="100"/>
+              <w:ind w:left="100" w:right="100"/>
+              <w:jc w:val="right"/>
+              <w:rPr>
+                <w:color w:val="000000"/>
+                <w:sz w:val="22"/>
+                <w:szCs w:val="22"/>
+              </w:rPr>
+            </w:pPr>
+            <w:r>
+              <w:rPr>
+                <w:color w:val="000000"/>
+                <w:sz w:val="22"/>
+                <w:szCs w:val="22"/>
+              </w:rPr>
+              <w:t>1.108</w:t>
+            </w:r>
+          </w:p>
+        </w:tc>
+      </w:tr>
+      <w:tr>
+        <w:trPr>
+          <w:jc w:val="center"/>
+        </w:trPr>
+        <w:tc>
+          <w:tcPr>
+            <w:tcW w:w="0" w:type="auto"/>
+            <w:tcBorders>
+              <w:top w:val="none" w:sz="0" w:space="0" w:color="000000"/>
+              <w:left w:val="none" w:sz="0" w:space="0" w:color="000000"/>
+              <w:bottom w:val="none" w:sz="0" w:space="0" w:color="000000"/>
+              <w:right w:val="none" w:sz="0" w:space="0" w:color="000000"/>
+            </w:tcBorders>
+            <w:shd w:val="clear" w:color="auto" w:fill="FFFFFF"/>
+            <w:tcMar>
+              <w:top w:w="0" w:type="dxa"/>
+              <w:left w:w="0" w:type="dxa"/>
+              <w:bottom w:w="0" w:type="dxa"/>
+              <w:right w:w="0" w:type="dxa"/>
+            </w:tcMar>
+            <w:vAlign w:val="center"/>
+          </w:tcPr>
+          <w:p>
+            <w:pPr>
+              <w:pBdr>
+                <w:top w:val="none" w:sz="0" w:space="0" w:color="000000"/>
+                <w:left w:val="none" w:sz="0" w:space="0" w:color="000000"/>
+                <w:bottom w:val="none" w:sz="0" w:space="0" w:color="000000"/>
+                <w:right w:val="none" w:sz="0" w:space="0" w:color="000000"/>
+              </w:pBdr>
+              <w:spacing w:before="100" w:after="100"/>
+              <w:ind w:left="100" w:right="100"/>
+              <w:jc w:val="left"/>
+              <w:rPr>
+                <w:color w:val="000000"/>
+                <w:sz w:val="22"/>
+                <w:szCs w:val="22"/>
+              </w:rPr>
+            </w:pPr>
+            <w:r>
+              <w:rPr>
+                <w:color w:val="000000"/>
+                <w:sz w:val="22"/>
+                <w:szCs w:val="22"/>
+              </w:rPr>
+              <w:t>SSEI</w:t>
+            </w:r>
+          </w:p>
+        </w:tc>
+        <w:tc>
+          <w:tcPr>
+            <w:tcW w:w="0" w:type="auto"/>
+            <w:tcBorders>
+              <w:top w:val="none" w:sz="0" w:space="0" w:color="000000"/>
+              <w:left w:val="none" w:sz="0" w:space="0" w:color="000000"/>
+              <w:bottom w:val="none" w:sz="0" w:space="0" w:color="000000"/>
+              <w:right w:val="none" w:sz="0" w:space="0" w:color="000000"/>
+            </w:tcBorders>
+            <w:shd w:val="clear" w:color="auto" w:fill="FFFFFF"/>
+            <w:tcMar>
+              <w:top w:w="0" w:type="dxa"/>
+              <w:left w:w="0" w:type="dxa"/>
+              <w:bottom w:w="0" w:type="dxa"/>
+              <w:right w:w="0" w:type="dxa"/>
+            </w:tcMar>
+            <w:vAlign w:val="center"/>
+          </w:tcPr>
+          <w:p>
+            <w:pPr>
+              <w:pBdr>
+                <w:top w:val="none" w:sz="0" w:space="0" w:color="000000"/>
+                <w:left w:val="none" w:sz="0" w:space="0" w:color="000000"/>
+                <w:bottom w:val="none" w:sz="0" w:space="0" w:color="000000"/>
+                <w:right w:val="none" w:sz="0" w:space="0" w:color="000000"/>
+              </w:pBdr>
+              <w:spacing w:before="100" w:after="100"/>
+              <w:ind w:left="100" w:right="100"/>
+              <w:jc w:val="left"/>
+              <w:rPr>
+                <w:color w:val="000000"/>
+                <w:sz w:val="22"/>
+                <w:szCs w:val="22"/>
+              </w:rPr>
+            </w:pPr>
+            <w:r>
+              <w:rPr>
+                <w:color w:val="000000"/>
+                <w:sz w:val="22"/>
+                <w:szCs w:val="22"/>
+              </w:rPr>
+              <w:t>1983</w:t>
+            </w:r>
+          </w:p>
+        </w:tc>
+        <w:tc>
+          <w:tcPr>
+            <w:tcW w:w="0" w:type="auto"/>
+            <w:tcBorders>
+              <w:top w:val="none" w:sz="0" w:space="0" w:color="000000"/>
+              <w:left w:val="none" w:sz="0" w:space="0" w:color="000000"/>
+              <w:bottom w:val="none" w:sz="0" w:space="0" w:color="000000"/>
+              <w:right w:val="none" w:sz="0" w:space="0" w:color="000000"/>
+            </w:tcBorders>
+            <w:shd w:val="clear" w:color="auto" w:fill="FFFFFF"/>
+            <w:tcMar>
+              <w:top w:w="0" w:type="dxa"/>
+              <w:left w:w="0" w:type="dxa"/>
+              <w:bottom w:w="0" w:type="dxa"/>
+              <w:right w:w="0" w:type="dxa"/>
+            </w:tcMar>
+            <w:vAlign w:val="center"/>
+          </w:tcPr>
+          <w:p>
+            <w:pPr>
+              <w:pBdr>
+                <w:top w:val="none" w:sz="0" w:space="0" w:color="000000"/>
+                <w:left w:val="none" w:sz="0" w:space="0" w:color="000000"/>
+                <w:bottom w:val="none" w:sz="0" w:space="0" w:color="000000"/>
+                <w:right w:val="none" w:sz="0" w:space="0" w:color="000000"/>
+              </w:pBdr>
+              <w:spacing w:before="100" w:after="100"/>
+              <w:ind w:left="100" w:right="100"/>
+              <w:jc w:val="left"/>
+              <w:rPr>
+                <w:color w:val="000000"/>
+                <w:sz w:val="22"/>
+                <w:szCs w:val="22"/>
+              </w:rPr>
+            </w:pPr>
+            <w:r>
+              <w:rPr>
+                <w:color w:val="000000"/>
+                <w:sz w:val="22"/>
+                <w:szCs w:val="22"/>
+              </w:rPr>
+              <w:t>Ro_ayg</w:t>
+            </w:r>
+          </w:p>
+        </w:tc>
+        <w:tc>
+          <w:tcPr>
+            <w:tcW w:w="0" w:type="auto"/>
+            <w:tcBorders>
+              <w:top w:val="none" w:sz="0" w:space="0" w:color="000000"/>
+              <w:left w:val="none" w:sz="0" w:space="0" w:color="000000"/>
+              <w:bottom w:val="none" w:sz="0" w:space="0" w:color="000000"/>
+              <w:right w:val="none" w:sz="0" w:space="0" w:color="000000"/>
+            </w:tcBorders>
+            <w:shd w:val="clear" w:color="auto" w:fill="FFFFFF"/>
+            <w:tcMar>
+              <w:top w:w="0" w:type="dxa"/>
+              <w:left w:w="0" w:type="dxa"/>
+              <w:bottom w:w="0" w:type="dxa"/>
+              <w:right w:w="0" w:type="dxa"/>
+            </w:tcMar>
+            <w:vAlign w:val="center"/>
+          </w:tcPr>
+          <w:p>
+            <w:pPr>
+              <w:pBdr>
+                <w:top w:val="none" w:sz="0" w:space="0" w:color="000000"/>
+                <w:left w:val="none" w:sz="0" w:space="0" w:color="000000"/>
+                <w:bottom w:val="none" w:sz="0" w:space="0" w:color="000000"/>
+                <w:right w:val="none" w:sz="0" w:space="0" w:color="000000"/>
+              </w:pBdr>
+              <w:spacing w:before="100" w:after="100"/>
+              <w:ind w:left="100" w:right="100"/>
+              <w:jc w:val="right"/>
+              <w:rPr>
+                <w:color w:val="000000"/>
+                <w:sz w:val="22"/>
+                <w:szCs w:val="22"/>
+              </w:rPr>
+            </w:pPr>
+            <w:r>
+              <w:rPr>
+                <w:color w:val="000000"/>
+                <w:sz w:val="22"/>
+                <w:szCs w:val="22"/>
+              </w:rPr>
+              <w:t>1,198</w:t>
+            </w:r>
+          </w:p>
+        </w:tc>
+        <w:tc>
+          <w:tcPr>
+            <w:tcW w:w="0" w:type="auto"/>
+            <w:tcBorders>
+              <w:top w:val="none" w:sz="0" w:space="0" w:color="000000"/>
+              <w:left w:val="none" w:sz="0" w:space="0" w:color="000000"/>
+              <w:bottom w:val="none" w:sz="0" w:space="0" w:color="000000"/>
+              <w:right w:val="none" w:sz="0" w:space="0" w:color="000000"/>
+            </w:tcBorders>
+            <w:shd w:val="clear" w:color="auto" w:fill="FFFFFF"/>
+            <w:tcMar>
+              <w:top w:w="0" w:type="dxa"/>
+              <w:left w:w="0" w:type="dxa"/>
+              <w:bottom w:w="0" w:type="dxa"/>
+              <w:right w:w="0" w:type="dxa"/>
+            </w:tcMar>
+            <w:vAlign w:val="center"/>
+          </w:tcPr>
+          <w:p>
+            <w:pPr>
+              <w:pBdr>
+                <w:top w:val="none" w:sz="0" w:space="0" w:color="000000"/>
+                <w:left w:val="none" w:sz="0" w:space="0" w:color="000000"/>
+                <w:bottom w:val="none" w:sz="0" w:space="0" w:color="000000"/>
+                <w:right w:val="none" w:sz="0" w:space="0" w:color="000000"/>
+              </w:pBdr>
+              <w:spacing w:before="100" w:after="100"/>
+              <w:ind w:left="100" w:right="100"/>
+              <w:jc w:val="right"/>
+              <w:rPr>
+                <w:color w:val="000000"/>
+                <w:sz w:val="22"/>
+                <w:szCs w:val="22"/>
+              </w:rPr>
+            </w:pPr>
+            <w:r>
+              <w:rPr>
+                <w:color w:val="000000"/>
+                <w:sz w:val="22"/>
+                <w:szCs w:val="22"/>
+              </w:rPr>
+              <w:t>753</w:t>
+            </w:r>
+          </w:p>
+        </w:tc>
+        <w:tc>
+          <w:tcPr>
+            <w:tcW w:w="0" w:type="auto"/>
+            <w:tcBorders>
+              <w:top w:val="none" w:sz="0" w:space="0" w:color="000000"/>
+              <w:left w:val="none" w:sz="0" w:space="0" w:color="000000"/>
+              <w:bottom w:val="none" w:sz="0" w:space="0" w:color="000000"/>
+              <w:right w:val="none" w:sz="0" w:space="0" w:color="000000"/>
+            </w:tcBorders>
+            <w:shd w:val="clear" w:color="auto" w:fill="FFFFFF"/>
+            <w:tcMar>
+              <w:top w:w="0" w:type="dxa"/>
+              <w:left w:w="0" w:type="dxa"/>
+              <w:bottom w:w="0" w:type="dxa"/>
+              <w:right w:w="0" w:type="dxa"/>
+            </w:tcMar>
+            <w:vAlign w:val="center"/>
+          </w:tcPr>
+          <w:p>
+            <w:pPr>
+              <w:pBdr>
+                <w:top w:val="none" w:sz="0" w:space="0" w:color="000000"/>
+                <w:left w:val="none" w:sz="0" w:space="0" w:color="000000"/>
+                <w:bottom w:val="none" w:sz="0" w:space="0" w:color="000000"/>
+                <w:right w:val="none" w:sz="0" w:space="0" w:color="000000"/>
+              </w:pBdr>
+              <w:spacing w:before="100" w:after="100"/>
+              <w:ind w:left="100" w:right="100"/>
+              <w:jc w:val="right"/>
+              <w:rPr>
+                <w:color w:val="000000"/>
+                <w:sz w:val="22"/>
+                <w:szCs w:val="22"/>
+              </w:rPr>
+            </w:pPr>
+            <w:r>
+              <w:rPr>
+                <w:color w:val="000000"/>
+                <w:sz w:val="22"/>
+                <w:szCs w:val="22"/>
+              </w:rPr>
+              <w:t>123</w:t>
+            </w:r>
+          </w:p>
+        </w:tc>
+        <w:tc>
+          <w:tcPr>
+            <w:tcW w:w="0" w:type="auto"/>
+            <w:tcBorders>
+              <w:top w:val="none" w:sz="0" w:space="0" w:color="000000"/>
+              <w:left w:val="none" w:sz="0" w:space="0" w:color="000000"/>
+              <w:bottom w:val="none" w:sz="0" w:space="0" w:color="000000"/>
+              <w:right w:val="none" w:sz="0" w:space="0" w:color="000000"/>
+            </w:tcBorders>
+            <w:shd w:val="clear" w:color="auto" w:fill="FFFFFF"/>
+            <w:tcMar>
+              <w:top w:w="0" w:type="dxa"/>
+              <w:left w:w="0" w:type="dxa"/>
+              <w:bottom w:w="0" w:type="dxa"/>
+              <w:right w:w="0" w:type="dxa"/>
+            </w:tcMar>
+            <w:vAlign w:val="center"/>
+          </w:tcPr>
+          <w:p>
+            <w:pPr>
+              <w:pBdr>
+                <w:top w:val="none" w:sz="0" w:space="0" w:color="000000"/>
+                <w:left w:val="none" w:sz="0" w:space="0" w:color="000000"/>
+                <w:bottom w:val="none" w:sz="0" w:space="0" w:color="000000"/>
+                <w:right w:val="none" w:sz="0" w:space="0" w:color="000000"/>
+              </w:pBdr>
+              <w:spacing w:before="100" w:after="100"/>
+              <w:ind w:left="100" w:right="100"/>
+              <w:jc w:val="right"/>
+              <w:rPr>
+                <w:color w:val="000000"/>
+                <w:sz w:val="22"/>
+                <w:szCs w:val="22"/>
+              </w:rPr>
+            </w:pPr>
+            <w:r>
+              <w:rPr>
+                <w:color w:val="000000"/>
+                <w:sz w:val="22"/>
+                <w:szCs w:val="22"/>
+              </w:rPr>
+              <w:t>4,916</w:t>
+            </w:r>
+          </w:p>
+        </w:tc>
+        <w:tc>
+          <w:tcPr>
+            <w:tcW w:w="0" w:type="auto"/>
+            <w:tcBorders>
+              <w:top w:val="none" w:sz="0" w:space="0" w:color="000000"/>
+              <w:left w:val="none" w:sz="0" w:space="0" w:color="000000"/>
+              <w:bottom w:val="none" w:sz="0" w:space="0" w:color="000000"/>
+              <w:right w:val="none" w:sz="0" w:space="0" w:color="000000"/>
+            </w:tcBorders>
+            <w:shd w:val="clear" w:color="auto" w:fill="FFFFFF"/>
+            <w:tcMar>
+              <w:top w:w="0" w:type="dxa"/>
+              <w:left w:w="0" w:type="dxa"/>
+              <w:bottom w:w="0" w:type="dxa"/>
+              <w:right w:w="0" w:type="dxa"/>
+            </w:tcMar>
+            <w:vAlign w:val="center"/>
+          </w:tcPr>
+          <w:p>
+            <w:pPr>
+              <w:pBdr>
+                <w:top w:val="none" w:sz="0" w:space="0" w:color="000000"/>
+                <w:left w:val="none" w:sz="0" w:space="0" w:color="000000"/>
+                <w:bottom w:val="none" w:sz="0" w:space="0" w:color="000000"/>
+                <w:right w:val="none" w:sz="0" w:space="0" w:color="000000"/>
+              </w:pBdr>
+              <w:spacing w:before="100" w:after="100"/>
+              <w:ind w:left="100" w:right="100"/>
+              <w:jc w:val="right"/>
+              <w:rPr>
+                <w:color w:val="000000"/>
+                <w:sz w:val="22"/>
+                <w:szCs w:val="22"/>
+              </w:rPr>
+            </w:pPr>
+            <w:r>
+              <w:rPr>
+                <w:color w:val="000000"/>
+                <w:sz w:val="22"/>
+                <w:szCs w:val="22"/>
+              </w:rPr>
+              <w:t>2,135.5</w:t>
+            </w:r>
+          </w:p>
+        </w:tc>
+        <w:tc>
+          <w:tcPr>
+            <w:tcW w:w="0" w:type="auto"/>
+            <w:tcBorders>
+              <w:top w:val="none" w:sz="0" w:space="0" w:color="000000"/>
+              <w:left w:val="none" w:sz="0" w:space="0" w:color="000000"/>
+              <w:bottom w:val="none" w:sz="0" w:space="0" w:color="000000"/>
+              <w:right w:val="none" w:sz="0" w:space="0" w:color="000000"/>
+            </w:tcBorders>
+            <w:shd w:val="clear" w:color="auto" w:fill="FFFFFF"/>
+            <w:tcMar>
+              <w:top w:w="0" w:type="dxa"/>
+              <w:left w:w="0" w:type="dxa"/>
+              <w:bottom w:w="0" w:type="dxa"/>
+              <w:right w:w="0" w:type="dxa"/>
+            </w:tcMar>
+            <w:vAlign w:val="center"/>
+          </w:tcPr>
+          <w:p>
+            <w:pPr>
+              <w:pBdr>
+                <w:top w:val="none" w:sz="0" w:space="0" w:color="000000"/>
+                <w:left w:val="none" w:sz="0" w:space="0" w:color="000000"/>
+                <w:bottom w:val="none" w:sz="0" w:space="0" w:color="000000"/>
+                <w:right w:val="none" w:sz="0" w:space="0" w:color="000000"/>
+              </w:pBdr>
+              <w:spacing w:before="100" w:after="100"/>
+              <w:ind w:left="100" w:right="100"/>
+              <w:jc w:val="right"/>
+              <w:rPr>
+                <w:color w:val="000000"/>
+                <w:sz w:val="22"/>
+                <w:szCs w:val="22"/>
+              </w:rPr>
+            </w:pPr>
+            <w:r>
+              <w:rPr>
+                <w:color w:val="000000"/>
+                <w:sz w:val="22"/>
+                <w:szCs w:val="22"/>
+              </w:rPr>
+              <w:t>1.139</w:t>
+            </w:r>
+          </w:p>
+        </w:tc>
+      </w:tr>
+      <w:tr>
+        <w:trPr>
+          <w:jc w:val="center"/>
+        </w:trPr>
+        <w:tc>
+          <w:tcPr>
+            <w:tcW w:w="0" w:type="auto"/>
+            <w:tcBorders>
+              <w:top w:val="none" w:sz="0" w:space="0" w:color="000000"/>
+              <w:left w:val="none" w:sz="0" w:space="0" w:color="000000"/>
+              <w:bottom w:val="none" w:sz="0" w:space="0" w:color="000000"/>
+              <w:right w:val="none" w:sz="0" w:space="0" w:color="000000"/>
+            </w:tcBorders>
+            <w:shd w:val="clear" w:color="auto" w:fill="FFFFFF"/>
+            <w:tcMar>
+              <w:top w:w="0" w:type="dxa"/>
+              <w:left w:w="0" w:type="dxa"/>
+              <w:bottom w:w="0" w:type="dxa"/>
+              <w:right w:w="0" w:type="dxa"/>
+            </w:tcMar>
+            <w:vAlign w:val="center"/>
+          </w:tcPr>
+          <w:p>
+            <w:pPr>
+              <w:pBdr>
+                <w:top w:val="none" w:sz="0" w:space="0" w:color="000000"/>
+                <w:left w:val="none" w:sz="0" w:space="0" w:color="000000"/>
+                <w:bottom w:val="none" w:sz="0" w:space="0" w:color="000000"/>
+                <w:right w:val="none" w:sz="0" w:space="0" w:color="000000"/>
+              </w:pBdr>
+              <w:spacing w:before="100" w:after="100"/>
+              <w:ind w:left="100" w:right="100"/>
+              <w:jc w:val="left"/>
+              <w:rPr>
+                <w:color w:val="000000"/>
+                <w:sz w:val="22"/>
+                <w:szCs w:val="22"/>
+              </w:rPr>
+            </w:pPr>
+            <w:r>
+              <w:rPr>
+                <w:color w:val="000000"/>
+                <w:sz w:val="22"/>
+                <w:szCs w:val="22"/>
+              </w:rPr>
+              <w:t>SSEI</w:t>
+            </w:r>
+          </w:p>
+        </w:tc>
+        <w:tc>
+          <w:tcPr>
+            <w:tcW w:w="0" w:type="auto"/>
+            <w:tcBorders>
+              <w:top w:val="none" w:sz="0" w:space="0" w:color="000000"/>
+              <w:left w:val="none" w:sz="0" w:space="0" w:color="000000"/>
+              <w:bottom w:val="none" w:sz="0" w:space="0" w:color="000000"/>
+              <w:right w:val="none" w:sz="0" w:space="0" w:color="000000"/>
+            </w:tcBorders>
+            <w:shd w:val="clear" w:color="auto" w:fill="FFFFFF"/>
+            <w:tcMar>
+              <w:top w:w="0" w:type="dxa"/>
+              <w:left w:w="0" w:type="dxa"/>
+              <w:bottom w:w="0" w:type="dxa"/>
+              <w:right w:w="0" w:type="dxa"/>
+            </w:tcMar>
+            <w:vAlign w:val="center"/>
+          </w:tcPr>
+          <w:p>
+            <w:pPr>
+              <w:pBdr>
+                <w:top w:val="none" w:sz="0" w:space="0" w:color="000000"/>
+                <w:left w:val="none" w:sz="0" w:space="0" w:color="000000"/>
+                <w:bottom w:val="none" w:sz="0" w:space="0" w:color="000000"/>
+                <w:right w:val="none" w:sz="0" w:space="0" w:color="000000"/>
+              </w:pBdr>
+              <w:spacing w:before="100" w:after="100"/>
+              <w:ind w:left="100" w:right="100"/>
+              <w:jc w:val="left"/>
+              <w:rPr>
+                <w:color w:val="000000"/>
+                <w:sz w:val="22"/>
+                <w:szCs w:val="22"/>
+              </w:rPr>
+            </w:pPr>
+            <w:r>
+              <w:rPr>
+                <w:color w:val="000000"/>
+                <w:sz w:val="22"/>
+                <w:szCs w:val="22"/>
+              </w:rPr>
+              <w:t>1983</w:t>
+            </w:r>
+          </w:p>
+        </w:tc>
+        <w:tc>
+          <w:tcPr>
+            <w:tcW w:w="0" w:type="auto"/>
+            <w:tcBorders>
+              <w:top w:val="none" w:sz="0" w:space="0" w:color="000000"/>
+              <w:left w:val="none" w:sz="0" w:space="0" w:color="000000"/>
+              <w:bottom w:val="none" w:sz="0" w:space="0" w:color="000000"/>
+              <w:right w:val="none" w:sz="0" w:space="0" w:color="000000"/>
+            </w:tcBorders>
+            <w:shd w:val="clear" w:color="auto" w:fill="FFFFFF"/>
+            <w:tcMar>
+              <w:top w:w="0" w:type="dxa"/>
+              <w:left w:w="0" w:type="dxa"/>
+              <w:bottom w:w="0" w:type="dxa"/>
+              <w:right w:w="0" w:type="dxa"/>
+            </w:tcMar>
+            <w:vAlign w:val="center"/>
+          </w:tcPr>
+          <w:p>
+            <w:pPr>
+              <w:pBdr>
+                <w:top w:val="none" w:sz="0" w:space="0" w:color="000000"/>
+                <w:left w:val="none" w:sz="0" w:space="0" w:color="000000"/>
+                <w:bottom w:val="none" w:sz="0" w:space="0" w:color="000000"/>
+                <w:right w:val="none" w:sz="0" w:space="0" w:color="000000"/>
+              </w:pBdr>
+              <w:spacing w:before="100" w:after="100"/>
+              <w:ind w:left="100" w:right="100"/>
+              <w:jc w:val="left"/>
+              <w:rPr>
+                <w:color w:val="000000"/>
+                <w:sz w:val="22"/>
+                <w:szCs w:val="22"/>
+              </w:rPr>
+            </w:pPr>
+            <w:r>
+              <w:rPr>
+                <w:color w:val="000000"/>
+                <w:sz w:val="22"/>
+                <w:szCs w:val="22"/>
+              </w:rPr>
+              <w:t>Rd_ayg</w:t>
+            </w:r>
+          </w:p>
+        </w:tc>
+        <w:tc>
+          <w:tcPr>
+            <w:tcW w:w="0" w:type="auto"/>
+            <w:tcBorders>
+              <w:top w:val="none" w:sz="0" w:space="0" w:color="000000"/>
+              <w:left w:val="none" w:sz="0" w:space="0" w:color="000000"/>
+              <w:bottom w:val="none" w:sz="0" w:space="0" w:color="000000"/>
+              <w:right w:val="none" w:sz="0" w:space="0" w:color="000000"/>
+            </w:tcBorders>
+            <w:shd w:val="clear" w:color="auto" w:fill="FFFFFF"/>
+            <w:tcMar>
+              <w:top w:w="0" w:type="dxa"/>
+              <w:left w:w="0" w:type="dxa"/>
+              <w:bottom w:w="0" w:type="dxa"/>
+              <w:right w:w="0" w:type="dxa"/>
+            </w:tcMar>
+            <w:vAlign w:val="center"/>
+          </w:tcPr>
+          <w:p>
+            <w:pPr>
+              <w:pBdr>
+                <w:top w:val="none" w:sz="0" w:space="0" w:color="000000"/>
+                <w:left w:val="none" w:sz="0" w:space="0" w:color="000000"/>
+                <w:bottom w:val="none" w:sz="0" w:space="0" w:color="000000"/>
+                <w:right w:val="none" w:sz="0" w:space="0" w:color="000000"/>
+              </w:pBdr>
+              <w:spacing w:before="100" w:after="100"/>
+              <w:ind w:left="100" w:right="100"/>
+              <w:jc w:val="right"/>
+              <w:rPr>
+                <w:color w:val="000000"/>
+                <w:sz w:val="22"/>
+                <w:szCs w:val="22"/>
+              </w:rPr>
+            </w:pPr>
+            <w:r>
+              <w:rPr>
+                <w:color w:val="000000"/>
+                <w:sz w:val="22"/>
+                <w:szCs w:val="22"/>
+              </w:rPr>
+              <w:t>903</w:t>
+            </w:r>
+          </w:p>
+        </w:tc>
+        <w:tc>
+          <w:tcPr>
+            <w:tcW w:w="0" w:type="auto"/>
+            <w:tcBorders>
+              <w:top w:val="none" w:sz="0" w:space="0" w:color="000000"/>
+              <w:left w:val="none" w:sz="0" w:space="0" w:color="000000"/>
+              <w:bottom w:val="none" w:sz="0" w:space="0" w:color="000000"/>
+              <w:right w:val="none" w:sz="0" w:space="0" w:color="000000"/>
+            </w:tcBorders>
+            <w:shd w:val="clear" w:color="auto" w:fill="FFFFFF"/>
+            <w:tcMar>
+              <w:top w:w="0" w:type="dxa"/>
+              <w:left w:w="0" w:type="dxa"/>
+              <w:bottom w:w="0" w:type="dxa"/>
+              <w:right w:w="0" w:type="dxa"/>
+            </w:tcMar>
+            <w:vAlign w:val="center"/>
+          </w:tcPr>
+          <w:p>
+            <w:pPr>
+              <w:pBdr>
+                <w:top w:val="none" w:sz="0" w:space="0" w:color="000000"/>
+                <w:left w:val="none" w:sz="0" w:space="0" w:color="000000"/>
+                <w:bottom w:val="none" w:sz="0" w:space="0" w:color="000000"/>
+                <w:right w:val="none" w:sz="0" w:space="0" w:color="000000"/>
+              </w:pBdr>
+              <w:spacing w:before="100" w:after="100"/>
+              <w:ind w:left="100" w:right="100"/>
+              <w:jc w:val="right"/>
+              <w:rPr>
+                <w:color w:val="000000"/>
+                <w:sz w:val="22"/>
+                <w:szCs w:val="22"/>
+              </w:rPr>
+            </w:pPr>
+            <w:r>
+              <w:rPr>
+                <w:color w:val="000000"/>
+                <w:sz w:val="22"/>
+                <w:szCs w:val="22"/>
+              </w:rPr>
+              <w:t>493</w:t>
+            </w:r>
+          </w:p>
+        </w:tc>
+        <w:tc>
+          <w:tcPr>
+            <w:tcW w:w="0" w:type="auto"/>
+            <w:tcBorders>
+              <w:top w:val="none" w:sz="0" w:space="0" w:color="000000"/>
+              <w:left w:val="none" w:sz="0" w:space="0" w:color="000000"/>
+              <w:bottom w:val="none" w:sz="0" w:space="0" w:color="000000"/>
+              <w:right w:val="none" w:sz="0" w:space="0" w:color="000000"/>
+            </w:tcBorders>
+            <w:shd w:val="clear" w:color="auto" w:fill="FFFFFF"/>
+            <w:tcMar>
+              <w:top w:w="0" w:type="dxa"/>
+              <w:left w:w="0" w:type="dxa"/>
+              <w:bottom w:w="0" w:type="dxa"/>
+              <w:right w:w="0" w:type="dxa"/>
+            </w:tcMar>
+            <w:vAlign w:val="center"/>
+          </w:tcPr>
+          <w:p>
+            <w:pPr>
+              <w:pBdr>
+                <w:top w:val="none" w:sz="0" w:space="0" w:color="000000"/>
+                <w:left w:val="none" w:sz="0" w:space="0" w:color="000000"/>
+                <w:bottom w:val="none" w:sz="0" w:space="0" w:color="000000"/>
+                <w:right w:val="none" w:sz="0" w:space="0" w:color="000000"/>
+              </w:pBdr>
+              <w:spacing w:before="100" w:after="100"/>
+              <w:ind w:left="100" w:right="100"/>
+              <w:jc w:val="right"/>
+              <w:rPr>
+                <w:color w:val="000000"/>
+                <w:sz w:val="22"/>
+                <w:szCs w:val="22"/>
+              </w:rPr>
+            </w:pPr>
+            <w:r>
+              <w:rPr>
+                <w:color w:val="000000"/>
+                <w:sz w:val="22"/>
+                <w:szCs w:val="22"/>
+              </w:rPr>
+              <w:t>47</w:t>
+            </w:r>
+          </w:p>
+        </w:tc>
+        <w:tc>
+          <w:tcPr>
+            <w:tcW w:w="0" w:type="auto"/>
+            <w:tcBorders>
+              <w:top w:val="none" w:sz="0" w:space="0" w:color="000000"/>
+              <w:left w:val="none" w:sz="0" w:space="0" w:color="000000"/>
+              <w:bottom w:val="none" w:sz="0" w:space="0" w:color="000000"/>
+              <w:right w:val="none" w:sz="0" w:space="0" w:color="000000"/>
+            </w:tcBorders>
+            <w:shd w:val="clear" w:color="auto" w:fill="FFFFFF"/>
+            <w:tcMar>
+              <w:top w:w="0" w:type="dxa"/>
+              <w:left w:w="0" w:type="dxa"/>
+              <w:bottom w:w="0" w:type="dxa"/>
+              <w:right w:w="0" w:type="dxa"/>
+            </w:tcMar>
+            <w:vAlign w:val="center"/>
+          </w:tcPr>
+          <w:p>
+            <w:pPr>
+              <w:pBdr>
+                <w:top w:val="none" w:sz="0" w:space="0" w:color="000000"/>
+                <w:left w:val="none" w:sz="0" w:space="0" w:color="000000"/>
+                <w:bottom w:val="none" w:sz="0" w:space="0" w:color="000000"/>
+                <w:right w:val="none" w:sz="0" w:space="0" w:color="000000"/>
+              </w:pBdr>
+              <w:spacing w:before="100" w:after="100"/>
+              <w:ind w:left="100" w:right="100"/>
+              <w:jc w:val="right"/>
+              <w:rPr>
+                <w:color w:val="000000"/>
+                <w:sz w:val="22"/>
+                <w:szCs w:val="22"/>
+              </w:rPr>
+            </w:pPr>
+            <w:r>
+              <w:rPr>
+                <w:color w:val="000000"/>
+                <w:sz w:val="22"/>
+                <w:szCs w:val="22"/>
+              </w:rPr>
+              <w:t>4,325</w:t>
+            </w:r>
+          </w:p>
+        </w:tc>
+        <w:tc>
+          <w:tcPr>
+            <w:tcW w:w="0" w:type="auto"/>
+            <w:tcBorders>
+              <w:top w:val="none" w:sz="0" w:space="0" w:color="000000"/>
+              <w:left w:val="none" w:sz="0" w:space="0" w:color="000000"/>
+              <w:bottom w:val="none" w:sz="0" w:space="0" w:color="000000"/>
+              <w:right w:val="none" w:sz="0" w:space="0" w:color="000000"/>
+            </w:tcBorders>
+            <w:shd w:val="clear" w:color="auto" w:fill="FFFFFF"/>
+            <w:tcMar>
+              <w:top w:w="0" w:type="dxa"/>
+              <w:left w:w="0" w:type="dxa"/>
+              <w:bottom w:w="0" w:type="dxa"/>
+              <w:right w:w="0" w:type="dxa"/>
+            </w:tcMar>
+            <w:vAlign w:val="center"/>
+          </w:tcPr>
+          <w:p>
+            <w:pPr>
+              <w:pBdr>
+                <w:top w:val="none" w:sz="0" w:space="0" w:color="000000"/>
+                <w:left w:val="none" w:sz="0" w:space="0" w:color="000000"/>
+                <w:bottom w:val="none" w:sz="0" w:space="0" w:color="000000"/>
+                <w:right w:val="none" w:sz="0" w:space="0" w:color="000000"/>
+              </w:pBdr>
+              <w:spacing w:before="100" w:after="100"/>
+              <w:ind w:left="100" w:right="100"/>
+              <w:jc w:val="right"/>
+              <w:rPr>
+                <w:color w:val="000000"/>
+                <w:sz w:val="22"/>
+                <w:szCs w:val="22"/>
+              </w:rPr>
+            </w:pPr>
+            <w:r>
+              <w:rPr>
+                <w:color w:val="000000"/>
+                <w:sz w:val="22"/>
+                <w:szCs w:val="22"/>
+              </w:rPr>
+              <w:t>2,022.8</w:t>
+            </w:r>
+          </w:p>
+        </w:tc>
+        <w:tc>
+          <w:tcPr>
+            <w:tcW w:w="0" w:type="auto"/>
+            <w:tcBorders>
+              <w:top w:val="none" w:sz="0" w:space="0" w:color="000000"/>
+              <w:left w:val="none" w:sz="0" w:space="0" w:color="000000"/>
+              <w:bottom w:val="none" w:sz="0" w:space="0" w:color="000000"/>
+              <w:right w:val="none" w:sz="0" w:space="0" w:color="000000"/>
+            </w:tcBorders>
+            <w:shd w:val="clear" w:color="auto" w:fill="FFFFFF"/>
+            <w:tcMar>
+              <w:top w:w="0" w:type="dxa"/>
+              <w:left w:w="0" w:type="dxa"/>
+              <w:bottom w:w="0" w:type="dxa"/>
+              <w:right w:w="0" w:type="dxa"/>
+            </w:tcMar>
+            <w:vAlign w:val="center"/>
+          </w:tcPr>
+          <w:p>
+            <w:pPr>
+              <w:pBdr>
+                <w:top w:val="none" w:sz="0" w:space="0" w:color="000000"/>
+                <w:left w:val="none" w:sz="0" w:space="0" w:color="000000"/>
+                <w:bottom w:val="none" w:sz="0" w:space="0" w:color="000000"/>
+                <w:right w:val="none" w:sz="0" w:space="0" w:color="000000"/>
+              </w:pBdr>
+              <w:spacing w:before="100" w:after="100"/>
+              <w:ind w:left="100" w:right="100"/>
+              <w:jc w:val="right"/>
+              <w:rPr>
+                <w:color w:val="000000"/>
+                <w:sz w:val="22"/>
+                <w:szCs w:val="22"/>
+              </w:rPr>
+            </w:pPr>
+            <w:r>
+              <w:rPr>
+                <w:color w:val="000000"/>
+                <w:sz w:val="22"/>
+                <w:szCs w:val="22"/>
+              </w:rPr>
+              <w:t>1.165</w:t>
+            </w:r>
+          </w:p>
+        </w:tc>
+      </w:tr>
+      <w:tr>
+        <w:trPr>
+          <w:jc w:val="center"/>
+        </w:trPr>
+        <w:tc>
+          <w:tcPr>
+            <w:tcW w:w="0" w:type="auto"/>
+            <w:tcBorders>
+              <w:top w:val="none" w:sz="0" w:space="0" w:color="000000"/>
+              <w:left w:val="none" w:sz="0" w:space="0" w:color="000000"/>
+              <w:bottom w:val="none" w:sz="0" w:space="0" w:color="000000"/>
+              <w:right w:val="none" w:sz="0" w:space="0" w:color="000000"/>
+            </w:tcBorders>
+            <w:shd w:val="clear" w:color="auto" w:fill="FFFFFF"/>
+            <w:tcMar>
+              <w:top w:w="0" w:type="dxa"/>
+              <w:left w:w="0" w:type="dxa"/>
+              <w:bottom w:w="0" w:type="dxa"/>
+              <w:right w:w="0" w:type="dxa"/>
+            </w:tcMar>
+            <w:vAlign w:val="center"/>
+          </w:tcPr>
+          <w:p>
+            <w:pPr>
+              <w:pBdr>
+                <w:top w:val="none" w:sz="0" w:space="0" w:color="000000"/>
+                <w:left w:val="none" w:sz="0" w:space="0" w:color="000000"/>
+                <w:bottom w:val="none" w:sz="0" w:space="0" w:color="000000"/>
+                <w:right w:val="none" w:sz="0" w:space="0" w:color="000000"/>
+              </w:pBdr>
+              <w:spacing w:before="100" w:after="100"/>
+              <w:ind w:left="100" w:right="100"/>
+              <w:jc w:val="left"/>
+              <w:rPr>
+                <w:color w:val="000000"/>
+                <w:sz w:val="22"/>
+                <w:szCs w:val="22"/>
+              </w:rPr>
+            </w:pPr>
+            <w:r>
+              <w:rPr>
+                <w:color w:val="000000"/>
+                <w:sz w:val="22"/>
+                <w:szCs w:val="22"/>
+              </w:rPr>
+              <w:t>SOKO2SAP</w:t>
+            </w:r>
+          </w:p>
+        </w:tc>
+        <w:tc>
+          <w:tcPr>
+            <w:tcW w:w="0" w:type="auto"/>
+            <w:tcBorders>
+              <w:top w:val="none" w:sz="0" w:space="0" w:color="000000"/>
+              <w:left w:val="none" w:sz="0" w:space="0" w:color="000000"/>
+              <w:bottom w:val="none" w:sz="0" w:space="0" w:color="000000"/>
+              <w:right w:val="none" w:sz="0" w:space="0" w:color="000000"/>
+            </w:tcBorders>
+            <w:shd w:val="clear" w:color="auto" w:fill="FFFFFF"/>
+            <w:tcMar>
+              <w:top w:w="0" w:type="dxa"/>
+              <w:left w:w="0" w:type="dxa"/>
+              <w:bottom w:w="0" w:type="dxa"/>
+              <w:right w:w="0" w:type="dxa"/>
+            </w:tcMar>
+            <w:vAlign w:val="center"/>
+          </w:tcPr>
+          <w:p>
+            <w:pPr>
+              <w:pBdr>
+                <w:top w:val="none" w:sz="0" w:space="0" w:color="000000"/>
+                <w:left w:val="none" w:sz="0" w:space="0" w:color="000000"/>
+                <w:bottom w:val="none" w:sz="0" w:space="0" w:color="000000"/>
+                <w:right w:val="none" w:sz="0" w:space="0" w:color="000000"/>
+              </w:pBdr>
+              <w:spacing w:before="100" w:after="100"/>
+              <w:ind w:left="100" w:right="100"/>
+              <w:jc w:val="left"/>
+              <w:rPr>
+                <w:color w:val="000000"/>
+                <w:sz w:val="22"/>
+                <w:szCs w:val="22"/>
+              </w:rPr>
+            </w:pPr>
+            <w:r>
+              <w:rPr>
+                <w:color w:val="000000"/>
+                <w:sz w:val="22"/>
+                <w:szCs w:val="22"/>
+              </w:rPr>
+              <w:t>1985</w:t>
+            </w:r>
+          </w:p>
+        </w:tc>
+        <w:tc>
+          <w:tcPr>
+            <w:tcW w:w="0" w:type="auto"/>
+            <w:tcBorders>
+              <w:top w:val="none" w:sz="0" w:space="0" w:color="000000"/>
+              <w:left w:val="none" w:sz="0" w:space="0" w:color="000000"/>
+              <w:bottom w:val="none" w:sz="0" w:space="0" w:color="000000"/>
+              <w:right w:val="none" w:sz="0" w:space="0" w:color="000000"/>
+            </w:tcBorders>
+            <w:shd w:val="clear" w:color="auto" w:fill="FFFFFF"/>
+            <w:tcMar>
+              <w:top w:w="0" w:type="dxa"/>
+              <w:left w:w="0" w:type="dxa"/>
+              <w:bottom w:w="0" w:type="dxa"/>
+              <w:right w:w="0" w:type="dxa"/>
+            </w:tcMar>
+            <w:vAlign w:val="center"/>
+          </w:tcPr>
+          <w:p>
+            <w:pPr>
+              <w:pBdr>
+                <w:top w:val="none" w:sz="0" w:space="0" w:color="000000"/>
+                <w:left w:val="none" w:sz="0" w:space="0" w:color="000000"/>
+                <w:bottom w:val="none" w:sz="0" w:space="0" w:color="000000"/>
+                <w:right w:val="none" w:sz="0" w:space="0" w:color="000000"/>
+              </w:pBdr>
+              <w:spacing w:before="100" w:after="100"/>
+              <w:ind w:left="100" w:right="100"/>
+              <w:jc w:val="left"/>
+              <w:rPr>
+                <w:color w:val="000000"/>
+                <w:sz w:val="22"/>
+                <w:szCs w:val="22"/>
+              </w:rPr>
+            </w:pPr>
+            <w:r>
+              <w:rPr>
+                <w:color w:val="000000"/>
+                <w:sz w:val="22"/>
+                <w:szCs w:val="22"/>
+              </w:rPr>
+              <w:t>R_ayg</w:t>
+            </w:r>
+          </w:p>
+        </w:tc>
+        <w:tc>
+          <w:tcPr>
+            <w:tcW w:w="0" w:type="auto"/>
+            <w:tcBorders>
+              <w:top w:val="none" w:sz="0" w:space="0" w:color="000000"/>
+              <w:left w:val="none" w:sz="0" w:space="0" w:color="000000"/>
+              <w:bottom w:val="none" w:sz="0" w:space="0" w:color="000000"/>
+              <w:right w:val="none" w:sz="0" w:space="0" w:color="000000"/>
+            </w:tcBorders>
+            <w:shd w:val="clear" w:color="auto" w:fill="FFFFFF"/>
+            <w:tcMar>
+              <w:top w:w="0" w:type="dxa"/>
+              <w:left w:w="0" w:type="dxa"/>
+              <w:bottom w:w="0" w:type="dxa"/>
+              <w:right w:w="0" w:type="dxa"/>
+            </w:tcMar>
+            <w:vAlign w:val="center"/>
+          </w:tcPr>
+          <w:p>
+            <w:pPr>
+              <w:pBdr>
+                <w:top w:val="none" w:sz="0" w:space="0" w:color="000000"/>
+                <w:left w:val="none" w:sz="0" w:space="0" w:color="000000"/>
+                <w:bottom w:val="none" w:sz="0" w:space="0" w:color="000000"/>
+                <w:right w:val="none" w:sz="0" w:space="0" w:color="000000"/>
+              </w:pBdr>
+              <w:spacing w:before="100" w:after="100"/>
+              <w:ind w:left="100" w:right="100"/>
+              <w:jc w:val="right"/>
+              <w:rPr>
+                <w:color w:val="000000"/>
+                <w:sz w:val="22"/>
+                <w:szCs w:val="22"/>
+              </w:rPr>
+            </w:pPr>
+            <w:r>
+              <w:rPr>
+                <w:color w:val="000000"/>
+                <w:sz w:val="22"/>
+                <w:szCs w:val="22"/>
+              </w:rPr>
+              <w:t>597</w:t>
+            </w:r>
+          </w:p>
+        </w:tc>
+        <w:tc>
+          <w:tcPr>
+            <w:tcW w:w="0" w:type="auto"/>
+            <w:tcBorders>
+              <w:top w:val="none" w:sz="0" w:space="0" w:color="000000"/>
+              <w:left w:val="none" w:sz="0" w:space="0" w:color="000000"/>
+              <w:bottom w:val="none" w:sz="0" w:space="0" w:color="000000"/>
+              <w:right w:val="none" w:sz="0" w:space="0" w:color="000000"/>
+            </w:tcBorders>
+            <w:shd w:val="clear" w:color="auto" w:fill="FFFFFF"/>
+            <w:tcMar>
+              <w:top w:w="0" w:type="dxa"/>
+              <w:left w:w="0" w:type="dxa"/>
+              <w:bottom w:w="0" w:type="dxa"/>
+              <w:right w:w="0" w:type="dxa"/>
+            </w:tcMar>
+            <w:vAlign w:val="center"/>
+          </w:tcPr>
+          <w:p>
+            <w:pPr>
+              <w:pBdr>
+                <w:top w:val="none" w:sz="0" w:space="0" w:color="000000"/>
+                <w:left w:val="none" w:sz="0" w:space="0" w:color="000000"/>
+                <w:bottom w:val="none" w:sz="0" w:space="0" w:color="000000"/>
+                <w:right w:val="none" w:sz="0" w:space="0" w:color="000000"/>
+              </w:pBdr>
+              <w:spacing w:before="100" w:after="100"/>
+              <w:ind w:left="100" w:right="100"/>
+              <w:jc w:val="right"/>
+              <w:rPr>
+                <w:color w:val="000000"/>
+                <w:sz w:val="22"/>
+                <w:szCs w:val="22"/>
+              </w:rPr>
+            </w:pPr>
+            <w:r>
+              <w:rPr>
+                <w:color w:val="000000"/>
+                <w:sz w:val="22"/>
+                <w:szCs w:val="22"/>
+              </w:rPr>
+              <w:t>285</w:t>
+            </w:r>
+          </w:p>
+        </w:tc>
+        <w:tc>
+          <w:tcPr>
+            <w:tcW w:w="0" w:type="auto"/>
+            <w:tcBorders>
+              <w:top w:val="none" w:sz="0" w:space="0" w:color="000000"/>
+              <w:left w:val="none" w:sz="0" w:space="0" w:color="000000"/>
+              <w:bottom w:val="none" w:sz="0" w:space="0" w:color="000000"/>
+              <w:right w:val="none" w:sz="0" w:space="0" w:color="000000"/>
+            </w:tcBorders>
+            <w:shd w:val="clear" w:color="auto" w:fill="FFFFFF"/>
+            <w:tcMar>
+              <w:top w:w="0" w:type="dxa"/>
+              <w:left w:w="0" w:type="dxa"/>
+              <w:bottom w:w="0" w:type="dxa"/>
+              <w:right w:w="0" w:type="dxa"/>
+            </w:tcMar>
+            <w:vAlign w:val="center"/>
+          </w:tcPr>
+          <w:p>
+            <w:pPr>
+              <w:pBdr>
+                <w:top w:val="none" w:sz="0" w:space="0" w:color="000000"/>
+                <w:left w:val="none" w:sz="0" w:space="0" w:color="000000"/>
+                <w:bottom w:val="none" w:sz="0" w:space="0" w:color="000000"/>
+                <w:right w:val="none" w:sz="0" w:space="0" w:color="000000"/>
+              </w:pBdr>
+              <w:spacing w:before="100" w:after="100"/>
+              <w:ind w:left="100" w:right="100"/>
+              <w:jc w:val="right"/>
+              <w:rPr>
+                <w:color w:val="000000"/>
+                <w:sz w:val="22"/>
+                <w:szCs w:val="22"/>
+              </w:rPr>
+            </w:pPr>
+            <w:r>
+              <w:rPr>
+                <w:color w:val="000000"/>
+                <w:sz w:val="22"/>
+                <w:szCs w:val="22"/>
+              </w:rPr>
+              <w:t>23</w:t>
+            </w:r>
+          </w:p>
+        </w:tc>
+        <w:tc>
+          <w:tcPr>
+            <w:tcW w:w="0" w:type="auto"/>
+            <w:tcBorders>
+              <w:top w:val="none" w:sz="0" w:space="0" w:color="000000"/>
+              <w:left w:val="none" w:sz="0" w:space="0" w:color="000000"/>
+              <w:bottom w:val="none" w:sz="0" w:space="0" w:color="000000"/>
+              <w:right w:val="none" w:sz="0" w:space="0" w:color="000000"/>
+            </w:tcBorders>
+            <w:shd w:val="clear" w:color="auto" w:fill="FFFFFF"/>
+            <w:tcMar>
+              <w:top w:w="0" w:type="dxa"/>
+              <w:left w:w="0" w:type="dxa"/>
+              <w:bottom w:w="0" w:type="dxa"/>
+              <w:right w:w="0" w:type="dxa"/>
+            </w:tcMar>
+            <w:vAlign w:val="center"/>
+          </w:tcPr>
+          <w:p>
+            <w:pPr>
+              <w:pBdr>
+                <w:top w:val="none" w:sz="0" w:space="0" w:color="000000"/>
+                <w:left w:val="none" w:sz="0" w:space="0" w:color="000000"/>
+                <w:bottom w:val="none" w:sz="0" w:space="0" w:color="000000"/>
+                <w:right w:val="none" w:sz="0" w:space="0" w:color="000000"/>
+              </w:pBdr>
+              <w:spacing w:before="100" w:after="100"/>
+              <w:ind w:left="100" w:right="100"/>
+              <w:jc w:val="right"/>
+              <w:rPr>
+                <w:color w:val="000000"/>
+                <w:sz w:val="22"/>
+                <w:szCs w:val="22"/>
+              </w:rPr>
+            </w:pPr>
+            <w:r>
+              <w:rPr>
+                <w:color w:val="000000"/>
+                <w:sz w:val="22"/>
+                <w:szCs w:val="22"/>
+              </w:rPr>
+              <w:t>3,030</w:t>
+            </w:r>
+          </w:p>
+        </w:tc>
+        <w:tc>
+          <w:tcPr>
+            <w:tcW w:w="0" w:type="auto"/>
+            <w:tcBorders>
+              <w:top w:val="none" w:sz="0" w:space="0" w:color="000000"/>
+              <w:left w:val="none" w:sz="0" w:space="0" w:color="000000"/>
+              <w:bottom w:val="none" w:sz="0" w:space="0" w:color="000000"/>
+              <w:right w:val="none" w:sz="0" w:space="0" w:color="000000"/>
+            </w:tcBorders>
+            <w:shd w:val="clear" w:color="auto" w:fill="FFFFFF"/>
+            <w:tcMar>
+              <w:top w:w="0" w:type="dxa"/>
+              <w:left w:w="0" w:type="dxa"/>
+              <w:bottom w:w="0" w:type="dxa"/>
+              <w:right w:w="0" w:type="dxa"/>
+            </w:tcMar>
+            <w:vAlign w:val="center"/>
+          </w:tcPr>
+          <w:p>
+            <w:pPr>
+              <w:pBdr>
+                <w:top w:val="none" w:sz="0" w:space="0" w:color="000000"/>
+                <w:left w:val="none" w:sz="0" w:space="0" w:color="000000"/>
+                <w:bottom w:val="none" w:sz="0" w:space="0" w:color="000000"/>
+                <w:right w:val="none" w:sz="0" w:space="0" w:color="000000"/>
+              </w:pBdr>
+              <w:spacing w:before="100" w:after="100"/>
+              <w:ind w:left="100" w:right="100"/>
+              <w:jc w:val="right"/>
+              <w:rPr>
+                <w:color w:val="000000"/>
+                <w:sz w:val="22"/>
+                <w:szCs w:val="22"/>
+              </w:rPr>
+            </w:pPr>
+            <w:r>
+              <w:rPr>
+                <w:color w:val="000000"/>
+                <w:sz w:val="22"/>
+                <w:szCs w:val="22"/>
+              </w:rPr>
+              <w:t>1,216.7</w:t>
+            </w:r>
+          </w:p>
+        </w:tc>
+        <w:tc>
+          <w:tcPr>
+            <w:tcW w:w="0" w:type="auto"/>
+            <w:tcBorders>
+              <w:top w:val="none" w:sz="0" w:space="0" w:color="000000"/>
+              <w:left w:val="none" w:sz="0" w:space="0" w:color="000000"/>
+              <w:bottom w:val="none" w:sz="0" w:space="0" w:color="000000"/>
+              <w:right w:val="none" w:sz="0" w:space="0" w:color="000000"/>
+            </w:tcBorders>
+            <w:shd w:val="clear" w:color="auto" w:fill="FFFFFF"/>
+            <w:tcMar>
+              <w:top w:w="0" w:type="dxa"/>
+              <w:left w:w="0" w:type="dxa"/>
+              <w:bottom w:w="0" w:type="dxa"/>
+              <w:right w:w="0" w:type="dxa"/>
+            </w:tcMar>
+            <w:vAlign w:val="center"/>
+          </w:tcPr>
+          <w:p>
+            <w:pPr>
+              <w:pBdr>
+                <w:top w:val="none" w:sz="0" w:space="0" w:color="000000"/>
+                <w:left w:val="none" w:sz="0" w:space="0" w:color="000000"/>
+                <w:bottom w:val="none" w:sz="0" w:space="0" w:color="000000"/>
+                <w:right w:val="none" w:sz="0" w:space="0" w:color="000000"/>
+              </w:pBdr>
+              <w:spacing w:before="100" w:after="100"/>
+              <w:ind w:left="100" w:right="100"/>
+              <w:jc w:val="right"/>
+              <w:rPr>
+                <w:color w:val="000000"/>
+                <w:sz w:val="22"/>
+                <w:szCs w:val="22"/>
+              </w:rPr>
+            </w:pPr>
+            <w:r>
+              <w:rPr>
+                <w:color w:val="000000"/>
+                <w:sz w:val="22"/>
+                <w:szCs w:val="22"/>
+              </w:rPr>
+              <w:t>1.104</w:t>
+            </w:r>
+          </w:p>
+        </w:tc>
+      </w:tr>
+      <w:tr>
+        <w:trPr>
+          <w:jc w:val="center"/>
+        </w:trPr>
+        <w:tc>
+          <w:tcPr>
+            <w:tcW w:w="0" w:type="auto"/>
+            <w:tcBorders>
+              <w:top w:val="none" w:sz="0" w:space="0" w:color="000000"/>
+              <w:left w:val="none" w:sz="0" w:space="0" w:color="000000"/>
+              <w:bottom w:val="none" w:sz="0" w:space="0" w:color="000000"/>
+              <w:right w:val="none" w:sz="0" w:space="0" w:color="000000"/>
+            </w:tcBorders>
+            <w:shd w:val="clear" w:color="auto" w:fill="FFFFFF"/>
+            <w:tcMar>
+              <w:top w:w="0" w:type="dxa"/>
+              <w:left w:w="0" w:type="dxa"/>
+              <w:bottom w:w="0" w:type="dxa"/>
+              <w:right w:w="0" w:type="dxa"/>
+            </w:tcMar>
+            <w:vAlign w:val="center"/>
+          </w:tcPr>
+          <w:p>
+            <w:pPr>
+              <w:pBdr>
+                <w:top w:val="none" w:sz="0" w:space="0" w:color="000000"/>
+                <w:left w:val="none" w:sz="0" w:space="0" w:color="000000"/>
+                <w:bottom w:val="none" w:sz="0" w:space="0" w:color="000000"/>
+                <w:right w:val="none" w:sz="0" w:space="0" w:color="000000"/>
+              </w:pBdr>
+              <w:spacing w:before="100" w:after="100"/>
+              <w:ind w:left="100" w:right="100"/>
+              <w:jc w:val="left"/>
+              <w:rPr>
+                <w:color w:val="000000"/>
+                <w:sz w:val="22"/>
+                <w:szCs w:val="22"/>
+              </w:rPr>
+            </w:pPr>
+            <w:r>
+              <w:rPr>
+                <w:color w:val="000000"/>
+                <w:sz w:val="22"/>
+                <w:szCs w:val="22"/>
+              </w:rPr>
+              <w:t>SOKO2SAP</w:t>
+            </w:r>
+          </w:p>
+        </w:tc>
+        <w:tc>
+          <w:tcPr>
+            <w:tcW w:w="0" w:type="auto"/>
+            <w:tcBorders>
+              <w:top w:val="none" w:sz="0" w:space="0" w:color="000000"/>
+              <w:left w:val="none" w:sz="0" w:space="0" w:color="000000"/>
+              <w:bottom w:val="none" w:sz="0" w:space="0" w:color="000000"/>
+              <w:right w:val="none" w:sz="0" w:space="0" w:color="000000"/>
+            </w:tcBorders>
+            <w:shd w:val="clear" w:color="auto" w:fill="FFFFFF"/>
+            <w:tcMar>
+              <w:top w:w="0" w:type="dxa"/>
+              <w:left w:w="0" w:type="dxa"/>
+              <w:bottom w:w="0" w:type="dxa"/>
+              <w:right w:w="0" w:type="dxa"/>
+            </w:tcMar>
+            <w:vAlign w:val="center"/>
+          </w:tcPr>
+          <w:p>
+            <w:pPr>
+              <w:pBdr>
+                <w:top w:val="none" w:sz="0" w:space="0" w:color="000000"/>
+                <w:left w:val="none" w:sz="0" w:space="0" w:color="000000"/>
+                <w:bottom w:val="none" w:sz="0" w:space="0" w:color="000000"/>
+                <w:right w:val="none" w:sz="0" w:space="0" w:color="000000"/>
+              </w:pBdr>
+              <w:spacing w:before="100" w:after="100"/>
+              <w:ind w:left="100" w:right="100"/>
+              <w:jc w:val="left"/>
+              <w:rPr>
+                <w:color w:val="000000"/>
+                <w:sz w:val="22"/>
+                <w:szCs w:val="22"/>
+              </w:rPr>
+            </w:pPr>
+            <w:r>
+              <w:rPr>
+                <w:color w:val="000000"/>
+                <w:sz w:val="22"/>
+                <w:szCs w:val="22"/>
+              </w:rPr>
+              <w:t>1985</w:t>
+            </w:r>
+          </w:p>
+        </w:tc>
+        <w:tc>
+          <w:tcPr>
+            <w:tcW w:w="0" w:type="auto"/>
+            <w:tcBorders>
+              <w:top w:val="none" w:sz="0" w:space="0" w:color="000000"/>
+              <w:left w:val="none" w:sz="0" w:space="0" w:color="000000"/>
+              <w:bottom w:val="none" w:sz="0" w:space="0" w:color="000000"/>
+              <w:right w:val="none" w:sz="0" w:space="0" w:color="000000"/>
+            </w:tcBorders>
+            <w:shd w:val="clear" w:color="auto" w:fill="FFFFFF"/>
+            <w:tcMar>
+              <w:top w:w="0" w:type="dxa"/>
+              <w:left w:w="0" w:type="dxa"/>
+              <w:bottom w:w="0" w:type="dxa"/>
+              <w:right w:w="0" w:type="dxa"/>
+            </w:tcMar>
+            <w:vAlign w:val="center"/>
+          </w:tcPr>
+          <w:p>
+            <w:pPr>
+              <w:pBdr>
+                <w:top w:val="none" w:sz="0" w:space="0" w:color="000000"/>
+                <w:left w:val="none" w:sz="0" w:space="0" w:color="000000"/>
+                <w:bottom w:val="none" w:sz="0" w:space="0" w:color="000000"/>
+                <w:right w:val="none" w:sz="0" w:space="0" w:color="000000"/>
+              </w:pBdr>
+              <w:spacing w:before="100" w:after="100"/>
+              <w:ind w:left="100" w:right="100"/>
+              <w:jc w:val="left"/>
+              <w:rPr>
+                <w:color w:val="000000"/>
+                <w:sz w:val="22"/>
+                <w:szCs w:val="22"/>
+              </w:rPr>
+            </w:pPr>
+            <w:r>
+              <w:rPr>
+                <w:color w:val="000000"/>
+                <w:sz w:val="22"/>
+                <w:szCs w:val="22"/>
+              </w:rPr>
+              <w:t>Rp_ayg</w:t>
+            </w:r>
+          </w:p>
+        </w:tc>
+        <w:tc>
+          <w:tcPr>
+            <w:tcW w:w="0" w:type="auto"/>
+            <w:tcBorders>
+              <w:top w:val="none" w:sz="0" w:space="0" w:color="000000"/>
+              <w:left w:val="none" w:sz="0" w:space="0" w:color="000000"/>
+              <w:bottom w:val="none" w:sz="0" w:space="0" w:color="000000"/>
+              <w:right w:val="none" w:sz="0" w:space="0" w:color="000000"/>
+            </w:tcBorders>
+            <w:shd w:val="clear" w:color="auto" w:fill="FFFFFF"/>
+            <w:tcMar>
+              <w:top w:w="0" w:type="dxa"/>
+              <w:left w:w="0" w:type="dxa"/>
+              <w:bottom w:w="0" w:type="dxa"/>
+              <w:right w:w="0" w:type="dxa"/>
+            </w:tcMar>
+            <w:vAlign w:val="center"/>
+          </w:tcPr>
+          <w:p>
+            <w:pPr>
+              <w:pBdr>
+                <w:top w:val="none" w:sz="0" w:space="0" w:color="000000"/>
+                <w:left w:val="none" w:sz="0" w:space="0" w:color="000000"/>
+                <w:bottom w:val="none" w:sz="0" w:space="0" w:color="000000"/>
+                <w:right w:val="none" w:sz="0" w:space="0" w:color="000000"/>
+              </w:pBdr>
+              <w:spacing w:before="100" w:after="100"/>
+              <w:ind w:left="100" w:right="100"/>
+              <w:jc w:val="right"/>
+              <w:rPr>
+                <w:color w:val="000000"/>
+                <w:sz w:val="22"/>
+                <w:szCs w:val="22"/>
+              </w:rPr>
+            </w:pPr>
+            <w:r>
+              <w:rPr>
+                <w:color w:val="000000"/>
+                <w:sz w:val="22"/>
+                <w:szCs w:val="22"/>
+              </w:rPr>
+              <w:t>586</w:t>
+            </w:r>
+          </w:p>
+        </w:tc>
+        <w:tc>
+          <w:tcPr>
+            <w:tcW w:w="0" w:type="auto"/>
+            <w:tcBorders>
+              <w:top w:val="none" w:sz="0" w:space="0" w:color="000000"/>
+              <w:left w:val="none" w:sz="0" w:space="0" w:color="000000"/>
+              <w:bottom w:val="none" w:sz="0" w:space="0" w:color="000000"/>
+              <w:right w:val="none" w:sz="0" w:space="0" w:color="000000"/>
+            </w:tcBorders>
+            <w:shd w:val="clear" w:color="auto" w:fill="FFFFFF"/>
+            <w:tcMar>
+              <w:top w:w="0" w:type="dxa"/>
+              <w:left w:w="0" w:type="dxa"/>
+              <w:bottom w:w="0" w:type="dxa"/>
+              <w:right w:w="0" w:type="dxa"/>
+            </w:tcMar>
+            <w:vAlign w:val="center"/>
+          </w:tcPr>
+          <w:p>
+            <w:pPr>
+              <w:pBdr>
+                <w:top w:val="none" w:sz="0" w:space="0" w:color="000000"/>
+                <w:left w:val="none" w:sz="0" w:space="0" w:color="000000"/>
+                <w:bottom w:val="none" w:sz="0" w:space="0" w:color="000000"/>
+                <w:right w:val="none" w:sz="0" w:space="0" w:color="000000"/>
+              </w:pBdr>
+              <w:spacing w:before="100" w:after="100"/>
+              <w:ind w:left="100" w:right="100"/>
+              <w:jc w:val="right"/>
+              <w:rPr>
+                <w:color w:val="000000"/>
+                <w:sz w:val="22"/>
+                <w:szCs w:val="22"/>
+              </w:rPr>
+            </w:pPr>
+            <w:r>
+              <w:rPr>
+                <w:color w:val="000000"/>
+                <w:sz w:val="22"/>
+                <w:szCs w:val="22"/>
+              </w:rPr>
+              <w:t>276</w:t>
+            </w:r>
+          </w:p>
+        </w:tc>
+        <w:tc>
+          <w:tcPr>
+            <w:tcW w:w="0" w:type="auto"/>
+            <w:tcBorders>
+              <w:top w:val="none" w:sz="0" w:space="0" w:color="000000"/>
+              <w:left w:val="none" w:sz="0" w:space="0" w:color="000000"/>
+              <w:bottom w:val="none" w:sz="0" w:space="0" w:color="000000"/>
+              <w:right w:val="none" w:sz="0" w:space="0" w:color="000000"/>
+            </w:tcBorders>
+            <w:shd w:val="clear" w:color="auto" w:fill="FFFFFF"/>
+            <w:tcMar>
+              <w:top w:w="0" w:type="dxa"/>
+              <w:left w:w="0" w:type="dxa"/>
+              <w:bottom w:w="0" w:type="dxa"/>
+              <w:right w:w="0" w:type="dxa"/>
+            </w:tcMar>
+            <w:vAlign w:val="center"/>
+          </w:tcPr>
+          <w:p>
+            <w:pPr>
+              <w:pBdr>
+                <w:top w:val="none" w:sz="0" w:space="0" w:color="000000"/>
+                <w:left w:val="none" w:sz="0" w:space="0" w:color="000000"/>
+                <w:bottom w:val="none" w:sz="0" w:space="0" w:color="000000"/>
+                <w:right w:val="none" w:sz="0" w:space="0" w:color="000000"/>
+              </w:pBdr>
+              <w:spacing w:before="100" w:after="100"/>
+              <w:ind w:left="100" w:right="100"/>
+              <w:jc w:val="right"/>
+              <w:rPr>
+                <w:color w:val="000000"/>
+                <w:sz w:val="22"/>
+                <w:szCs w:val="22"/>
+              </w:rPr>
+            </w:pPr>
+            <w:r>
+              <w:rPr>
+                <w:color w:val="000000"/>
+                <w:sz w:val="22"/>
+                <w:szCs w:val="22"/>
+              </w:rPr>
+              <w:t>22</w:t>
+            </w:r>
+          </w:p>
+        </w:tc>
+        <w:tc>
+          <w:tcPr>
+            <w:tcW w:w="0" w:type="auto"/>
+            <w:tcBorders>
+              <w:top w:val="none" w:sz="0" w:space="0" w:color="000000"/>
+              <w:left w:val="none" w:sz="0" w:space="0" w:color="000000"/>
+              <w:bottom w:val="none" w:sz="0" w:space="0" w:color="000000"/>
+              <w:right w:val="none" w:sz="0" w:space="0" w:color="000000"/>
+            </w:tcBorders>
+            <w:shd w:val="clear" w:color="auto" w:fill="FFFFFF"/>
+            <w:tcMar>
+              <w:top w:w="0" w:type="dxa"/>
+              <w:left w:w="0" w:type="dxa"/>
+              <w:bottom w:w="0" w:type="dxa"/>
+              <w:right w:w="0" w:type="dxa"/>
+            </w:tcMar>
+            <w:vAlign w:val="center"/>
+          </w:tcPr>
+          <w:p>
+            <w:pPr>
+              <w:pBdr>
+                <w:top w:val="none" w:sz="0" w:space="0" w:color="000000"/>
+                <w:left w:val="none" w:sz="0" w:space="0" w:color="000000"/>
+                <w:bottom w:val="none" w:sz="0" w:space="0" w:color="000000"/>
+                <w:right w:val="none" w:sz="0" w:space="0" w:color="000000"/>
+              </w:pBdr>
+              <w:spacing w:before="100" w:after="100"/>
+              <w:ind w:left="100" w:right="100"/>
+              <w:jc w:val="right"/>
+              <w:rPr>
+                <w:color w:val="000000"/>
+                <w:sz w:val="22"/>
+                <w:szCs w:val="22"/>
+              </w:rPr>
+            </w:pPr>
+            <w:r>
+              <w:rPr>
+                <w:color w:val="000000"/>
+                <w:sz w:val="22"/>
+                <w:szCs w:val="22"/>
+              </w:rPr>
+              <w:t>3,019</w:t>
+            </w:r>
+          </w:p>
+        </w:tc>
+        <w:tc>
+          <w:tcPr>
+            <w:tcW w:w="0" w:type="auto"/>
+            <w:tcBorders>
+              <w:top w:val="none" w:sz="0" w:space="0" w:color="000000"/>
+              <w:left w:val="none" w:sz="0" w:space="0" w:color="000000"/>
+              <w:bottom w:val="none" w:sz="0" w:space="0" w:color="000000"/>
+              <w:right w:val="none" w:sz="0" w:space="0" w:color="000000"/>
+            </w:tcBorders>
+            <w:shd w:val="clear" w:color="auto" w:fill="FFFFFF"/>
+            <w:tcMar>
+              <w:top w:w="0" w:type="dxa"/>
+              <w:left w:w="0" w:type="dxa"/>
+              <w:bottom w:w="0" w:type="dxa"/>
+              <w:right w:w="0" w:type="dxa"/>
+            </w:tcMar>
+            <w:vAlign w:val="center"/>
+          </w:tcPr>
+          <w:p>
+            <w:pPr>
+              <w:pBdr>
+                <w:top w:val="none" w:sz="0" w:space="0" w:color="000000"/>
+                <w:left w:val="none" w:sz="0" w:space="0" w:color="000000"/>
+                <w:bottom w:val="none" w:sz="0" w:space="0" w:color="000000"/>
+                <w:right w:val="none" w:sz="0" w:space="0" w:color="000000"/>
+              </w:pBdr>
+              <w:spacing w:before="100" w:after="100"/>
+              <w:ind w:left="100" w:right="100"/>
+              <w:jc w:val="right"/>
+              <w:rPr>
+                <w:color w:val="000000"/>
+                <w:sz w:val="22"/>
+                <w:szCs w:val="22"/>
+              </w:rPr>
+            </w:pPr>
+            <w:r>
+              <w:rPr>
+                <w:color w:val="000000"/>
+                <w:sz w:val="22"/>
+                <w:szCs w:val="22"/>
+              </w:rPr>
+              <w:t>1,211.7</w:t>
+            </w:r>
+          </w:p>
+        </w:tc>
+        <w:tc>
+          <w:tcPr>
+            <w:tcW w:w="0" w:type="auto"/>
+            <w:tcBorders>
+              <w:top w:val="none" w:sz="0" w:space="0" w:color="000000"/>
+              <w:left w:val="none" w:sz="0" w:space="0" w:color="000000"/>
+              <w:bottom w:val="none" w:sz="0" w:space="0" w:color="000000"/>
+              <w:right w:val="none" w:sz="0" w:space="0" w:color="000000"/>
+            </w:tcBorders>
+            <w:shd w:val="clear" w:color="auto" w:fill="FFFFFF"/>
+            <w:tcMar>
+              <w:top w:w="0" w:type="dxa"/>
+              <w:left w:w="0" w:type="dxa"/>
+              <w:bottom w:w="0" w:type="dxa"/>
+              <w:right w:w="0" w:type="dxa"/>
+            </w:tcMar>
+            <w:vAlign w:val="center"/>
+          </w:tcPr>
+          <w:p>
+            <w:pPr>
+              <w:pBdr>
+                <w:top w:val="none" w:sz="0" w:space="0" w:color="000000"/>
+                <w:left w:val="none" w:sz="0" w:space="0" w:color="000000"/>
+                <w:bottom w:val="none" w:sz="0" w:space="0" w:color="000000"/>
+                <w:right w:val="none" w:sz="0" w:space="0" w:color="000000"/>
+              </w:pBdr>
+              <w:spacing w:before="100" w:after="100"/>
+              <w:ind w:left="100" w:right="100"/>
+              <w:jc w:val="right"/>
+              <w:rPr>
+                <w:color w:val="000000"/>
+                <w:sz w:val="22"/>
+                <w:szCs w:val="22"/>
+              </w:rPr>
+            </w:pPr>
+            <w:r>
+              <w:rPr>
+                <w:color w:val="000000"/>
+                <w:sz w:val="22"/>
+                <w:szCs w:val="22"/>
+              </w:rPr>
+              <w:t>1.105</w:t>
+            </w:r>
+          </w:p>
+        </w:tc>
+      </w:tr>
+      <w:tr>
+        <w:trPr>
+          <w:jc w:val="center"/>
+        </w:trPr>
+        <w:tc>
+          <w:tcPr>
+            <w:tcW w:w="0" w:type="auto"/>
+            <w:tcBorders>
+              <w:top w:val="none" w:sz="0" w:space="0" w:color="000000"/>
+              <w:left w:val="none" w:sz="0" w:space="0" w:color="000000"/>
+              <w:bottom w:val="single" w:sz="12" w:space="0" w:color="666666"/>
+              <w:right w:val="none" w:sz="0" w:space="0" w:color="000000"/>
+            </w:tcBorders>
+            <w:shd w:val="clear" w:color="auto" w:fill="FFFFFF"/>
+            <w:tcMar>
+              <w:top w:w="0" w:type="dxa"/>
+              <w:left w:w="0" w:type="dxa"/>
+              <w:bottom w:w="0" w:type="dxa"/>
+              <w:right w:w="0" w:type="dxa"/>
+            </w:tcMar>
+            <w:vAlign w:val="center"/>
+          </w:tcPr>
+          <w:p>
+            <w:pPr>
+              <w:pBdr>
+                <w:top w:val="none" w:sz="0" w:space="0" w:color="000000"/>
+                <w:left w:val="none" w:sz="0" w:space="0" w:color="000000"/>
+                <w:bottom w:val="none" w:sz="0" w:space="0" w:color="000000"/>
+                <w:right w:val="none" w:sz="0" w:space="0" w:color="000000"/>
+              </w:pBdr>
+              <w:spacing w:before="100" w:after="100"/>
+              <w:ind w:left="100" w:right="100"/>
+              <w:jc w:val="left"/>
+              <w:rPr>
+                <w:color w:val="000000"/>
+                <w:sz w:val="22"/>
+                <w:szCs w:val="22"/>
+              </w:rPr>
+            </w:pPr>
+            <w:r>
+              <w:rPr>
+                <w:color w:val="000000"/>
+                <w:sz w:val="22"/>
+                <w:szCs w:val="22"/>
+              </w:rPr>
+              <w:t>SOKO2SAP</w:t>
+            </w:r>
+          </w:p>
+        </w:tc>
+        <w:tc>
+          <w:tcPr>
+            <w:tcW w:w="0" w:type="auto"/>
+            <w:tcBorders>
+              <w:top w:val="none" w:sz="0" w:space="0" w:color="000000"/>
+              <w:left w:val="none" w:sz="0" w:space="0" w:color="000000"/>
+              <w:bottom w:val="single" w:sz="12" w:space="0" w:color="666666"/>
+              <w:right w:val="none" w:sz="0" w:space="0" w:color="000000"/>
+            </w:tcBorders>
+            <w:shd w:val="clear" w:color="auto" w:fill="FFFFFF"/>
+            <w:tcMar>
+              <w:top w:w="0" w:type="dxa"/>
+              <w:left w:w="0" w:type="dxa"/>
+              <w:bottom w:w="0" w:type="dxa"/>
+              <w:right w:w="0" w:type="dxa"/>
+            </w:tcMar>
+            <w:vAlign w:val="center"/>
+          </w:tcPr>
+          <w:p>
+            <w:pPr>
+              <w:pBdr>
+                <w:top w:val="none" w:sz="0" w:space="0" w:color="000000"/>
+                <w:left w:val="none" w:sz="0" w:space="0" w:color="000000"/>
+                <w:bottom w:val="none" w:sz="0" w:space="0" w:color="000000"/>
+                <w:right w:val="none" w:sz="0" w:space="0" w:color="000000"/>
+              </w:pBdr>
+              <w:spacing w:before="100" w:after="100"/>
+              <w:ind w:left="100" w:right="100"/>
+              <w:jc w:val="left"/>
+              <w:rPr>
+                <w:color w:val="000000"/>
+                <w:sz w:val="22"/>
+                <w:szCs w:val="22"/>
+              </w:rPr>
+            </w:pPr>
+            <w:r>
+              <w:rPr>
+                <w:color w:val="000000"/>
+                <w:sz w:val="22"/>
+                <w:szCs w:val="22"/>
+              </w:rPr>
+              <w:t>1985</w:t>
+            </w:r>
+          </w:p>
+        </w:tc>
+        <w:tc>
+          <w:tcPr>
+            <w:tcW w:w="0" w:type="auto"/>
+            <w:tcBorders>
+              <w:top w:val="none" w:sz="0" w:space="0" w:color="000000"/>
+              <w:left w:val="none" w:sz="0" w:space="0" w:color="000000"/>
+              <w:bottom w:val="single" w:sz="12" w:space="0" w:color="666666"/>
+              <w:right w:val="none" w:sz="0" w:space="0" w:color="000000"/>
+            </w:tcBorders>
+            <w:shd w:val="clear" w:color="auto" w:fill="FFFFFF"/>
+            <w:tcMar>
+              <w:top w:w="0" w:type="dxa"/>
+              <w:left w:w="0" w:type="dxa"/>
+              <w:bottom w:w="0" w:type="dxa"/>
+              <w:right w:w="0" w:type="dxa"/>
+            </w:tcMar>
+            <w:vAlign w:val="center"/>
+          </w:tcPr>
+          <w:p>
+            <w:pPr>
+              <w:pBdr>
+                <w:top w:val="none" w:sz="0" w:space="0" w:color="000000"/>
+                <w:left w:val="none" w:sz="0" w:space="0" w:color="000000"/>
+                <w:bottom w:val="none" w:sz="0" w:space="0" w:color="000000"/>
+                <w:right w:val="none" w:sz="0" w:space="0" w:color="000000"/>
+              </w:pBdr>
+              <w:spacing w:before="100" w:after="100"/>
+              <w:ind w:left="100" w:right="100"/>
+              <w:jc w:val="left"/>
+              <w:rPr>
+                <w:color w:val="000000"/>
+                <w:sz w:val="22"/>
+                <w:szCs w:val="22"/>
+              </w:rPr>
+            </w:pPr>
+            <w:r>
+              <w:rPr>
+                <w:color w:val="000000"/>
+                <w:sz w:val="22"/>
+                <w:szCs w:val="22"/>
+              </w:rPr>
+              <w:t>Rb_ayg</w:t>
+            </w:r>
+          </w:p>
+        </w:tc>
+        <w:tc>
+          <w:tcPr>
+            <w:tcW w:w="0" w:type="auto"/>
+            <w:tcBorders>
+              <w:top w:val="none" w:sz="0" w:space="0" w:color="000000"/>
+              <w:left w:val="none" w:sz="0" w:space="0" w:color="000000"/>
+              <w:bottom w:val="single" w:sz="12" w:space="0" w:color="666666"/>
+              <w:right w:val="none" w:sz="0" w:space="0" w:color="000000"/>
+            </w:tcBorders>
+            <w:shd w:val="clear" w:color="auto" w:fill="FFFFFF"/>
+            <w:tcMar>
+              <w:top w:w="0" w:type="dxa"/>
+              <w:left w:w="0" w:type="dxa"/>
+              <w:bottom w:w="0" w:type="dxa"/>
+              <w:right w:w="0" w:type="dxa"/>
+            </w:tcMar>
+            <w:vAlign w:val="center"/>
+          </w:tcPr>
+          <w:p>
+            <w:pPr>
+              <w:pBdr>
+                <w:top w:val="none" w:sz="0" w:space="0" w:color="000000"/>
+                <w:left w:val="none" w:sz="0" w:space="0" w:color="000000"/>
+                <w:bottom w:val="none" w:sz="0" w:space="0" w:color="000000"/>
+                <w:right w:val="none" w:sz="0" w:space="0" w:color="000000"/>
+              </w:pBdr>
+              <w:spacing w:before="100" w:after="100"/>
+              <w:ind w:left="100" w:right="100"/>
+              <w:jc w:val="right"/>
+              <w:rPr>
+                <w:color w:val="000000"/>
+                <w:sz w:val="22"/>
+                <w:szCs w:val="22"/>
+              </w:rPr>
+            </w:pPr>
+            <w:r>
+              <w:rPr>
+                <w:color w:val="000000"/>
+                <w:sz w:val="22"/>
+                <w:szCs w:val="22"/>
+              </w:rPr>
+              <w:t>570</w:t>
+            </w:r>
+          </w:p>
+        </w:tc>
+        <w:tc>
+          <w:tcPr>
+            <w:tcW w:w="0" w:type="auto"/>
+            <w:tcBorders>
+              <w:top w:val="none" w:sz="0" w:space="0" w:color="000000"/>
+              <w:left w:val="none" w:sz="0" w:space="0" w:color="000000"/>
+              <w:bottom w:val="single" w:sz="12" w:space="0" w:color="666666"/>
+              <w:right w:val="none" w:sz="0" w:space="0" w:color="000000"/>
+            </w:tcBorders>
+            <w:shd w:val="clear" w:color="auto" w:fill="FFFFFF"/>
+            <w:tcMar>
+              <w:top w:w="0" w:type="dxa"/>
+              <w:left w:w="0" w:type="dxa"/>
+              <w:bottom w:w="0" w:type="dxa"/>
+              <w:right w:w="0" w:type="dxa"/>
+            </w:tcMar>
+            <w:vAlign w:val="center"/>
+          </w:tcPr>
+          <w:p>
+            <w:pPr>
+              <w:pBdr>
+                <w:top w:val="none" w:sz="0" w:space="0" w:color="000000"/>
+                <w:left w:val="none" w:sz="0" w:space="0" w:color="000000"/>
+                <w:bottom w:val="none" w:sz="0" w:space="0" w:color="000000"/>
+                <w:right w:val="none" w:sz="0" w:space="0" w:color="000000"/>
+              </w:pBdr>
+              <w:spacing w:before="100" w:after="100"/>
+              <w:ind w:left="100" w:right="100"/>
+              <w:jc w:val="right"/>
+              <w:rPr>
+                <w:color w:val="000000"/>
+                <w:sz w:val="22"/>
+                <w:szCs w:val="22"/>
+              </w:rPr>
+            </w:pPr>
+            <w:r>
+              <w:rPr>
+                <w:color w:val="000000"/>
+                <w:sz w:val="22"/>
+                <w:szCs w:val="22"/>
+              </w:rPr>
+              <w:t>270</w:t>
+            </w:r>
+          </w:p>
+        </w:tc>
+        <w:tc>
+          <w:tcPr>
+            <w:tcW w:w="0" w:type="auto"/>
+            <w:tcBorders>
+              <w:top w:val="none" w:sz="0" w:space="0" w:color="000000"/>
+              <w:left w:val="none" w:sz="0" w:space="0" w:color="000000"/>
+              <w:bottom w:val="single" w:sz="12" w:space="0" w:color="666666"/>
+              <w:right w:val="none" w:sz="0" w:space="0" w:color="000000"/>
+            </w:tcBorders>
+            <w:shd w:val="clear" w:color="auto" w:fill="FFFFFF"/>
+            <w:tcMar>
+              <w:top w:w="0" w:type="dxa"/>
+              <w:left w:w="0" w:type="dxa"/>
+              <w:bottom w:w="0" w:type="dxa"/>
+              <w:right w:w="0" w:type="dxa"/>
+            </w:tcMar>
+            <w:vAlign w:val="center"/>
+          </w:tcPr>
+          <w:p>
+            <w:pPr>
+              <w:pBdr>
+                <w:top w:val="none" w:sz="0" w:space="0" w:color="000000"/>
+                <w:left w:val="none" w:sz="0" w:space="0" w:color="000000"/>
+                <w:bottom w:val="none" w:sz="0" w:space="0" w:color="000000"/>
+                <w:right w:val="none" w:sz="0" w:space="0" w:color="000000"/>
+              </w:pBdr>
+              <w:spacing w:before="100" w:after="100"/>
+              <w:ind w:left="100" w:right="100"/>
+              <w:jc w:val="right"/>
+              <w:rPr>
+                <w:color w:val="000000"/>
+                <w:sz w:val="22"/>
+                <w:szCs w:val="22"/>
+              </w:rPr>
+            </w:pPr>
+            <w:r>
+              <w:rPr>
+                <w:color w:val="000000"/>
+                <w:sz w:val="22"/>
+                <w:szCs w:val="22"/>
+              </w:rPr>
+              <w:t>21</w:t>
+            </w:r>
+          </w:p>
+        </w:tc>
+        <w:tc>
+          <w:tcPr>
+            <w:tcW w:w="0" w:type="auto"/>
+            <w:tcBorders>
+              <w:top w:val="none" w:sz="0" w:space="0" w:color="000000"/>
+              <w:left w:val="none" w:sz="0" w:space="0" w:color="000000"/>
+              <w:bottom w:val="single" w:sz="12" w:space="0" w:color="666666"/>
+              <w:right w:val="none" w:sz="0" w:space="0" w:color="000000"/>
+            </w:tcBorders>
+            <w:shd w:val="clear" w:color="auto" w:fill="FFFFFF"/>
+            <w:tcMar>
+              <w:top w:w="0" w:type="dxa"/>
+              <w:left w:w="0" w:type="dxa"/>
+              <w:bottom w:w="0" w:type="dxa"/>
+              <w:right w:w="0" w:type="dxa"/>
+            </w:tcMar>
+            <w:vAlign w:val="center"/>
+          </w:tcPr>
+          <w:p>
+            <w:pPr>
+              <w:pBdr>
+                <w:top w:val="none" w:sz="0" w:space="0" w:color="000000"/>
+                <w:left w:val="none" w:sz="0" w:space="0" w:color="000000"/>
+                <w:bottom w:val="none" w:sz="0" w:space="0" w:color="000000"/>
+                <w:right w:val="none" w:sz="0" w:space="0" w:color="000000"/>
+              </w:pBdr>
+              <w:spacing w:before="100" w:after="100"/>
+              <w:ind w:left="100" w:right="100"/>
+              <w:jc w:val="right"/>
+              <w:rPr>
+                <w:color w:val="000000"/>
+                <w:sz w:val="22"/>
+                <w:szCs w:val="22"/>
+              </w:rPr>
+            </w:pPr>
+            <w:r>
+              <w:rPr>
+                <w:color w:val="000000"/>
+                <w:sz w:val="22"/>
+                <w:szCs w:val="22"/>
+              </w:rPr>
+              <w:t>2,930</w:t>
+            </w:r>
+          </w:p>
+        </w:tc>
+        <w:tc>
+          <w:tcPr>
+            <w:tcW w:w="0" w:type="auto"/>
+            <w:tcBorders>
+              <w:top w:val="none" w:sz="0" w:space="0" w:color="000000"/>
+              <w:left w:val="none" w:sz="0" w:space="0" w:color="000000"/>
+              <w:bottom w:val="single" w:sz="12" w:space="0" w:color="666666"/>
+              <w:right w:val="none" w:sz="0" w:space="0" w:color="000000"/>
+            </w:tcBorders>
+            <w:shd w:val="clear" w:color="auto" w:fill="FFFFFF"/>
+            <w:tcMar>
+              <w:top w:w="0" w:type="dxa"/>
+              <w:left w:w="0" w:type="dxa"/>
+              <w:bottom w:w="0" w:type="dxa"/>
+              <w:right w:w="0" w:type="dxa"/>
+            </w:tcMar>
+            <w:vAlign w:val="center"/>
+          </w:tcPr>
+          <w:p>
+            <w:pPr>
+              <w:pBdr>
+                <w:top w:val="none" w:sz="0" w:space="0" w:color="000000"/>
+                <w:left w:val="none" w:sz="0" w:space="0" w:color="000000"/>
+                <w:bottom w:val="none" w:sz="0" w:space="0" w:color="000000"/>
+                <w:right w:val="none" w:sz="0" w:space="0" w:color="000000"/>
+              </w:pBdr>
+              <w:spacing w:before="100" w:after="100"/>
+              <w:ind w:left="100" w:right="100"/>
+              <w:jc w:val="right"/>
+              <w:rPr>
+                <w:color w:val="000000"/>
+                <w:sz w:val="22"/>
+                <w:szCs w:val="22"/>
+              </w:rPr>
+            </w:pPr>
+            <w:r>
+              <w:rPr>
+                <w:color w:val="000000"/>
+                <w:sz w:val="22"/>
+                <w:szCs w:val="22"/>
+              </w:rPr>
+              <w:t>1,175.5</w:t>
+            </w:r>
+          </w:p>
+        </w:tc>
+        <w:tc>
+          <w:tcPr>
+            <w:tcW w:w="0" w:type="auto"/>
+            <w:tcBorders>
+              <w:top w:val="none" w:sz="0" w:space="0" w:color="000000"/>
+              <w:left w:val="none" w:sz="0" w:space="0" w:color="000000"/>
+              <w:bottom w:val="single" w:sz="12" w:space="0" w:color="666666"/>
+              <w:right w:val="none" w:sz="0" w:space="0" w:color="000000"/>
+            </w:tcBorders>
+            <w:shd w:val="clear" w:color="auto" w:fill="FFFFFF"/>
+            <w:tcMar>
+              <w:top w:w="0" w:type="dxa"/>
+              <w:left w:w="0" w:type="dxa"/>
+              <w:bottom w:w="0" w:type="dxa"/>
+              <w:right w:w="0" w:type="dxa"/>
+            </w:tcMar>
+            <w:vAlign w:val="center"/>
+          </w:tcPr>
+          <w:p>
+            <w:pPr>
+              <w:pBdr>
+                <w:top w:val="none" w:sz="0" w:space="0" w:color="000000"/>
+                <w:left w:val="none" w:sz="0" w:space="0" w:color="000000"/>
+                <w:bottom w:val="none" w:sz="0" w:space="0" w:color="000000"/>
+                <w:right w:val="none" w:sz="0" w:space="0" w:color="000000"/>
+              </w:pBdr>
+              <w:spacing w:before="100" w:after="100"/>
+              <w:ind w:left="100" w:right="100"/>
+              <w:jc w:val="right"/>
+              <w:rPr>
+                <w:color w:val="000000"/>
+                <w:sz w:val="22"/>
+                <w:szCs w:val="22"/>
+              </w:rPr>
+            </w:pPr>
+            <w:r>
+              <w:rPr>
+                <w:color w:val="000000"/>
+                <w:sz w:val="22"/>
+                <w:szCs w:val="22"/>
+              </w:rPr>
+              <w:t>1.101</w:t>
+            </w:r>
+          </w:p>
+        </w:tc>
+      </w:tr>
+    </w:tbl>
+    <w:p>
+      <w:pPr>
         <w:pStyle w:val="Heading2"/>
       </w:pPr>
       <w:bookmarkStart w:id="37" w:name="residual-patterns"/>
-      <w:bookmarkStart w:id="38" w:name="_Toc224741388"/>
+      <w:bookmarkStart w:id="38" w:name="_Toc226529649"/>
       <w:r>
         <w:t>Residual Patterns</w:t>
       </w:r>
@@ -28680,7 +31347,11 @@
         <w:pStyle w:val="BodyText"/>
       </w:pPr>
       <w:r>
-        <w:t>Residual patterns of the fit to the logbook data show some patterns but are minor with respect to the overall number of fish being estimated (Figure 11 LB_RESIDS). Logbook data is fit with a poisson distribution which assumes a very small error and thus the model estimates are usually within 1% of the logbook value for both harvests and releases. There were some odd patterns in the North Gulf and both Prince William Sound CFMUs where the model predicted less harvests than logbook entries in the early years of the program and across all of southcentral and Kodiak CFMU’s the residuals are larger during that time period. These instances mirror the residual patterns in the SWHS and are the result of the model balancing the disagreement between the two data sources.</w:t>
+        <w:t xml:space="preserve">Residual patterns of the fit to the logbook data show some patterns but are minor with respect to the overall number of fish being estimated (Figure 11 LB_RESIDS). Logbook data is fit with a poisson distribution which assumes a very small error and thus the model estimates are usually within 1% of the logbook value for both harvests and releases. There were some odd patterns in the North Gulf and both Prince William Sound CFMUs where the model predicted less harvests than logbook entries in the early years of the program and across all of southcentral and Kodiak </w:t>
+      </w:r>
+      <w:r>
+        <w:lastRenderedPageBreak/>
+        <w:t>CFMU’s the residuals are larger during that time period. These instances mirror the residual patterns in the SWHS and are the result of the model balancing the disagreement between the two data sources.</w:t>
       </w:r>
     </w:p>
     <w:p>
@@ -28688,7 +31359,7 @@
         <w:pStyle w:val="Heading2"/>
       </w:pPr>
       <w:bookmarkStart w:id="39" w:name="bias-estimation"/>
-      <w:bookmarkStart w:id="40" w:name="_Toc224741389"/>
+      <w:bookmarkStart w:id="40" w:name="_Toc226529650"/>
       <w:bookmarkEnd w:id="37"/>
       <w:r>
         <w:t>Bias Estimation</w:t>
@@ -28700,11 +31371,7 @@
         <w:pStyle w:val="FirstParagraph"/>
       </w:pPr>
       <w:r>
-        <w:t xml:space="preserve">Model predicted bias in SWHS harvest and release data tracked the observed bias well across years and CFMUs (Figure 12 and 13 YEARAREA_BIAS) and demonstrated that SWHS estimates were generally biased low while release estimates were biased high (Figure 14 MEAN_BIAS). </w:t>
-      </w:r>
-      <w:r>
-        <w:lastRenderedPageBreak/>
-        <w:t>Observed and estimated harvest bias were very consistent with the exception of the very data poor BSAI CFMU (Figure 12 YEARAREA_BIAS).</w:t>
+        <w:t>Model predicted bias in SWHS harvest and release data tracked the observed bias well across years and CFMUs (Figure 12 and 13 YEARAREA_BIAS) and demonstrated that SWHS estimates were generally biased low while release estimates were biased high (Figure 14 MEAN_BIAS). Observed and estimated harvest bias were very consistent with the exception of the very data poor BSAI CFMU (Figure 12 YEARAREA_BIAS).</w:t>
       </w:r>
     </w:p>
     <w:p>
@@ -28728,7 +31395,7 @@
         <w:pStyle w:val="Heading2"/>
       </w:pPr>
       <w:bookmarkStart w:id="41" w:name="proportion-harvested"/>
-      <w:bookmarkStart w:id="42" w:name="_Toc224741390"/>
+      <w:bookmarkStart w:id="42" w:name="_Toc226529651"/>
       <w:bookmarkEnd w:id="39"/>
       <w:r>
         <w:t>Proportion Harvested</w:t>
@@ -28835,7 +31502,11 @@
         <w:pStyle w:val="BodyText"/>
       </w:pPr>
       <w:r>
-        <w:t>The proportion harvested of yelloweye rockfish demonstrated a very different pattern from pelagics whereby anglers have retained almost all landed fish until recent years when management restrictions came into effect (Figure 16 pH_YE). This is most obvious in the Southeast CFMU’s where yelloweye retention was prohibited beginning in 2020 and to a lesser degree in Prince William Sound (CFMU PWSI and PWSO) where milder restrictions were enacted. Logbook and portside interviews data were mostly in agreement with regard to yelloweye retention and retention. The model tracked the data well and the hindcasting applied a long term mean because the lack of appreciable change in the data since 2006.</w:t>
+        <w:t xml:space="preserve">The proportion harvested of yelloweye rockfish demonstrated a very different pattern from pelagics whereby anglers have retained almost all landed fish until recent years when management restrictions came into effect (Figure 16 pH_YE). This is most obvious in the Southeast CFMU’s where yelloweye retention was prohibited beginning in 2020 and to a lesser degree in Prince </w:t>
+      </w:r>
+      <w:r>
+        <w:lastRenderedPageBreak/>
+        <w:t>William Sound (CFMU PWSI and PWSO) where milder restrictions were enacted. Logbook and portside interviews data were mostly in agreement with regard to yelloweye retention and retention. The model tracked the data well and the hindcasting applied a long term mean because the lack of appreciable change in the data since 2006.</w:t>
       </w:r>
     </w:p>
     <w:p>
@@ -28879,11 +31550,7 @@
         </m:sSub>
       </m:oMath>
       <w:r>
-        <w:t xml:space="preserve">) the proportion harvested demonstrated variable patterns across regions (Figure 17 pH_OTHER). Central regions demonstrated a static pattern with the exception of Cook Inlet where retention probabilities increased over the course of observed time periods. Kodiak demonstrated increasing retention probabilities with the exception </w:t>
-      </w:r>
-      <w:r>
-        <w:lastRenderedPageBreak/>
-        <w:t>of the WKMA CFMUs which were static. For these two regions, the portside interview data tracked logbook records to various degrees, but demonstrated greater differences relative to the other species assemblages.</w:t>
+        <w:t>) the proportion harvested demonstrated variable patterns across regions (Figure 17 pH_OTHER). Central regions demonstrated a static pattern with the exception of Cook Inlet where retention probabilities increased over the course of observed time periods. Kodiak demonstrated increasing retention probabilities with the exception of the WKMA CFMUs which were static. For these two regions, the portside interview data tracked logbook records to various degrees, but demonstrated greater differences relative to the other species assemblages.</w:t>
       </w:r>
     </w:p>
     <w:p>
@@ -28899,7 +31566,7 @@
         <w:pStyle w:val="Heading2"/>
       </w:pPr>
       <w:bookmarkStart w:id="43" w:name="species-composition"/>
-      <w:bookmarkStart w:id="44" w:name="_Toc224741391"/>
+      <w:bookmarkStart w:id="44" w:name="_Toc226529652"/>
       <w:bookmarkEnd w:id="41"/>
       <w:r>
         <w:t>Species Composition</w:t>
@@ -29085,7 +31752,11 @@
         </m:sSub>
       </m:oMath>
       <w:r>
-        <w:t xml:space="preserve"> were generally converged with the exception of the Prince William Sound areas and the NSEI in Southeast, which were slow to converge. In these areas the port sampling data and the logbook data differ significantly and the model struggled to fit both of these data sources (Figure 18 P_PEL). Port sampling programs in this region are not proportional to the effort and thus the proportions are weighted to account for that issue (Howard et al. 2020). However, event the adjusted values do not align with the logbook data and thus remains an outstanding issue. As it stands, the model favors the logbook data over the port sampling data due to the nature of the relative likelihoods (Figure 18 P_Pel).</w:t>
+        <w:t xml:space="preserve"> were generally converged with the exception of the Prince William Sound areas and the NSEI in Southeast, which were slow to converge. In these areas the port sampling data and the logbook data differ significantly and the model struggled to fit both of these data sources (Figure 18 P_PEL). Port sampling programs in this region are not proportional to the effort and thus the proportions are weighted to account for that issue (Howard et al. 2020). However, event the adjusted values do not align with the logbook data and thus </w:t>
+      </w:r>
+      <w:r>
+        <w:lastRenderedPageBreak/>
+        <w:t>remains an outstanding issue. As it stands, the model favors the logbook data over the port sampling data due to the nature of the relative likelihoods (Figure 18 P_Pel).</w:t>
       </w:r>
     </w:p>
     <w:p>
@@ -29140,11 +31811,7 @@
         </m:sSub>
       </m:oMath>
       <w:r>
-        <w:t xml:space="preserve"> proved to be both informative and useful in estimating those values. Without that data the estimates tended toward the hyperprior values as informed by the Northeast data and resulted in credibility intervals </w:t>
-      </w:r>
-      <w:r>
-        <w:lastRenderedPageBreak/>
-        <w:t>that stretched from 0 to 1. The hydroacoustic data demonstrates higher black rockfish proportions in these other areas and the model was able to generate more precise and realistic estimates of these parameters.</w:t>
+        <w:t xml:space="preserve"> proved to be both informative and useful in estimating those values. Without that data the estimates tended toward the hyperprior values as informed by the Northeast data and resulted in credibility intervals that stretched from 0 to 1. The hydroacoustic data demonstrates higher black rockfish proportions in these other areas and the model was able to generate more precise and realistic estimates of these parameters.</w:t>
       </w:r>
     </w:p>
     <w:p>
@@ -29168,7 +31835,7 @@
         <w:pStyle w:val="Heading2"/>
       </w:pPr>
       <w:bookmarkStart w:id="45" w:name="proportion-guided"/>
-      <w:bookmarkStart w:id="46" w:name="_Toc224741392"/>
+      <w:bookmarkStart w:id="46" w:name="_Toc226529653"/>
       <w:bookmarkEnd w:id="43"/>
       <w:r>
         <w:t>Proportion Guided</w:t>
@@ -29188,7 +31855,7 @@
         <w:pStyle w:val="Heading2"/>
       </w:pPr>
       <w:bookmarkStart w:id="47" w:name="weight"/>
-      <w:bookmarkStart w:id="48" w:name="_Toc224741393"/>
+      <w:bookmarkStart w:id="48" w:name="_Toc226529654"/>
       <w:bookmarkEnd w:id="45"/>
       <w:r>
         <w:t>Weight</w:t>
@@ -29208,9 +31875,10 @@
         <w:pStyle w:val="Heading2"/>
       </w:pPr>
       <w:bookmarkStart w:id="49" w:name="X9d99479f46dec730a7a401f5db2083d62218015"/>
-      <w:bookmarkStart w:id="50" w:name="_Toc224741394"/>
+      <w:bookmarkStart w:id="50" w:name="_Toc226529655"/>
       <w:bookmarkEnd w:id="47"/>
       <w:r>
+        <w:lastRenderedPageBreak/>
         <w:t>Harvest, Release and Total Removal Estimates</w:t>
       </w:r>
       <w:bookmarkEnd w:id="50"/>
@@ -29229,11 +31897,7 @@
         <w:pStyle w:val="FirstParagraph"/>
       </w:pPr>
       <w:r>
-        <w:t xml:space="preserve">Total rockfish harvests demonstrate a generally increasing trend across the time series with some plateauing in recent years as a result of management restrictions (Figure 25 H_ALL; Appendix C1). Prior to 1998 when the logbook program went into effect, there is greater uncertainty in estimates and harvests were generally low. Some areas such as Cook Inlet (CI), North Gulf (NG), Northeast Kodiak and many of the Southeast CFMUs demonstrate consistent harvests during that time period. Harvest estimates from the Bayesian model are very consistent with Howard method estimates with some exceptions. There are some differences in the 1998-2001 period when the Howard methods made assumptions to deal with data limitations that were more appropriately handled with the hierarchical approach in the Bayesian model. There are also differences in some </w:t>
-      </w:r>
-      <w:r>
-        <w:lastRenderedPageBreak/>
-        <w:t>of the Kodiak areas where the Howard methods borrowed values from the most data rich Kodiak CFMUs whereas the Bayes model applies a hierarchical approach to leverage all of the data.</w:t>
+        <w:t>Total rockfish harvests demonstrate a generally increasing trend across the time series with some plateauing in recent years as a result of management restrictions (Figure 25 H_ALL; Appendix C1). Prior to 1998 when the logbook program went into effect, there is greater uncertainty in estimates and harvests were generally low. Some areas such as Cook Inlet (CI), North Gulf (NG), Northeast Kodiak and many of the Southeast CFMUs demonstrate consistent harvests during that time period. Harvest estimates from the Bayesian model are very consistent with Howard method estimates with some exceptions. There are some differences in the 1998-2001 period when the Howard methods made assumptions to deal with data limitations that were more appropriately handled with the hierarchical approach in the Bayesian model. There are also differences in some of the Kodiak areas where the Howard methods borrowed values from the most data rich Kodiak CFMUs whereas the Bayes model applies a hierarchical approach to leverage all of the data.</w:t>
       </w:r>
     </w:p>
     <w:p>
@@ -29265,6 +31929,7 @@
         <w:pStyle w:val="BodyText"/>
       </w:pPr>
       <w:r>
+        <w:lastRenderedPageBreak/>
         <w:t xml:space="preserve">Non-yelloweye DSR harvests in Southeast show very similar patterns to yelloweye and strong agreement with Howard estimates (Figure 28 H_DSR and Appendix C4) and slope rockfish harvests show an increasing trend that is less pronounced than the other species and complexes (Figure 29 H_SLOPE and Appendix C5). Although slope </w:t>
       </w:r>
       <w:r>
@@ -29293,11 +31958,7 @@
         <w:pStyle w:val="FirstParagraph"/>
       </w:pPr>
       <w:r>
-        <w:t xml:space="preserve">The release estimates for all rockfish are substantially less than harvests and demonstrate variable trends over the course of the time series with substantial uncertainty in the estimates (Figure 30 R_ALL and Appendix C1). Estimates from the pre-1998 period were sometimes similar to the low </w:t>
-      </w:r>
-      <w:r>
-        <w:lastRenderedPageBreak/>
-        <w:t>end of the post-1998 period or demonstrate an increase as the fishery in that CFMU developed. The trends in the Bayesian model diverge from the Howard estimates more than the harvest estimates due to changes in methodology, including the integration of the portside interview data. Portside interview data in Southcentral and the Northeast Kodiak CFMU showed much lower retention probabilities for private anglers which greatly increased the release estimates in this region relative to the Howard estimates. In the Southeast region the release estimates are generally in line with the Howard estimates, but are significantly lower in the early 2000s when the Howard methods relied on assumptions and long term averages to compensate for the lack of logbook data on yelloweye releases (Figure DATA).</w:t>
+        <w:t>The release estimates for all rockfish are substantially less than harvests and demonstrate variable trends over the course of the time series with substantial uncertainty in the estimates (Figure 30 R_ALL and Appendix C1). Estimates from the pre-1998 period were sometimes similar to the low end of the post-1998 period or demonstrate an increase as the fishery in that CFMU developed. The trends in the Bayesian model diverge from the Howard estimates more than the harvest estimates due to changes in methodology, including the integration of the portside interview data. Portside interview data in Southcentral and the Northeast Kodiak CFMU showed much lower retention probabilities for private anglers which greatly increased the release estimates in this region relative to the Howard estimates. In the Southeast region the release estimates are generally in line with the Howard estimates, but are significantly lower in the early 2000s when the Howard methods relied on assumptions and long term averages to compensate for the lack of logbook data on yelloweye releases (Figure DATA).</w:t>
       </w:r>
     </w:p>
     <w:p>
@@ -29331,7 +31992,11 @@
         <w:pStyle w:val="BodyText"/>
       </w:pPr>
       <w:r>
-        <w:t>Non-yelloweye DSR demonstrate similar release patterns to yelloweye rockfish and lower unguided estimates than Howard (Figure R_DSR 33 and Appendix C4) while slope rockfish show very low release numbers for most of the time series and a large, uptick in recent years with substantial uncertainty (R_SLOPE 34 and Appendix C5). While the DSR estimates track the Howard estimates to a fair degree, the slope rockfish estimates are substantially higher in the SSEO and, to a lesser degree, the NSEI and EWYKT, although the overall number is still low and not likely to be a management concern.</w:t>
+        <w:t xml:space="preserve">Non-yelloweye DSR demonstrate similar release patterns to yelloweye rockfish and lower unguided estimates than Howard (Figure R_DSR 33 and Appendix C4) while slope rockfish show very low release numbers for most of the time series and a large, uptick in recent years with substantial uncertainty (R_SLOPE 34 and Appendix C5). While the DSR estimates track the Howard estimates to a fair degree, the slope rockfish estimates are substantially higher in the SSEO </w:t>
+      </w:r>
+      <w:r>
+        <w:lastRenderedPageBreak/>
+        <w:t>and, to a lesser degree, the NSEI and EWYKT, although the overall number is still low and not likely to be a management concern.</w:t>
       </w:r>
     </w:p>
     <w:p>
@@ -29357,12 +32022,11 @@
         <w:pStyle w:val="Heading1"/>
       </w:pPr>
       <w:bookmarkStart w:id="54" w:name="discussion"/>
-      <w:bookmarkStart w:id="55" w:name="_Toc224741395"/>
+      <w:bookmarkStart w:id="55" w:name="_Toc226529656"/>
       <w:bookmarkEnd w:id="35"/>
       <w:bookmarkEnd w:id="49"/>
       <w:bookmarkEnd w:id="53"/>
       <w:r>
-        <w:lastRenderedPageBreak/>
         <w:t>Discussion</w:t>
       </w:r>
       <w:bookmarkEnd w:id="55"/>
@@ -29388,7 +32052,11 @@
         <w:pStyle w:val="BodyText"/>
       </w:pPr>
       <w:r>
-        <w:t>The Bayesian approach to estimating releases produces noticably different estimates from the Howard approach, particularly for the unguided sector. The Howard approach uses the same methods for estimating unguided releases as it does for harvests as it applies the SWHS ratio of guided:unguided release of all rockfish to the logbook release data. However, the Howard methods do not address bias in those estimates, assumes the ratio is equal for all species, and do not make use of the portside interview data. In contrast to SWHS harvest estimates, SWHS release estimates are biased high (i.e., anglers over-report their releases relative to logbook data) with a much larger magnitude in the bias relative to harvests. Rather than multiplying the logbook release estimates by the unguided:guided ratio of releases in the SWHS data, the Bayesian model corrects the SWHS release estimates and ensures that releases of the three logbook categories sum to that value, ensuring a more process and data driven estimation procedure. In many cases the Howard method results in unguided release estimates that are at or above guided release estimates even when the harvest of unguided anglers is substantially less (Figures 26 H_BLACK and 31 R_BLACK). This would imply that unguided anglers are discarding fish at a far higher rate than guided anglers.</w:t>
+        <w:t xml:space="preserve">The Bayesian approach to estimating releases produces noticably different estimates from the Howard approach, particularly for the unguided sector. The Howard approach uses the same methods for estimating unguided releases as it does for harvests as it applies the SWHS ratio of guided:unguided release of all rockfish to the logbook release data. However, the Howard methods do not address bias in those estimates, assumes the ratio is equal for all species, and do not make use of the portside interview data. In contrast to SWHS harvest estimates, SWHS release estimates are biased high (i.e., anglers over-report their releases relative to logbook data) with a much larger magnitude in the bias relative to harvests. Rather than multiplying the logbook release estimates by the unguided:guided ratio of releases in the SWHS data, the Bayesian model corrects the SWHS release estimates and ensures that releases of the three logbook categories sum to that value, </w:t>
+      </w:r>
+      <w:r>
+        <w:lastRenderedPageBreak/>
+        <w:t>ensuring a more process and data driven estimation procedure. In many cases the Howard method results in unguided release estimates that are at or above guided release estimates even when the harvest of unguided anglers is substantially less (Figures 26 H_BLACK and 31 R_BLACK). This would imply that unguided anglers are discarding fish at a far higher rate than guided anglers.</w:t>
       </w:r>
     </w:p>
     <w:p>
@@ -29396,11 +32064,7 @@
         <w:pStyle w:val="BodyText"/>
       </w:pPr>
       <w:r>
-        <w:t xml:space="preserve">The flaw in the Howard methods is apparent when examining release estimates of rockfish in Southeast CFMU’s since 2020 when yelloweye retention was prohibited and DSR retention restricted. During these years the logbook data demonstrates almost 100% retention of black rockfish while regulations reduce yelloweye retention to zero and limited DSR retention to 1 per day. In most of Southeast guided harvests are significantly higher than unguided harvests but the SWHS unguided:guided release ratio suggests more releases by unguided anglers. Thus, the Howard methods expand the guided release estimates to derive unguided estimates, resulting in estimates of unguided black rockfish releases far above the guided estimates while the harvest estimates display the opposite pattern. The CSEO is particularly indicative of this inconsistency </w:t>
-      </w:r>
-      <w:r>
-        <w:lastRenderedPageBreak/>
-        <w:t>where guided harvests of black rockfish are over 4 times that of the unguided anglers while the Howard methods generate unguided release estimates 2 to 3 times that of guided anglers. Because the SWHS data is for all rockfish combined it does not address the different retention probabilities by species complexes which are particularly divergent in Southeast since 2000 due to management action.</w:t>
+        <w:t>The flaw in the Howard methods is apparent when examining release estimates of rockfish in Southeast CFMU’s since 2020 when yelloweye retention was prohibited and DSR retention restricted. During these years the logbook data demonstrates almost 100% retention of black rockfish while regulations reduce yelloweye retention to zero and limited DSR retention to 1 per day. In most of Southeast guided harvests are significantly higher than unguided harvests but the SWHS unguided:guided release ratio suggests more releases by unguided anglers. Thus, the Howard methods expand the guided release estimates to derive unguided estimates, resulting in estimates of unguided black rockfish releases far above the guided estimates while the harvest estimates display the opposite pattern. The CSEO is particularly indicative of this inconsistency where guided harvests of black rockfish are over 4 times that of the unguided anglers while the Howard methods generate unguided release estimates 2 to 3 times that of guided anglers. Because the SWHS data is for all rockfish combined it does not address the different retention probabilities by species complexes which are particularly divergent in Southeast since 2000 due to management action.</w:t>
       </w:r>
     </w:p>
     <w:p>
@@ -29514,7 +32178,11 @@
         </m:sSub>
       </m:oMath>
       <w:r>
-        <w:t xml:space="preserve"> has changed significantly it would affect the estimates in the model and thus remains a question mark in the approach. If data were to become available the model could be updated to produce more accurate estimates, but in the absence of that data it is hoped that credibility intervals capture the true values.</w:t>
+        <w:t xml:space="preserve"> has changed </w:t>
+      </w:r>
+      <w:r>
+        <w:lastRenderedPageBreak/>
+        <w:t>significantly it would affect the estimates in the model and thus remains a question mark in the approach. If data were to become available the model could be updated to produce more accurate estimates, but in the absence of that data it is hoped that credibility intervals capture the true values.</w:t>
       </w:r>
     </w:p>
     <w:p>
@@ -29571,7 +32239,6 @@
         <w:pStyle w:val="BodyText"/>
       </w:pPr>
       <w:r>
-        <w:lastRenderedPageBreak/>
         <w:t>The discrepancy in the release of non-yelloweye DSR and slope rockfish in the SSEO portside sampling and logbook data also bears attention. In particular, logbooks record low retention of “other” rockfish while portside interviews indicate high retention. Area biologists should investigate this data discrepancy to determine if species identification or systematic under- or overreporting in logbooks is contributing to the contradictory data.</w:t>
       </w:r>
     </w:p>
@@ -29588,7 +32255,7 @@
         <w:pStyle w:val="Heading2"/>
       </w:pPr>
       <w:bookmarkStart w:id="56" w:name="conclusions-and-recommendations"/>
-      <w:bookmarkStart w:id="57" w:name="_Toc224741396"/>
+      <w:bookmarkStart w:id="57" w:name="_Toc226529657"/>
       <w:r>
         <w:t>Conclusions and Recommendations</w:t>
       </w:r>
@@ -29655,7 +32322,11 @@
         </m:sSub>
       </m:oMath>
       <w:r>
-        <w:t xml:space="preserve"> parameters as deviations around a mean and those values could be substantially changed as a result of management action. Were that to occur it would be a simple matter of introducing a new time-block defined by abrupt changes in management. For example, the Southeast region closed yelloweye rockfish retention between 2020 and 2024 but opened it up in 2025. Provided that port sampling programs remain in place, there would be no need to alter the model. However, if gaps were to occur in the port sampling program the missing years would resort to the mean values for those parameters which would be greatly influenced by the management regime. This could be simply addressed by introducing a new time block for Southeast in 2025.</w:t>
+        <w:t xml:space="preserve"> parameters </w:t>
+      </w:r>
+      <w:r>
+        <w:lastRenderedPageBreak/>
+        <w:t>as deviations around a mean and those values could be substantially changed as a result of management action. Were that to occur it would be a simple matter of introducing a new time-block defined by abrupt changes in management. For example, the Southeast region closed yelloweye rockfish retention between 2020 and 2024 but opened it up in 2025. Provided that port sampling programs remain in place, there would be no need to alter the model. However, if gaps were to occur in the port sampling program the missing years would resort to the mean values for those parameters which would be greatly influenced by the management regime. This could be simply addressed by introducing a new time block for Southeast in 2025.</w:t>
       </w:r>
     </w:p>
     <w:p>
@@ -29663,11 +32334,7 @@
         <w:pStyle w:val="BodyText"/>
       </w:pPr>
       <w:r>
-        <w:t xml:space="preserve">In conclusion, these new estimates of rockfish harvest, release and removals offer an improved and more reproducible approach to catch accounting for this highly targeted and vulnerable group of fish. These methods build on the location accounting system built by Howard et al. (2020) as well as the validation of the port sampling representativeness. In addition to extending the time series, the new methods are more reflective of the angling process, better capture the uncertainty </w:t>
-      </w:r>
-      <w:r>
-        <w:lastRenderedPageBreak/>
-        <w:t>in the data, more appropriately share information within regions, and provide a unified and centralized approach to calculating, reporting and archiving rockfish harvests, releases and removals in Alaska waters.</w:t>
+        <w:t>In conclusion, these new estimates of rockfish harvest, release and removals offer an improved and more reproducible approach to catch accounting for this highly targeted and vulnerable group of fish. These methods build on the location accounting system built by Howard et al. (2020) as well as the validation of the port sampling representativeness. In addition to extending the time series, the new methods are more reflective of the angling process, better capture the uncertainty in the data, more appropriately share information within regions, and provide a unified and centralized approach to calculating, reporting and archiving rockfish harvests, releases and removals in Alaska waters.</w:t>
       </w:r>
     </w:p>
     <w:p>
@@ -29675,7 +32342,7 @@
         <w:pStyle w:val="Heading1"/>
       </w:pPr>
       <w:bookmarkStart w:id="58" w:name="acknowledgments"/>
-      <w:bookmarkStart w:id="59" w:name="_Toc224741397"/>
+      <w:bookmarkStart w:id="59" w:name="_Toc226529658"/>
       <w:bookmarkEnd w:id="54"/>
       <w:bookmarkEnd w:id="56"/>
       <w:r>
@@ -29706,7 +32373,7 @@
         <w:pStyle w:val="Heading1"/>
       </w:pPr>
       <w:bookmarkStart w:id="60" w:name="literature-cited"/>
-      <w:bookmarkStart w:id="61" w:name="_Toc224741398"/>
+      <w:bookmarkStart w:id="61" w:name="_Toc226529659"/>
       <w:bookmarkEnd w:id="58"/>
       <w:r>
         <w:t>Literature Cited</w:t>
@@ -29742,6 +32409,7 @@
         <w:pStyle w:val="BodyText"/>
       </w:pPr>
       <w:r>
+        <w:lastRenderedPageBreak/>
         <w:t>Blain-Roth, B. J., and T. M. Sutton. 2019. Effects of barotrauma and recompression events on subsequent embryo condition of yelloweye rockfish. Fisheries Research 211: 212-216.</w:t>
       </w:r>
     </w:p>
@@ -29790,7 +32458,6 @@
         <w:pStyle w:val="BodyText"/>
       </w:pPr>
       <w:r>
-        <w:lastRenderedPageBreak/>
         <w:t>Hannah, R. W., P. S. Rankin, and M. T. O. Blume. 2012. Use of a novel cage system to measure postrecompression survival of northeast Pacific rockfish. Marine and Coastal Fisheries: Dynamics, Management, and Ecosystem Science, 4:1, 46-56.</w:t>
       </w:r>
     </w:p>
@@ -29881,6 +32548,7 @@
         <w:pStyle w:val="BodyText"/>
       </w:pPr>
       <w:r>
+        <w:lastRenderedPageBreak/>
         <w:t>Lang, Stefan, and Andreas Brezger. 2004. “Bayesian P-Splines.” Journal of Computational and Graphical Statistics 13 (1): 183–212.</w:t>
       </w:r>
     </w:p>
@@ -29950,7 +32618,6 @@
         <w:pStyle w:val="BodyText"/>
       </w:pPr>
       <w:r>
-        <w:lastRenderedPageBreak/>
         <w:t>Plummer M, Best N, Cowles K, Vines K 2006. CODA: Convergence Diagnosis and Output Analysis for MCMC, R News, 6:7-11.</w:t>
       </w:r>
     </w:p>
@@ -31443,7 +34110,7 @@
   <w:abstractNum w:abstractNumId="0" w15:restartNumberingAfterBreak="0">
     <w:nsid w:val="0000A990"/>
     <w:multiLevelType w:val="multilevel"/>
-    <w:tmpl w:val="800E0E80"/>
+    <w:tmpl w:val="FEBCFDFC"/>
     <w:lvl w:ilvl="0">
       <w:numFmt w:val="bullet"/>
       <w:lvlText w:val=" "/>
@@ -31520,7 +34187,7 @@
   <w:abstractNum w:abstractNumId="1" w15:restartNumberingAfterBreak="0">
     <w:nsid w:val="00A99421"/>
     <w:multiLevelType w:val="multilevel"/>
-    <w:tmpl w:val="A9F6F15A"/>
+    <w:tmpl w:val="95C2A6C8"/>
     <w:lvl w:ilvl="0">
       <w:start w:val="1"/>
       <w:numFmt w:val="decimal"/>
@@ -31606,7 +34273,7 @@
   <w:abstractNum w:abstractNumId="2" w15:restartNumberingAfterBreak="0">
     <w:nsid w:val="00A99721"/>
     <w:multiLevelType w:val="multilevel"/>
-    <w:tmpl w:val="5CF6A146"/>
+    <w:tmpl w:val="E8548068"/>
     <w:lvl w:ilvl="0">
       <w:start w:val="1"/>
       <w:numFmt w:val="lowerLetter"/>
@@ -34478,10 +37145,10 @@
   <w:num w:numId="26" w16cid:durableId="1979919492">
     <w:abstractNumId w:val="10"/>
   </w:num>
-  <w:num w:numId="27" w16cid:durableId="299847603">
+  <w:num w:numId="27" w16cid:durableId="1479692522">
     <w:abstractNumId w:val="0"/>
   </w:num>
-  <w:num w:numId="28" w16cid:durableId="1138378703">
+  <w:num w:numId="28" w16cid:durableId="1911423138">
     <w:abstractNumId w:val="1"/>
     <w:lvlOverride w:ilvl="0">
       <w:startOverride w:val="1"/>
@@ -34511,7 +37178,7 @@
       <w:startOverride w:val="1"/>
     </w:lvlOverride>
   </w:num>
-  <w:num w:numId="29" w16cid:durableId="1148211249">
+  <w:num w:numId="29" w16cid:durableId="625811979">
     <w:abstractNumId w:val="2"/>
     <w:lvlOverride w:ilvl="0">
       <w:startOverride w:val="1"/>

</xml_diff>